<commit_message>
Final documentation: memo, README, index; override aligned to adopted run
- Memo rebuilt with complete results: 95-WY record composition, all 37
  regression fills tabulated with sources and gap reasons, full-era
  season override decision, assumptions, remaining open items
- SEASON_OVERRIDE_WYS = list(range(1974, 2026)) matching the adopted
  final run (WY2026 excluded until year close)
- README and COWLITZ_INDEX updated to RECORD COMPLETE status
</commit_message>
<xml_diff>
--- a/CAS_Unreg_FF/docs/MEMO_CAS_Unreg_FF.docx
+++ b/CAS_Unreg_FF/docs/MEMO_CAS_Unreg_FF.docx
@@ -98,7 +98,7 @@
           <w:sz w:val="22"/>
           <w:szCs w:val="22"/>
         </w:rPr>
-        <w:t xml:space="preserve">Methodology and results — record assembled and written to CAS_Unreg_SSP.dss for HEC-SSP</w:t>
+        <w:t xml:space="preserve">Final — record assembled (WY1927–2026) and written to CAS_Unreg_SSP.dss for HEC-SSP</w:t>
       </w:r>
     </w:p>
     <w:p>
@@ -127,7 +127,7 @@
           <w:sz w:val="22"/>
           <w:szCs w:val="22"/>
         </w:rPr>
-        <w:t xml:space="preserve">This memo documents the methodology and results for the unregulated annual-maximum flow record at Castle Rock used for flow frequency analysis. In place of the earlier approach — cleaning reservoir inflow records and routing them through HEC-ResSim — the regulated-era record is built from a Mossyrock (MOS) storage holdout derived from a hand-cleaned hourly elevation record, supplemented by a storage-change regression for years without a usable holdout, a daily mass balance for the 1/3/5-day durations, and the observed USGS record for the pre-regulation period. The assembled record (WY1927–2026) is written to output/CAS_Unreg_SSP.dss with a source tag on every value (wy_record_ssp.csv).</w:t>
+        <w:t xml:space="preserve">This memo documents the methodology and results for the unregulated annual-maximum flow record at Castle Rock used for flow frequency analysis. In place of the earlier approach — cleaning reservoir inflow records and routing them through HEC-ResSim — the regulated-era record is built from a Mossyrock (MOS) storage holdout derived from a hand-cleaned hourly elevation record, a storage-change regression for years without a usable holdout, and a daily mass balance for the 1/3/5-day durations, with the observed USGS record supplying the pre-regulation period. The assembled record covers WY1927–2026 (95 water years; only WY1969–1973 are absent) and is written to output/CAS_Unreg_SSP.dss with a source tag on every value (wy_record_ssp.csv).</w:t>
       </w:r>
     </w:p>
     <w:p>
@@ -306,7 +306,7 @@
                 <w:sz w:val="19"/>
                 <w:szCs w:val="19"/>
               </w:rPr>
-              <w:t xml:space="preserve">Regulated flows. The regulated peak is the 1-hr max of the hourly record so regulated and unregulated peaks are computed identically. Daily record is winter-only for part of the 1990s (see Sec. 6).</w:t>
+              <w:t xml:space="preserve">Regulated flows. The regulated peak is the 1-hr max of the hourly record so regulated and unregulated peaks are computed identically. The daily record is winter-only / season-incomplete through much of the regulated era (see Sec. 6).</w:t>
             </w:r>
           </w:p>
         </w:tc>
@@ -366,7 +366,7 @@
                 <w:sz w:val="19"/>
                 <w:szCs w:val="19"/>
               </w:rPr>
-              <w:t xml:space="preserve">USGS observed instantaneous annual peaks; the peak source for pre-regulation WYs.</w:t>
+              <w:t xml:space="preserve">USGS observed instantaneous annual peaks. Peak source for pre-regulation WYs, and the regulated-peak source for regression-filled WYs that predate the hourly record.</w:t>
             </w:r>
           </w:p>
         </w:tc>
@@ -390,7 +390,7 @@
           <w:sz w:val="22"/>
           <w:szCs w:val="22"/>
         </w:rPr>
-        <w:t xml:space="preserve">The hourly MOS elevation was copied and hand-edited iteratively in HEC-DSSVue (edit → compute holdout → scrutinize → edit) with no algorithmic despiking or smoothing. Processing: convert cleaned elevation to storage with the official 2014 rating (1-ft steps, 622–780 ft, edge-slope extrapolation for surcharge); difference to a raw hourly holdout (cfs); 3-hour centered rolling average; October–March season; blank any day with fewer than 4 valid raw storage-telemetry values (manual date-range overrides where data quality is known to differ from the count). Route (Mayfield + holdout) and (Mayfield alone) to Castle Rock through three chained SSARR reaches (Table 3 calibration, lower Cowlitz model; Toutle reach excluded; only stretches with ≥ 10 continuous valid days routed). The routed difference added to observed Castle Rock flow is the hourly unregulated estimate. Much of the post-1974 hourly elevation record is not usable at hourly resolution; the telemetry screen and overrides confine the holdout to the periods that are.</w:t>
+        <w:t xml:space="preserve">The hourly MOS elevation was copied and hand-edited iteratively in HEC-DSSVue (edit → compute holdout → scrutinize → edit) with no algorithmic despiking or smoothing. Processing: convert cleaned elevation to storage with the official 2014 rating (1-ft steps, 622–780 ft, edge-slope extrapolation for surcharge); difference to a raw hourly holdout (cfs); 3-hour centered rolling average; October–March season; blank any day with fewer than 4 valid raw storage-telemetry values (manual date-range overrides where quality is known to differ from the count). Route (Mayfield + holdout) and (Mayfield alone) to Castle Rock through three chained SSARR reaches (Table 3 calibration, lower Cowlitz model; Toutle reach excluded; only stretches with ≥ 10 continuous valid days routed). The routed difference added to observed Castle Rock flow is the hourly unregulated estimate. Much of the post-1974 hourly elevation record is not usable at hourly resolution; the telemetry screen and overrides confine the holdout to the periods that are. Sixteen water years carry holdout-based peaks (WY1992 and portions of WY2008–2026).</w:t>
       </w:r>
     </w:p>
     <w:p>
@@ -411,7 +411,7 @@
           <w:sz w:val="22"/>
           <w:szCs w:val="22"/>
         </w:rPr>
-        <w:t xml:space="preserve">From the hourly series, the 1-hour maximum and the maximum 24-hour mean are extracted per water year for both the unregulated estimate and the regulated record, with timestamps. The regulated peak is deliberately the 1-hr max of the USGS hourly record, not the USGS instantaneous peak record, so both peaks are computed identically for the regression. Every October–March missing window ≥ 3 hours in either series is cataloged with its distance to that year's computed peak (diagnostics/wy_missing_windows.csv; 134 windows), and per-year gap-summary columns support screening. Nothing is omitted automatically; suspect windows or whole years are excluded only by explicit configuration. Sixteen water years carry holdout-based unregulated peaks (WY1992 and WY2008–2026, excluding low-coverage years).</w:t>
+        <w:t xml:space="preserve">From the hourly series, the 1-hour maximum and the maximum 24-hour mean are extracted per water year for both the unregulated estimate and the regulated record, with timestamps and the timing offset between the two peaks. Every October–March missing window ≥ 3 hours in either series is cataloged with its distance to that year's computed peak (diagnostics/wy_missing_windows.csv), and per-year gap-summary columns support screening; nothing is omitted automatically. Hourly unregulated peaks enter the record only where October–March coverage is at least 90%; below that, the year is treated as a gap and filled by the regression (Sec. 5).</w:t>
       </w:r>
     </w:p>
     <w:p>
@@ -432,7 +432,7 @@
           <w:sz w:val="22"/>
           <w:szCs w:val="22"/>
         </w:rPr>
-        <w:t xml:space="preserve">For water years with a good regulated peak but no usable hourly holdout, the regulated peak is corrected to unregulated by regressing the water-year peak difference (regulated minus unregulated, 1-hr peaks) on the maximum daily MOS storage increase near the event, computed from the daily elevation record over candidate 1–4-day windows within ±7 days of the regulated peak (each expressed as mean cfs over its window). Pairs whose regulated and unregulated peaks landed more than 72 hours apart would be excluded as likely different storms; in the adopted fit set (n = 17, WY1992–2026) offsets ranged −69 to +6 hours (median −3), and no pair was excluded.</w:t>
+        <w:t xml:space="preserve">For water years without a usable holdout peak, the regulated peak is corrected to unregulated by regressing the water-year peak difference (regulated minus unregulated, 1-hr peaks) on the maximum daily MOS storage increase near the event, computed from the daily elevation record over candidate 1–4-day windows within ±7 days of the regulated peak. Pairs with peaks more than 72 hours apart would be excluded as different storms; in the fit set (n = 17, WY1992–2026) offsets ranged −69 to +6 hours (median −3) and no pair was excluded.</w:t>
       </w:r>
     </w:p>
     <w:tbl>
@@ -851,12 +851,12 @@
           <w:sz w:val="22"/>
           <w:szCs w:val="22"/>
         </w:rPr>
-        <w:t xml:space="preserve">The 2-day window performed best and is adopted: (REG − UNREG) = −0.869 · dS_2day − 3,836 cfs (R² = 0.871, SE ≈ 5,530 cfs, n = 17). The estimated unregulated peak is the regulated peak minus the predicted difference. Nine gap years were filled (regulated peaks from the 1-hr max of the hourly record in all nine):</w:t>
+        <w:t xml:space="preserve">The adopted relation is (REG − UNREG) = −0.869 · dS_2day − 3,836 cfs (R² = 0.871, SE ≈ 5,530 cfs, n = 17); the estimated unregulated peak is the regulated peak minus the predicted difference. Thirty-seven water years were filled. The regulated peak comes from the USGS peak flow record for WY1974–1991 (the hourly record does not cover them; the USGS peak date centers the storage-change window) and from the 1-hr max of the hourly record otherwise (years with no computable unregulated peak, or with unregulated coverage below 90%).</w:t>
       </w:r>
     </w:p>
     <w:tbl>
       <w:tblPr>
-        <w:tblW w:type="dxa" w:w="8000"/>
+        <w:tblW w:type="dxa" w:w="9500"/>
         <w:tblBorders>
           <w:top w:val="single" w:color="auto" w:sz="4"/>
           <w:left w:val="single" w:color="auto" w:sz="4"/>
@@ -867,15 +867,16 @@
         </w:tblBorders>
       </w:tblPr>
       <w:tblGrid>
-        <w:gridCol w:w="1100"/>
+        <w:gridCol w:w="1000"/>
+        <w:gridCol w:w="1900"/>
+        <w:gridCol w:w="2300"/>
         <w:gridCol w:w="2200"/>
-        <w:gridCol w:w="2200"/>
-        <w:gridCol w:w="2500"/>
+        <w:gridCol w:w="2100"/>
       </w:tblGrid>
       <w:tr>
         <w:tc>
           <w:tcPr>
-            <w:tcW w:type="dxa" w:w="1100"/>
+            <w:tcW w:type="dxa" w:w="1000"/>
             <w:shd w:fill="E8E8E8" w:val="clear"/>
           </w:tcPr>
           <w:p>
@@ -883,10 +884,44 @@
               <w:rPr>
                 <w:b/>
                 <w:bCs/>
-                <w:sz w:val="19"/>
-                <w:szCs w:val="19"/>
+                <w:sz w:val="17"/>
+                <w:szCs w:val="17"/>
               </w:rPr>
               <w:t xml:space="preserve">WY</w:t>
+            </w:r>
+          </w:p>
+        </w:tc>
+        <w:tc>
+          <w:tcPr>
+            <w:tcW w:type="dxa" w:w="1900"/>
+            <w:shd w:fill="E8E8E8" w:val="clear"/>
+          </w:tcPr>
+          <w:p>
+            <w:r>
+              <w:rPr>
+                <w:b/>
+                <w:bCs/>
+                <w:sz w:val="17"/>
+                <w:szCs w:val="17"/>
+              </w:rPr>
+              <w:t xml:space="preserve">Reg peak (cfs)</w:t>
+            </w:r>
+          </w:p>
+        </w:tc>
+        <w:tc>
+          <w:tcPr>
+            <w:tcW w:type="dxa" w:w="2300"/>
+            <w:shd w:fill="E8E8E8" w:val="clear"/>
+          </w:tcPr>
+          <w:p>
+            <w:r>
+              <w:rPr>
+                <w:b/>
+                <w:bCs/>
+                <w:sz w:val="17"/>
+                <w:szCs w:val="17"/>
+              </w:rPr>
+              <w:t xml:space="preserve">Reg peak source</w:t>
             </w:r>
           </w:p>
         </w:tc>
@@ -900,16 +935,16 @@
               <w:rPr>
                 <w:b/>
                 <w:bCs/>
-                <w:sz w:val="19"/>
-                <w:szCs w:val="19"/>
-              </w:rPr>
-              <w:t xml:space="preserve">Reg peak (cfs)</w:t>
-            </w:r>
-          </w:p>
-        </w:tc>
-        <w:tc>
-          <w:tcPr>
-            <w:tcW w:type="dxa" w:w="2200"/>
+                <w:sz w:val="17"/>
+                <w:szCs w:val="17"/>
+              </w:rPr>
+              <w:t xml:space="preserve">Gap reason</w:t>
+            </w:r>
+          </w:p>
+        </w:tc>
+        <w:tc>
+          <w:tcPr>
+            <w:tcW w:type="dxa" w:w="2100"/>
             <w:shd w:fill="E8E8E8" w:val="clear"/>
           </w:tcPr>
           <w:p>
@@ -917,25 +952,8 @@
               <w:rPr>
                 <w:b/>
                 <w:bCs/>
-                <w:sz w:val="19"/>
-                <w:szCs w:val="19"/>
-              </w:rPr>
-              <w:t xml:space="preserve">dS_2day (cfs)</w:t>
-            </w:r>
-          </w:p>
-        </w:tc>
-        <w:tc>
-          <w:tcPr>
-            <w:tcW w:type="dxa" w:w="2500"/>
-            <w:shd w:fill="E8E8E8" w:val="clear"/>
-          </w:tcPr>
-          <w:p>
-            <w:r>
-              <w:rPr>
-                <w:b/>
-                <w:bCs/>
-                <w:sz w:val="19"/>
-                <w:szCs w:val="19"/>
+                <w:sz w:val="17"/>
+                <w:szCs w:val="17"/>
               </w:rPr>
               <w:t xml:space="preserve">Unreg peak est. (cfs)</w:t>
             </w:r>
@@ -945,13 +963,1309 @@
       <w:tr>
         <w:tc>
           <w:tcPr>
-            <w:tcW w:type="dxa" w:w="1100"/>
-          </w:tcPr>
-          <w:p>
-            <w:r>
-              <w:rPr>
-                <w:sz w:val="19"/>
-                <w:szCs w:val="19"/>
+            <w:tcW w:type="dxa" w:w="1000"/>
+          </w:tcPr>
+          <w:p>
+            <w:r>
+              <w:rPr>
+                <w:sz w:val="17"/>
+                <w:szCs w:val="17"/>
+              </w:rPr>
+              <w:t xml:space="preserve">1974</w:t>
+            </w:r>
+          </w:p>
+        </w:tc>
+        <w:tc>
+          <w:tcPr>
+            <w:tcW w:type="dxa" w:w="1900"/>
+          </w:tcPr>
+          <w:p>
+            <w:r>
+              <w:rPr>
+                <w:sz w:val="17"/>
+                <w:szCs w:val="17"/>
+              </w:rPr>
+              <w:t xml:space="preserve">68,600</w:t>
+            </w:r>
+          </w:p>
+        </w:tc>
+        <w:tc>
+          <w:tcPr>
+            <w:tcW w:type="dxa" w:w="2300"/>
+          </w:tcPr>
+          <w:p>
+            <w:r>
+              <w:rPr>
+                <w:sz w:val="17"/>
+                <w:szCs w:val="17"/>
+              </w:rPr>
+              <w:t xml:space="preserve">USGS peak record</w:t>
+            </w:r>
+          </w:p>
+        </w:tc>
+        <w:tc>
+          <w:tcPr>
+            <w:tcW w:type="dxa" w:w="2200"/>
+          </w:tcPr>
+          <w:p>
+            <w:r>
+              <w:rPr>
+                <w:sz w:val="17"/>
+                <w:szCs w:val="17"/>
+              </w:rPr>
+              <w:t xml:space="preserve">no hourly record</w:t>
+            </w:r>
+          </w:p>
+        </w:tc>
+        <w:tc>
+          <w:tcPr>
+            <w:tcW w:type="dxa" w:w="2100"/>
+          </w:tcPr>
+          <w:p>
+            <w:r>
+              <w:rPr>
+                <w:sz w:val="17"/>
+                <w:szCs w:val="17"/>
+              </w:rPr>
+              <w:t xml:space="preserve">111,231</w:t>
+            </w:r>
+          </w:p>
+        </w:tc>
+      </w:tr>
+      <w:tr>
+        <w:tc>
+          <w:tcPr>
+            <w:tcW w:type="dxa" w:w="1000"/>
+          </w:tcPr>
+          <w:p>
+            <w:r>
+              <w:rPr>
+                <w:sz w:val="17"/>
+                <w:szCs w:val="17"/>
+              </w:rPr>
+              <w:t xml:space="preserve">1975</w:t>
+            </w:r>
+          </w:p>
+        </w:tc>
+        <w:tc>
+          <w:tcPr>
+            <w:tcW w:type="dxa" w:w="1900"/>
+          </w:tcPr>
+          <w:p>
+            <w:r>
+              <w:rPr>
+                <w:sz w:val="17"/>
+                <w:szCs w:val="17"/>
+              </w:rPr>
+              <w:t xml:space="preserve">58,900</w:t>
+            </w:r>
+          </w:p>
+        </w:tc>
+        <w:tc>
+          <w:tcPr>
+            <w:tcW w:type="dxa" w:w="2300"/>
+          </w:tcPr>
+          <w:p>
+            <w:r>
+              <w:rPr>
+                <w:sz w:val="17"/>
+                <w:szCs w:val="17"/>
+              </w:rPr>
+              <w:t xml:space="preserve">USGS peak record</w:t>
+            </w:r>
+          </w:p>
+        </w:tc>
+        <w:tc>
+          <w:tcPr>
+            <w:tcW w:type="dxa" w:w="2200"/>
+          </w:tcPr>
+          <w:p>
+            <w:r>
+              <w:rPr>
+                <w:sz w:val="17"/>
+                <w:szCs w:val="17"/>
+              </w:rPr>
+              <w:t xml:space="preserve">no hourly record</w:t>
+            </w:r>
+          </w:p>
+        </w:tc>
+        <w:tc>
+          <w:tcPr>
+            <w:tcW w:type="dxa" w:w="2100"/>
+          </w:tcPr>
+          <w:p>
+            <w:r>
+              <w:rPr>
+                <w:sz w:val="17"/>
+                <w:szCs w:val="17"/>
+              </w:rPr>
+              <w:t xml:space="preserve">76,896</w:t>
+            </w:r>
+          </w:p>
+        </w:tc>
+      </w:tr>
+      <w:tr>
+        <w:tc>
+          <w:tcPr>
+            <w:tcW w:type="dxa" w:w="1000"/>
+          </w:tcPr>
+          <w:p>
+            <w:r>
+              <w:rPr>
+                <w:sz w:val="17"/>
+                <w:szCs w:val="17"/>
+              </w:rPr>
+              <w:t xml:space="preserve">1976</w:t>
+            </w:r>
+          </w:p>
+        </w:tc>
+        <w:tc>
+          <w:tcPr>
+            <w:tcW w:type="dxa" w:w="1900"/>
+          </w:tcPr>
+          <w:p>
+            <w:r>
+              <w:rPr>
+                <w:sz w:val="17"/>
+                <w:szCs w:val="17"/>
+              </w:rPr>
+              <w:t xml:space="preserve">86,700</w:t>
+            </w:r>
+          </w:p>
+        </w:tc>
+        <w:tc>
+          <w:tcPr>
+            <w:tcW w:type="dxa" w:w="2300"/>
+          </w:tcPr>
+          <w:p>
+            <w:r>
+              <w:rPr>
+                <w:sz w:val="17"/>
+                <w:szCs w:val="17"/>
+              </w:rPr>
+              <w:t xml:space="preserve">USGS peak record</w:t>
+            </w:r>
+          </w:p>
+        </w:tc>
+        <w:tc>
+          <w:tcPr>
+            <w:tcW w:type="dxa" w:w="2200"/>
+          </w:tcPr>
+          <w:p>
+            <w:r>
+              <w:rPr>
+                <w:sz w:val="17"/>
+                <w:szCs w:val="17"/>
+              </w:rPr>
+              <w:t xml:space="preserve">no hourly record</w:t>
+            </w:r>
+          </w:p>
+        </w:tc>
+        <w:tc>
+          <w:tcPr>
+            <w:tcW w:type="dxa" w:w="2100"/>
+          </w:tcPr>
+          <w:p>
+            <w:r>
+              <w:rPr>
+                <w:sz w:val="17"/>
+                <w:szCs w:val="17"/>
+              </w:rPr>
+              <w:t xml:space="preserve">124,946</w:t>
+            </w:r>
+          </w:p>
+        </w:tc>
+      </w:tr>
+      <w:tr>
+        <w:tc>
+          <w:tcPr>
+            <w:tcW w:type="dxa" w:w="1000"/>
+          </w:tcPr>
+          <w:p>
+            <w:r>
+              <w:rPr>
+                <w:sz w:val="17"/>
+                <w:szCs w:val="17"/>
+              </w:rPr>
+              <w:t xml:space="preserve">1977</w:t>
+            </w:r>
+          </w:p>
+        </w:tc>
+        <w:tc>
+          <w:tcPr>
+            <w:tcW w:type="dxa" w:w="1900"/>
+          </w:tcPr>
+          <w:p>
+            <w:r>
+              <w:rPr>
+                <w:sz w:val="17"/>
+                <w:szCs w:val="17"/>
+              </w:rPr>
+              <w:t xml:space="preserve">15,000</w:t>
+            </w:r>
+          </w:p>
+        </w:tc>
+        <w:tc>
+          <w:tcPr>
+            <w:tcW w:type="dxa" w:w="2300"/>
+          </w:tcPr>
+          <w:p>
+            <w:r>
+              <w:rPr>
+                <w:sz w:val="17"/>
+                <w:szCs w:val="17"/>
+              </w:rPr>
+              <w:t xml:space="preserve">USGS peak record</w:t>
+            </w:r>
+          </w:p>
+        </w:tc>
+        <w:tc>
+          <w:tcPr>
+            <w:tcW w:type="dxa" w:w="2200"/>
+          </w:tcPr>
+          <w:p>
+            <w:r>
+              <w:rPr>
+                <w:sz w:val="17"/>
+                <w:szCs w:val="17"/>
+              </w:rPr>
+              <w:t xml:space="preserve">no hourly record</w:t>
+            </w:r>
+          </w:p>
+        </w:tc>
+        <w:tc>
+          <w:tcPr>
+            <w:tcW w:type="dxa" w:w="2100"/>
+          </w:tcPr>
+          <w:p>
+            <w:r>
+              <w:rPr>
+                <w:sz w:val="17"/>
+                <w:szCs w:val="17"/>
+              </w:rPr>
+              <w:t xml:space="preserve">19,899</w:t>
+            </w:r>
+          </w:p>
+        </w:tc>
+      </w:tr>
+      <w:tr>
+        <w:tc>
+          <w:tcPr>
+            <w:tcW w:type="dxa" w:w="1000"/>
+          </w:tcPr>
+          <w:p>
+            <w:r>
+              <w:rPr>
+                <w:sz w:val="17"/>
+                <w:szCs w:val="17"/>
+              </w:rPr>
+              <w:t xml:space="preserve">1978</w:t>
+            </w:r>
+          </w:p>
+        </w:tc>
+        <w:tc>
+          <w:tcPr>
+            <w:tcW w:type="dxa" w:w="1900"/>
+          </w:tcPr>
+          <w:p>
+            <w:r>
+              <w:rPr>
+                <w:sz w:val="17"/>
+                <w:szCs w:val="17"/>
+              </w:rPr>
+              <w:t xml:space="preserve">86,400</w:t>
+            </w:r>
+          </w:p>
+        </w:tc>
+        <w:tc>
+          <w:tcPr>
+            <w:tcW w:type="dxa" w:w="2300"/>
+          </w:tcPr>
+          <w:p>
+            <w:r>
+              <w:rPr>
+                <w:sz w:val="17"/>
+                <w:szCs w:val="17"/>
+              </w:rPr>
+              <w:t xml:space="preserve">USGS peak record</w:t>
+            </w:r>
+          </w:p>
+        </w:tc>
+        <w:tc>
+          <w:tcPr>
+            <w:tcW w:type="dxa" w:w="2200"/>
+          </w:tcPr>
+          <w:p>
+            <w:r>
+              <w:rPr>
+                <w:sz w:val="17"/>
+                <w:szCs w:val="17"/>
+              </w:rPr>
+              <w:t xml:space="preserve">no hourly record</w:t>
+            </w:r>
+          </w:p>
+        </w:tc>
+        <w:tc>
+          <w:tcPr>
+            <w:tcW w:type="dxa" w:w="2100"/>
+          </w:tcPr>
+          <w:p>
+            <w:r>
+              <w:rPr>
+                <w:sz w:val="17"/>
+                <w:szCs w:val="17"/>
+              </w:rPr>
+              <w:t xml:space="preserve">131,885</w:t>
+            </w:r>
+          </w:p>
+        </w:tc>
+      </w:tr>
+      <w:tr>
+        <w:tc>
+          <w:tcPr>
+            <w:tcW w:type="dxa" w:w="1000"/>
+          </w:tcPr>
+          <w:p>
+            <w:r>
+              <w:rPr>
+                <w:sz w:val="17"/>
+                <w:szCs w:val="17"/>
+              </w:rPr>
+              <w:t xml:space="preserve">1979</w:t>
+            </w:r>
+          </w:p>
+        </w:tc>
+        <w:tc>
+          <w:tcPr>
+            <w:tcW w:type="dxa" w:w="1900"/>
+          </w:tcPr>
+          <w:p>
+            <w:r>
+              <w:rPr>
+                <w:sz w:val="17"/>
+                <w:szCs w:val="17"/>
+              </w:rPr>
+              <w:t xml:space="preserve">39,400</w:t>
+            </w:r>
+          </w:p>
+        </w:tc>
+        <w:tc>
+          <w:tcPr>
+            <w:tcW w:type="dxa" w:w="2300"/>
+          </w:tcPr>
+          <w:p>
+            <w:r>
+              <w:rPr>
+                <w:sz w:val="17"/>
+                <w:szCs w:val="17"/>
+              </w:rPr>
+              <w:t xml:space="preserve">USGS peak record</w:t>
+            </w:r>
+          </w:p>
+        </w:tc>
+        <w:tc>
+          <w:tcPr>
+            <w:tcW w:type="dxa" w:w="2200"/>
+          </w:tcPr>
+          <w:p>
+            <w:r>
+              <w:rPr>
+                <w:sz w:val="17"/>
+                <w:szCs w:val="17"/>
+              </w:rPr>
+              <w:t xml:space="preserve">no hourly record</w:t>
+            </w:r>
+          </w:p>
+        </w:tc>
+        <w:tc>
+          <w:tcPr>
+            <w:tcW w:type="dxa" w:w="2100"/>
+          </w:tcPr>
+          <w:p>
+            <w:r>
+              <w:rPr>
+                <w:sz w:val="17"/>
+                <w:szCs w:val="17"/>
+              </w:rPr>
+              <w:t xml:space="preserve">51,587</w:t>
+            </w:r>
+          </w:p>
+        </w:tc>
+      </w:tr>
+      <w:tr>
+        <w:tc>
+          <w:tcPr>
+            <w:tcW w:type="dxa" w:w="1000"/>
+          </w:tcPr>
+          <w:p>
+            <w:r>
+              <w:rPr>
+                <w:sz w:val="17"/>
+                <w:szCs w:val="17"/>
+              </w:rPr>
+              <w:t xml:space="preserve">1980</w:t>
+            </w:r>
+          </w:p>
+        </w:tc>
+        <w:tc>
+          <w:tcPr>
+            <w:tcW w:type="dxa" w:w="1900"/>
+          </w:tcPr>
+          <w:p>
+            <w:r>
+              <w:rPr>
+                <w:sz w:val="17"/>
+                <w:szCs w:val="17"/>
+              </w:rPr>
+              <w:t xml:space="preserve">97,000</w:t>
+            </w:r>
+          </w:p>
+        </w:tc>
+        <w:tc>
+          <w:tcPr>
+            <w:tcW w:type="dxa" w:w="2300"/>
+          </w:tcPr>
+          <w:p>
+            <w:r>
+              <w:rPr>
+                <w:sz w:val="17"/>
+                <w:szCs w:val="17"/>
+              </w:rPr>
+              <w:t xml:space="preserve">USGS peak record</w:t>
+            </w:r>
+          </w:p>
+        </w:tc>
+        <w:tc>
+          <w:tcPr>
+            <w:tcW w:type="dxa" w:w="2200"/>
+          </w:tcPr>
+          <w:p>
+            <w:r>
+              <w:rPr>
+                <w:sz w:val="17"/>
+                <w:szCs w:val="17"/>
+              </w:rPr>
+              <w:t xml:space="preserve">no hourly record</w:t>
+            </w:r>
+          </w:p>
+        </w:tc>
+        <w:tc>
+          <w:tcPr>
+            <w:tcW w:type="dxa" w:w="2100"/>
+          </w:tcPr>
+          <w:p>
+            <w:r>
+              <w:rPr>
+                <w:sz w:val="17"/>
+                <w:szCs w:val="17"/>
+              </w:rPr>
+              <w:t xml:space="preserve">101,895</w:t>
+            </w:r>
+          </w:p>
+        </w:tc>
+      </w:tr>
+      <w:tr>
+        <w:tc>
+          <w:tcPr>
+            <w:tcW w:type="dxa" w:w="1000"/>
+          </w:tcPr>
+          <w:p>
+            <w:r>
+              <w:rPr>
+                <w:sz w:val="17"/>
+                <w:szCs w:val="17"/>
+              </w:rPr>
+              <w:t xml:space="preserve">1981</w:t>
+            </w:r>
+          </w:p>
+        </w:tc>
+        <w:tc>
+          <w:tcPr>
+            <w:tcW w:type="dxa" w:w="1900"/>
+          </w:tcPr>
+          <w:p>
+            <w:r>
+              <w:rPr>
+                <w:sz w:val="17"/>
+                <w:szCs w:val="17"/>
+              </w:rPr>
+              <w:t xml:space="preserve">46,900</w:t>
+            </w:r>
+          </w:p>
+        </w:tc>
+        <w:tc>
+          <w:tcPr>
+            <w:tcW w:type="dxa" w:w="2300"/>
+          </w:tcPr>
+          <w:p>
+            <w:r>
+              <w:rPr>
+                <w:sz w:val="17"/>
+                <w:szCs w:val="17"/>
+              </w:rPr>
+              <w:t xml:space="preserve">USGS peak record</w:t>
+            </w:r>
+          </w:p>
+        </w:tc>
+        <w:tc>
+          <w:tcPr>
+            <w:tcW w:type="dxa" w:w="2200"/>
+          </w:tcPr>
+          <w:p>
+            <w:r>
+              <w:rPr>
+                <w:sz w:val="17"/>
+                <w:szCs w:val="17"/>
+              </w:rPr>
+              <w:t xml:space="preserve">no hourly record</w:t>
+            </w:r>
+          </w:p>
+        </w:tc>
+        <w:tc>
+          <w:tcPr>
+            <w:tcW w:type="dxa" w:w="2100"/>
+          </w:tcPr>
+          <w:p>
+            <w:r>
+              <w:rPr>
+                <w:sz w:val="17"/>
+                <w:szCs w:val="17"/>
+              </w:rPr>
+              <w:t xml:space="preserve">88,345</w:t>
+            </w:r>
+          </w:p>
+        </w:tc>
+      </w:tr>
+      <w:tr>
+        <w:tc>
+          <w:tcPr>
+            <w:tcW w:type="dxa" w:w="1000"/>
+          </w:tcPr>
+          <w:p>
+            <w:r>
+              <w:rPr>
+                <w:sz w:val="17"/>
+                <w:szCs w:val="17"/>
+              </w:rPr>
+              <w:t xml:space="preserve">1982</w:t>
+            </w:r>
+          </w:p>
+        </w:tc>
+        <w:tc>
+          <w:tcPr>
+            <w:tcW w:type="dxa" w:w="1900"/>
+          </w:tcPr>
+          <w:p>
+            <w:r>
+              <w:rPr>
+                <w:sz w:val="17"/>
+                <w:szCs w:val="17"/>
+              </w:rPr>
+              <w:t xml:space="preserve">65,500</w:t>
+            </w:r>
+          </w:p>
+        </w:tc>
+        <w:tc>
+          <w:tcPr>
+            <w:tcW w:type="dxa" w:w="2300"/>
+          </w:tcPr>
+          <w:p>
+            <w:r>
+              <w:rPr>
+                <w:sz w:val="17"/>
+                <w:szCs w:val="17"/>
+              </w:rPr>
+              <w:t xml:space="preserve">USGS peak record</w:t>
+            </w:r>
+          </w:p>
+        </w:tc>
+        <w:tc>
+          <w:tcPr>
+            <w:tcW w:type="dxa" w:w="2200"/>
+          </w:tcPr>
+          <w:p>
+            <w:r>
+              <w:rPr>
+                <w:sz w:val="17"/>
+                <w:szCs w:val="17"/>
+              </w:rPr>
+              <w:t xml:space="preserve">no hourly record</w:t>
+            </w:r>
+          </w:p>
+        </w:tc>
+        <w:tc>
+          <w:tcPr>
+            <w:tcW w:type="dxa" w:w="2100"/>
+          </w:tcPr>
+          <w:p>
+            <w:r>
+              <w:rPr>
+                <w:sz w:val="17"/>
+                <w:szCs w:val="17"/>
+              </w:rPr>
+              <w:t xml:space="preserve">84,883</w:t>
+            </w:r>
+          </w:p>
+        </w:tc>
+      </w:tr>
+      <w:tr>
+        <w:tc>
+          <w:tcPr>
+            <w:tcW w:type="dxa" w:w="1000"/>
+          </w:tcPr>
+          <w:p>
+            <w:r>
+              <w:rPr>
+                <w:sz w:val="17"/>
+                <w:szCs w:val="17"/>
+              </w:rPr>
+              <w:t xml:space="preserve">1983</w:t>
+            </w:r>
+          </w:p>
+        </w:tc>
+        <w:tc>
+          <w:tcPr>
+            <w:tcW w:type="dxa" w:w="1900"/>
+          </w:tcPr>
+          <w:p>
+            <w:r>
+              <w:rPr>
+                <w:sz w:val="17"/>
+                <w:szCs w:val="17"/>
+              </w:rPr>
+              <w:t xml:space="preserve">67,300</w:t>
+            </w:r>
+          </w:p>
+        </w:tc>
+        <w:tc>
+          <w:tcPr>
+            <w:tcW w:type="dxa" w:w="2300"/>
+          </w:tcPr>
+          <w:p>
+            <w:r>
+              <w:rPr>
+                <w:sz w:val="17"/>
+                <w:szCs w:val="17"/>
+              </w:rPr>
+              <w:t xml:space="preserve">USGS peak record</w:t>
+            </w:r>
+          </w:p>
+        </w:tc>
+        <w:tc>
+          <w:tcPr>
+            <w:tcW w:type="dxa" w:w="2200"/>
+          </w:tcPr>
+          <w:p>
+            <w:r>
+              <w:rPr>
+                <w:sz w:val="17"/>
+                <w:szCs w:val="17"/>
+              </w:rPr>
+              <w:t xml:space="preserve">no hourly record</w:t>
+            </w:r>
+          </w:p>
+        </w:tc>
+        <w:tc>
+          <w:tcPr>
+            <w:tcW w:type="dxa" w:w="2100"/>
+          </w:tcPr>
+          <w:p>
+            <w:r>
+              <w:rPr>
+                <w:sz w:val="17"/>
+                <w:szCs w:val="17"/>
+              </w:rPr>
+              <w:t xml:space="preserve">82,466</w:t>
+            </w:r>
+          </w:p>
+        </w:tc>
+      </w:tr>
+      <w:tr>
+        <w:tc>
+          <w:tcPr>
+            <w:tcW w:type="dxa" w:w="1000"/>
+          </w:tcPr>
+          <w:p>
+            <w:r>
+              <w:rPr>
+                <w:sz w:val="17"/>
+                <w:szCs w:val="17"/>
+              </w:rPr>
+              <w:t xml:space="preserve">1984</w:t>
+            </w:r>
+          </w:p>
+        </w:tc>
+        <w:tc>
+          <w:tcPr>
+            <w:tcW w:type="dxa" w:w="1900"/>
+          </w:tcPr>
+          <w:p>
+            <w:r>
+              <w:rPr>
+                <w:sz w:val="17"/>
+                <w:szCs w:val="17"/>
+              </w:rPr>
+              <w:t xml:space="preserve">49,600</w:t>
+            </w:r>
+          </w:p>
+        </w:tc>
+        <w:tc>
+          <w:tcPr>
+            <w:tcW w:type="dxa" w:w="2300"/>
+          </w:tcPr>
+          <w:p>
+            <w:r>
+              <w:rPr>
+                <w:sz w:val="17"/>
+                <w:szCs w:val="17"/>
+              </w:rPr>
+              <w:t xml:space="preserve">USGS peak record</w:t>
+            </w:r>
+          </w:p>
+        </w:tc>
+        <w:tc>
+          <w:tcPr>
+            <w:tcW w:type="dxa" w:w="2200"/>
+          </w:tcPr>
+          <w:p>
+            <w:r>
+              <w:rPr>
+                <w:sz w:val="17"/>
+                <w:szCs w:val="17"/>
+              </w:rPr>
+              <w:t xml:space="preserve">no hourly record</w:t>
+            </w:r>
+          </w:p>
+        </w:tc>
+        <w:tc>
+          <w:tcPr>
+            <w:tcW w:type="dxa" w:w="2100"/>
+          </w:tcPr>
+          <w:p>
+            <w:r>
+              <w:rPr>
+                <w:sz w:val="17"/>
+                <w:szCs w:val="17"/>
+              </w:rPr>
+              <w:t xml:space="preserve">52,584</w:t>
+            </w:r>
+          </w:p>
+        </w:tc>
+      </w:tr>
+      <w:tr>
+        <w:tc>
+          <w:tcPr>
+            <w:tcW w:type="dxa" w:w="1000"/>
+          </w:tcPr>
+          <w:p>
+            <w:r>
+              <w:rPr>
+                <w:sz w:val="17"/>
+                <w:szCs w:val="17"/>
+              </w:rPr>
+              <w:t xml:space="preserve">1985</w:t>
+            </w:r>
+          </w:p>
+        </w:tc>
+        <w:tc>
+          <w:tcPr>
+            <w:tcW w:type="dxa" w:w="1900"/>
+          </w:tcPr>
+          <w:p>
+            <w:r>
+              <w:rPr>
+                <w:sz w:val="17"/>
+                <w:szCs w:val="17"/>
+              </w:rPr>
+              <w:t xml:space="preserve">23,600</w:t>
+            </w:r>
+          </w:p>
+        </w:tc>
+        <w:tc>
+          <w:tcPr>
+            <w:tcW w:type="dxa" w:w="2300"/>
+          </w:tcPr>
+          <w:p>
+            <w:r>
+              <w:rPr>
+                <w:sz w:val="17"/>
+                <w:szCs w:val="17"/>
+              </w:rPr>
+              <w:t xml:space="preserve">USGS peak record</w:t>
+            </w:r>
+          </w:p>
+        </w:tc>
+        <w:tc>
+          <w:tcPr>
+            <w:tcW w:type="dxa" w:w="2200"/>
+          </w:tcPr>
+          <w:p>
+            <w:r>
+              <w:rPr>
+                <w:sz w:val="17"/>
+                <w:szCs w:val="17"/>
+              </w:rPr>
+              <w:t xml:space="preserve">no hourly record</w:t>
+            </w:r>
+          </w:p>
+        </w:tc>
+        <w:tc>
+          <w:tcPr>
+            <w:tcW w:type="dxa" w:w="2100"/>
+          </w:tcPr>
+          <w:p>
+            <w:r>
+              <w:rPr>
+                <w:sz w:val="17"/>
+                <w:szCs w:val="17"/>
+              </w:rPr>
+              <w:t xml:space="preserve">27,740</w:t>
+            </w:r>
+          </w:p>
+        </w:tc>
+      </w:tr>
+      <w:tr>
+        <w:tc>
+          <w:tcPr>
+            <w:tcW w:type="dxa" w:w="1000"/>
+          </w:tcPr>
+          <w:p>
+            <w:r>
+              <w:rPr>
+                <w:sz w:val="17"/>
+                <w:szCs w:val="17"/>
+              </w:rPr>
+              <w:t xml:space="preserve">1986</w:t>
+            </w:r>
+          </w:p>
+        </w:tc>
+        <w:tc>
+          <w:tcPr>
+            <w:tcW w:type="dxa" w:w="1900"/>
+          </w:tcPr>
+          <w:p>
+            <w:r>
+              <w:rPr>
+                <w:sz w:val="17"/>
+                <w:szCs w:val="17"/>
+              </w:rPr>
+              <w:t xml:space="preserve">62,700</w:t>
+            </w:r>
+          </w:p>
+        </w:tc>
+        <w:tc>
+          <w:tcPr>
+            <w:tcW w:type="dxa" w:w="2300"/>
+          </w:tcPr>
+          <w:p>
+            <w:r>
+              <w:rPr>
+                <w:sz w:val="17"/>
+                <w:szCs w:val="17"/>
+              </w:rPr>
+              <w:t xml:space="preserve">USGS peak record</w:t>
+            </w:r>
+          </w:p>
+        </w:tc>
+        <w:tc>
+          <w:tcPr>
+            <w:tcW w:type="dxa" w:w="2200"/>
+          </w:tcPr>
+          <w:p>
+            <w:r>
+              <w:rPr>
+                <w:sz w:val="17"/>
+                <w:szCs w:val="17"/>
+              </w:rPr>
+              <w:t xml:space="preserve">no hourly record</w:t>
+            </w:r>
+          </w:p>
+        </w:tc>
+        <w:tc>
+          <w:tcPr>
+            <w:tcW w:type="dxa" w:w="2100"/>
+          </w:tcPr>
+          <w:p>
+            <w:r>
+              <w:rPr>
+                <w:sz w:val="17"/>
+                <w:szCs w:val="17"/>
+              </w:rPr>
+              <w:t xml:space="preserve">95,135</w:t>
+            </w:r>
+          </w:p>
+        </w:tc>
+      </w:tr>
+      <w:tr>
+        <w:tc>
+          <w:tcPr>
+            <w:tcW w:type="dxa" w:w="1000"/>
+          </w:tcPr>
+          <w:p>
+            <w:r>
+              <w:rPr>
+                <w:sz w:val="17"/>
+                <w:szCs w:val="17"/>
+              </w:rPr>
+              <w:t xml:space="preserve">1987</w:t>
+            </w:r>
+          </w:p>
+        </w:tc>
+        <w:tc>
+          <w:tcPr>
+            <w:tcW w:type="dxa" w:w="1900"/>
+          </w:tcPr>
+          <w:p>
+            <w:r>
+              <w:rPr>
+                <w:sz w:val="17"/>
+                <w:szCs w:val="17"/>
+              </w:rPr>
+              <w:t xml:space="preserve">77,600</w:t>
+            </w:r>
+          </w:p>
+        </w:tc>
+        <w:tc>
+          <w:tcPr>
+            <w:tcW w:type="dxa" w:w="2300"/>
+          </w:tcPr>
+          <w:p>
+            <w:r>
+              <w:rPr>
+                <w:sz w:val="17"/>
+                <w:szCs w:val="17"/>
+              </w:rPr>
+              <w:t xml:space="preserve">USGS peak record</w:t>
+            </w:r>
+          </w:p>
+        </w:tc>
+        <w:tc>
+          <w:tcPr>
+            <w:tcW w:type="dxa" w:w="2200"/>
+          </w:tcPr>
+          <w:p>
+            <w:r>
+              <w:rPr>
+                <w:sz w:val="17"/>
+                <w:szCs w:val="17"/>
+              </w:rPr>
+              <w:t xml:space="preserve">no hourly record</w:t>
+            </w:r>
+          </w:p>
+        </w:tc>
+        <w:tc>
+          <w:tcPr>
+            <w:tcW w:type="dxa" w:w="2100"/>
+          </w:tcPr>
+          <w:p>
+            <w:r>
+              <w:rPr>
+                <w:sz w:val="17"/>
+                <w:szCs w:val="17"/>
+              </w:rPr>
+              <w:t xml:space="preserve">103,298</w:t>
+            </w:r>
+          </w:p>
+        </w:tc>
+      </w:tr>
+      <w:tr>
+        <w:tc>
+          <w:tcPr>
+            <w:tcW w:type="dxa" w:w="1000"/>
+          </w:tcPr>
+          <w:p>
+            <w:r>
+              <w:rPr>
+                <w:sz w:val="17"/>
+                <w:szCs w:val="17"/>
+              </w:rPr>
+              <w:t xml:space="preserve">1988</w:t>
+            </w:r>
+          </w:p>
+        </w:tc>
+        <w:tc>
+          <w:tcPr>
+            <w:tcW w:type="dxa" w:w="1900"/>
+          </w:tcPr>
+          <w:p>
+            <w:r>
+              <w:rPr>
+                <w:sz w:val="17"/>
+                <w:szCs w:val="17"/>
+              </w:rPr>
+              <w:t xml:space="preserve">42,100</w:t>
+            </w:r>
+          </w:p>
+        </w:tc>
+        <w:tc>
+          <w:tcPr>
+            <w:tcW w:type="dxa" w:w="2300"/>
+          </w:tcPr>
+          <w:p>
+            <w:r>
+              <w:rPr>
+                <w:sz w:val="17"/>
+                <w:szCs w:val="17"/>
+              </w:rPr>
+              <w:t xml:space="preserve">USGS peak record</w:t>
+            </w:r>
+          </w:p>
+        </w:tc>
+        <w:tc>
+          <w:tcPr>
+            <w:tcW w:type="dxa" w:w="2200"/>
+          </w:tcPr>
+          <w:p>
+            <w:r>
+              <w:rPr>
+                <w:sz w:val="17"/>
+                <w:szCs w:val="17"/>
+              </w:rPr>
+              <w:t xml:space="preserve">no hourly record</w:t>
+            </w:r>
+          </w:p>
+        </w:tc>
+        <w:tc>
+          <w:tcPr>
+            <w:tcW w:type="dxa" w:w="2100"/>
+          </w:tcPr>
+          <w:p>
+            <w:r>
+              <w:rPr>
+                <w:sz w:val="17"/>
+                <w:szCs w:val="17"/>
+              </w:rPr>
+              <w:t xml:space="preserve">61,876</w:t>
+            </w:r>
+          </w:p>
+        </w:tc>
+      </w:tr>
+      <w:tr>
+        <w:tc>
+          <w:tcPr>
+            <w:tcW w:type="dxa" w:w="1000"/>
+          </w:tcPr>
+          <w:p>
+            <w:r>
+              <w:rPr>
+                <w:sz w:val="17"/>
+                <w:szCs w:val="17"/>
+              </w:rPr>
+              <w:t xml:space="preserve">1989</w:t>
+            </w:r>
+          </w:p>
+        </w:tc>
+        <w:tc>
+          <w:tcPr>
+            <w:tcW w:type="dxa" w:w="1900"/>
+          </w:tcPr>
+          <w:p>
+            <w:r>
+              <w:rPr>
+                <w:sz w:val="17"/>
+                <w:szCs w:val="17"/>
+              </w:rPr>
+              <w:t xml:space="preserve">23,600</w:t>
+            </w:r>
+          </w:p>
+        </w:tc>
+        <w:tc>
+          <w:tcPr>
+            <w:tcW w:type="dxa" w:w="2300"/>
+          </w:tcPr>
+          <w:p>
+            <w:r>
+              <w:rPr>
+                <w:sz w:val="17"/>
+                <w:szCs w:val="17"/>
+              </w:rPr>
+              <w:t xml:space="preserve">USGS peak record</w:t>
+            </w:r>
+          </w:p>
+        </w:tc>
+        <w:tc>
+          <w:tcPr>
+            <w:tcW w:type="dxa" w:w="2200"/>
+          </w:tcPr>
+          <w:p>
+            <w:r>
+              <w:rPr>
+                <w:sz w:val="17"/>
+                <w:szCs w:val="17"/>
+              </w:rPr>
+              <w:t xml:space="preserve">no hourly record</w:t>
+            </w:r>
+          </w:p>
+        </w:tc>
+        <w:tc>
+          <w:tcPr>
+            <w:tcW w:type="dxa" w:w="2100"/>
+          </w:tcPr>
+          <w:p>
+            <w:r>
+              <w:rPr>
+                <w:sz w:val="17"/>
+                <w:szCs w:val="17"/>
+              </w:rPr>
+              <w:t xml:space="preserve">28,884</w:t>
+            </w:r>
+          </w:p>
+        </w:tc>
+      </w:tr>
+      <w:tr>
+        <w:tc>
+          <w:tcPr>
+            <w:tcW w:type="dxa" w:w="1000"/>
+          </w:tcPr>
+          <w:p>
+            <w:r>
+              <w:rPr>
+                <w:sz w:val="17"/>
+                <w:szCs w:val="17"/>
+              </w:rPr>
+              <w:t xml:space="preserve">1990</w:t>
+            </w:r>
+          </w:p>
+        </w:tc>
+        <w:tc>
+          <w:tcPr>
+            <w:tcW w:type="dxa" w:w="1900"/>
+          </w:tcPr>
+          <w:p>
+            <w:r>
+              <w:rPr>
+                <w:sz w:val="17"/>
+                <w:szCs w:val="17"/>
+              </w:rPr>
+              <w:t xml:space="preserve">89,200</w:t>
+            </w:r>
+          </w:p>
+        </w:tc>
+        <w:tc>
+          <w:tcPr>
+            <w:tcW w:type="dxa" w:w="2300"/>
+          </w:tcPr>
+          <w:p>
+            <w:r>
+              <w:rPr>
+                <w:sz w:val="17"/>
+                <w:szCs w:val="17"/>
+              </w:rPr>
+              <w:t xml:space="preserve">USGS peak record</w:t>
+            </w:r>
+          </w:p>
+        </w:tc>
+        <w:tc>
+          <w:tcPr>
+            <w:tcW w:type="dxa" w:w="2200"/>
+          </w:tcPr>
+          <w:p>
+            <w:r>
+              <w:rPr>
+                <w:sz w:val="17"/>
+                <w:szCs w:val="17"/>
+              </w:rPr>
+              <w:t xml:space="preserve">no hourly record</w:t>
+            </w:r>
+          </w:p>
+        </w:tc>
+        <w:tc>
+          <w:tcPr>
+            <w:tcW w:type="dxa" w:w="2100"/>
+          </w:tcPr>
+          <w:p>
+            <w:r>
+              <w:rPr>
+                <w:sz w:val="17"/>
+                <w:szCs w:val="17"/>
+              </w:rPr>
+              <w:t xml:space="preserve">124,824</w:t>
+            </w:r>
+          </w:p>
+        </w:tc>
+      </w:tr>
+      <w:tr>
+        <w:tc>
+          <w:tcPr>
+            <w:tcW w:type="dxa" w:w="1000"/>
+          </w:tcPr>
+          <w:p>
+            <w:r>
+              <w:rPr>
+                <w:sz w:val="17"/>
+                <w:szCs w:val="17"/>
+              </w:rPr>
+              <w:t xml:space="preserve">1991</w:t>
+            </w:r>
+          </w:p>
+        </w:tc>
+        <w:tc>
+          <w:tcPr>
+            <w:tcW w:type="dxa" w:w="1900"/>
+          </w:tcPr>
+          <w:p>
+            <w:r>
+              <w:rPr>
+                <w:sz w:val="17"/>
+                <w:szCs w:val="17"/>
+              </w:rPr>
+              <w:t xml:space="preserve">76,000</w:t>
+            </w:r>
+          </w:p>
+        </w:tc>
+        <w:tc>
+          <w:tcPr>
+            <w:tcW w:type="dxa" w:w="2300"/>
+          </w:tcPr>
+          <w:p>
+            <w:r>
+              <w:rPr>
+                <w:sz w:val="17"/>
+                <w:szCs w:val="17"/>
+              </w:rPr>
+              <w:t xml:space="preserve">USGS peak record</w:t>
+            </w:r>
+          </w:p>
+        </w:tc>
+        <w:tc>
+          <w:tcPr>
+            <w:tcW w:type="dxa" w:w="2200"/>
+          </w:tcPr>
+          <w:p>
+            <w:r>
+              <w:rPr>
+                <w:sz w:val="17"/>
+                <w:szCs w:val="17"/>
+              </w:rPr>
+              <w:t xml:space="preserve">no hourly record</w:t>
+            </w:r>
+          </w:p>
+        </w:tc>
+        <w:tc>
+          <w:tcPr>
+            <w:tcW w:type="dxa" w:w="2100"/>
+          </w:tcPr>
+          <w:p>
+            <w:r>
+              <w:rPr>
+                <w:sz w:val="17"/>
+                <w:szCs w:val="17"/>
+              </w:rPr>
+              <w:t xml:space="preserve">110,107</w:t>
+            </w:r>
+          </w:p>
+        </w:tc>
+      </w:tr>
+      <w:tr>
+        <w:tc>
+          <w:tcPr>
+            <w:tcW w:type="dxa" w:w="1000"/>
+          </w:tcPr>
+          <w:p>
+            <w:r>
+              <w:rPr>
+                <w:sz w:val="17"/>
+                <w:szCs w:val="17"/>
               </w:rPr>
               <w:t xml:space="preserve">1993</w:t>
             </w:r>
@@ -959,15 +2273,101 @@
         </w:tc>
         <w:tc>
           <w:tcPr>
+            <w:tcW w:type="dxa" w:w="1900"/>
+          </w:tcPr>
+          <w:p>
+            <w:r>
+              <w:rPr>
+                <w:sz w:val="17"/>
+                <w:szCs w:val="17"/>
+              </w:rPr>
+              <w:t xml:space="preserve">14,100</w:t>
+            </w:r>
+          </w:p>
+        </w:tc>
+        <w:tc>
+          <w:tcPr>
+            <w:tcW w:type="dxa" w:w="2300"/>
+          </w:tcPr>
+          <w:p>
+            <w:r>
+              <w:rPr>
+                <w:sz w:val="17"/>
+                <w:szCs w:val="17"/>
+              </w:rPr>
+              <w:t xml:space="preserve">hourly 1-hr max</w:t>
+            </w:r>
+          </w:p>
+        </w:tc>
+        <w:tc>
+          <w:tcPr>
             <w:tcW w:type="dxa" w:w="2200"/>
           </w:tcPr>
           <w:p>
             <w:r>
               <w:rPr>
-                <w:sz w:val="19"/>
-                <w:szCs w:val="19"/>
-              </w:rPr>
-              <w:t xml:space="preserve">14,100</w:t>
+                <w:sz w:val="17"/>
+                <w:szCs w:val="17"/>
+              </w:rPr>
+              <w:t xml:space="preserve">no unreg peak</w:t>
+            </w:r>
+          </w:p>
+        </w:tc>
+        <w:tc>
+          <w:tcPr>
+            <w:tcW w:type="dxa" w:w="2100"/>
+          </w:tcPr>
+          <w:p>
+            <w:r>
+              <w:rPr>
+                <w:sz w:val="17"/>
+                <w:szCs w:val="17"/>
+              </w:rPr>
+              <w:t xml:space="preserve">33,272</w:t>
+            </w:r>
+          </w:p>
+        </w:tc>
+      </w:tr>
+      <w:tr>
+        <w:tc>
+          <w:tcPr>
+            <w:tcW w:type="dxa" w:w="1000"/>
+          </w:tcPr>
+          <w:p>
+            <w:r>
+              <w:rPr>
+                <w:sz w:val="17"/>
+                <w:szCs w:val="17"/>
+              </w:rPr>
+              <w:t xml:space="preserve">1994</w:t>
+            </w:r>
+          </w:p>
+        </w:tc>
+        <w:tc>
+          <w:tcPr>
+            <w:tcW w:type="dxa" w:w="1900"/>
+          </w:tcPr>
+          <w:p>
+            <w:r>
+              <w:rPr>
+                <w:sz w:val="17"/>
+                <w:szCs w:val="17"/>
+              </w:rPr>
+              <w:t xml:space="preserve">17,300</w:t>
+            </w:r>
+          </w:p>
+        </w:tc>
+        <w:tc>
+          <w:tcPr>
+            <w:tcW w:type="dxa" w:w="2300"/>
+          </w:tcPr>
+          <w:p>
+            <w:r>
+              <w:rPr>
+                <w:sz w:val="17"/>
+                <w:szCs w:val="17"/>
+              </w:rPr>
+              <w:t xml:space="preserve">hourly 1-hr max</w:t>
             </w:r>
           </w:p>
         </w:tc>
@@ -978,40 +2378,68 @@
           <w:p>
             <w:r>
               <w:rPr>
-                <w:sz w:val="19"/>
-                <w:szCs w:val="19"/>
-              </w:rPr>
-              <w:t xml:space="preserve">17,658</w:t>
-            </w:r>
-          </w:p>
-        </w:tc>
-        <w:tc>
-          <w:tcPr>
-            <w:tcW w:type="dxa" w:w="2500"/>
-          </w:tcPr>
-          <w:p>
-            <w:r>
-              <w:rPr>
-                <w:sz w:val="19"/>
-                <w:szCs w:val="19"/>
-              </w:rPr>
-              <w:t xml:space="preserve">33,272</w:t>
-            </w:r>
-          </w:p>
-        </w:tc>
-      </w:tr>
-      <w:tr>
-        <w:tc>
-          <w:tcPr>
-            <w:tcW w:type="dxa" w:w="1100"/>
-          </w:tcPr>
-          <w:p>
-            <w:r>
-              <w:rPr>
-                <w:sz w:val="19"/>
-                <w:szCs w:val="19"/>
-              </w:rPr>
-              <w:t xml:space="preserve">1994</w:t>
+                <w:sz w:val="17"/>
+                <w:szCs w:val="17"/>
+              </w:rPr>
+              <w:t xml:space="preserve">no unreg peak</w:t>
+            </w:r>
+          </w:p>
+        </w:tc>
+        <w:tc>
+          <w:tcPr>
+            <w:tcW w:type="dxa" w:w="2100"/>
+          </w:tcPr>
+          <w:p>
+            <w:r>
+              <w:rPr>
+                <w:sz w:val="17"/>
+                <w:szCs w:val="17"/>
+              </w:rPr>
+              <w:t xml:space="preserve">23,937</w:t>
+            </w:r>
+          </w:p>
+        </w:tc>
+      </w:tr>
+      <w:tr>
+        <w:tc>
+          <w:tcPr>
+            <w:tcW w:type="dxa" w:w="1000"/>
+          </w:tcPr>
+          <w:p>
+            <w:r>
+              <w:rPr>
+                <w:sz w:val="17"/>
+                <w:szCs w:val="17"/>
+              </w:rPr>
+              <w:t xml:space="preserve">1995</w:t>
+            </w:r>
+          </w:p>
+        </w:tc>
+        <w:tc>
+          <w:tcPr>
+            <w:tcW w:type="dxa" w:w="1900"/>
+          </w:tcPr>
+          <w:p>
+            <w:r>
+              <w:rPr>
+                <w:sz w:val="17"/>
+                <w:szCs w:val="17"/>
+              </w:rPr>
+              <w:t xml:space="preserve">47,350</w:t>
+            </w:r>
+          </w:p>
+        </w:tc>
+        <w:tc>
+          <w:tcPr>
+            <w:tcW w:type="dxa" w:w="2300"/>
+          </w:tcPr>
+          <w:p>
+            <w:r>
+              <w:rPr>
+                <w:sz w:val="17"/>
+                <w:szCs w:val="17"/>
+              </w:rPr>
+              <w:t xml:space="preserve">hourly 1-hr max</w:t>
             </w:r>
           </w:p>
         </w:tc>
@@ -1022,10 +2450,68 @@
           <w:p>
             <w:r>
               <w:rPr>
-                <w:sz w:val="19"/>
-                <w:szCs w:val="19"/>
-              </w:rPr>
-              <w:t xml:space="preserve">17,300</w:t>
+                <w:sz w:val="17"/>
+                <w:szCs w:val="17"/>
+              </w:rPr>
+              <w:t xml:space="preserve">no unreg peak</w:t>
+            </w:r>
+          </w:p>
+        </w:tc>
+        <w:tc>
+          <w:tcPr>
+            <w:tcW w:type="dxa" w:w="2100"/>
+          </w:tcPr>
+          <w:p>
+            <w:r>
+              <w:rPr>
+                <w:sz w:val="17"/>
+                <w:szCs w:val="17"/>
+              </w:rPr>
+              <w:t xml:space="preserve">64,114</w:t>
+            </w:r>
+          </w:p>
+        </w:tc>
+      </w:tr>
+      <w:tr>
+        <w:tc>
+          <w:tcPr>
+            <w:tcW w:type="dxa" w:w="1000"/>
+          </w:tcPr>
+          <w:p>
+            <w:r>
+              <w:rPr>
+                <w:sz w:val="17"/>
+                <w:szCs w:val="17"/>
+              </w:rPr>
+              <w:t xml:space="preserve">1996</w:t>
+            </w:r>
+          </w:p>
+        </w:tc>
+        <w:tc>
+          <w:tcPr>
+            <w:tcW w:type="dxa" w:w="1900"/>
+          </w:tcPr>
+          <w:p>
+            <w:r>
+              <w:rPr>
+                <w:sz w:val="17"/>
+                <w:szCs w:val="17"/>
+              </w:rPr>
+              <w:t xml:space="preserve">111,250</w:t>
+            </w:r>
+          </w:p>
+        </w:tc>
+        <w:tc>
+          <w:tcPr>
+            <w:tcW w:type="dxa" w:w="2300"/>
+          </w:tcPr>
+          <w:p>
+            <w:r>
+              <w:rPr>
+                <w:sz w:val="17"/>
+                <w:szCs w:val="17"/>
+              </w:rPr>
+              <w:t xml:space="preserve">hourly 1-hr max</w:t>
             </w:r>
           </w:p>
         </w:tc>
@@ -1036,40 +2522,68 @@
           <w:p>
             <w:r>
               <w:rPr>
-                <w:sz w:val="19"/>
-                <w:szCs w:val="19"/>
-              </w:rPr>
-              <w:t xml:space="preserve">3,225</w:t>
-            </w:r>
-          </w:p>
-        </w:tc>
-        <w:tc>
-          <w:tcPr>
-            <w:tcW w:type="dxa" w:w="2500"/>
-          </w:tcPr>
-          <w:p>
-            <w:r>
-              <w:rPr>
-                <w:sz w:val="19"/>
-                <w:szCs w:val="19"/>
-              </w:rPr>
-              <w:t xml:space="preserve">23,937</w:t>
-            </w:r>
-          </w:p>
-        </w:tc>
-      </w:tr>
-      <w:tr>
-        <w:tc>
-          <w:tcPr>
-            <w:tcW w:type="dxa" w:w="1100"/>
-          </w:tcPr>
-          <w:p>
-            <w:r>
-              <w:rPr>
-                <w:sz w:val="19"/>
-                <w:szCs w:val="19"/>
-              </w:rPr>
-              <w:t xml:space="preserve">1995</w:t>
+                <w:sz w:val="17"/>
+                <w:szCs w:val="17"/>
+              </w:rPr>
+              <w:t xml:space="preserve">no unreg peak</w:t>
+            </w:r>
+          </w:p>
+        </w:tc>
+        <w:tc>
+          <w:tcPr>
+            <w:tcW w:type="dxa" w:w="2100"/>
+          </w:tcPr>
+          <w:p>
+            <w:r>
+              <w:rPr>
+                <w:sz w:val="17"/>
+                <w:szCs w:val="17"/>
+              </w:rPr>
+              <w:t xml:space="preserve">176,855</w:t>
+            </w:r>
+          </w:p>
+        </w:tc>
+      </w:tr>
+      <w:tr>
+        <w:tc>
+          <w:tcPr>
+            <w:tcW w:type="dxa" w:w="1000"/>
+          </w:tcPr>
+          <w:p>
+            <w:r>
+              <w:rPr>
+                <w:sz w:val="17"/>
+                <w:szCs w:val="17"/>
+              </w:rPr>
+              <w:t xml:space="preserve">1997</w:t>
+            </w:r>
+          </w:p>
+        </w:tc>
+        <w:tc>
+          <w:tcPr>
+            <w:tcW w:type="dxa" w:w="1900"/>
+          </w:tcPr>
+          <w:p>
+            <w:r>
+              <w:rPr>
+                <w:sz w:val="17"/>
+                <w:szCs w:val="17"/>
+              </w:rPr>
+              <w:t xml:space="preserve">56,150</w:t>
+            </w:r>
+          </w:p>
+        </w:tc>
+        <w:tc>
+          <w:tcPr>
+            <w:tcW w:type="dxa" w:w="2300"/>
+          </w:tcPr>
+          <w:p>
+            <w:r>
+              <w:rPr>
+                <w:sz w:val="17"/>
+                <w:szCs w:val="17"/>
+              </w:rPr>
+              <w:t xml:space="preserve">hourly 1-hr max</w:t>
             </w:r>
           </w:p>
         </w:tc>
@@ -1080,10 +2594,68 @@
           <w:p>
             <w:r>
               <w:rPr>
-                <w:sz w:val="19"/>
-                <w:szCs w:val="19"/>
-              </w:rPr>
-              <w:t xml:space="preserve">47,350</w:t>
+                <w:sz w:val="17"/>
+                <w:szCs w:val="17"/>
+              </w:rPr>
+              <w:t xml:space="preserve">low coverage</w:t>
+            </w:r>
+          </w:p>
+        </w:tc>
+        <w:tc>
+          <w:tcPr>
+            <w:tcW w:type="dxa" w:w="2100"/>
+          </w:tcPr>
+          <w:p>
+            <w:r>
+              <w:rPr>
+                <w:sz w:val="17"/>
+                <w:szCs w:val="17"/>
+              </w:rPr>
+              <w:t xml:space="preserve">88,978</w:t>
+            </w:r>
+          </w:p>
+        </w:tc>
+      </w:tr>
+      <w:tr>
+        <w:tc>
+          <w:tcPr>
+            <w:tcW w:type="dxa" w:w="1000"/>
+          </w:tcPr>
+          <w:p>
+            <w:r>
+              <w:rPr>
+                <w:sz w:val="17"/>
+                <w:szCs w:val="17"/>
+              </w:rPr>
+              <w:t xml:space="preserve">1998</w:t>
+            </w:r>
+          </w:p>
+        </w:tc>
+        <w:tc>
+          <w:tcPr>
+            <w:tcW w:type="dxa" w:w="1900"/>
+          </w:tcPr>
+          <w:p>
+            <w:r>
+              <w:rPr>
+                <w:sz w:val="17"/>
+                <w:szCs w:val="17"/>
+              </w:rPr>
+              <w:t xml:space="preserve">30,550</w:t>
+            </w:r>
+          </w:p>
+        </w:tc>
+        <w:tc>
+          <w:tcPr>
+            <w:tcW w:type="dxa" w:w="2300"/>
+          </w:tcPr>
+          <w:p>
+            <w:r>
+              <w:rPr>
+                <w:sz w:val="17"/>
+                <w:szCs w:val="17"/>
+              </w:rPr>
+              <w:t xml:space="preserve">hourly 1-hr max</w:t>
             </w:r>
           </w:p>
         </w:tc>
@@ -1094,40 +2666,68 @@
           <w:p>
             <w:r>
               <w:rPr>
-                <w:sz w:val="19"/>
-                <w:szCs w:val="19"/>
-              </w:rPr>
-              <w:t xml:space="preserve">14,885</w:t>
-            </w:r>
-          </w:p>
-        </w:tc>
-        <w:tc>
-          <w:tcPr>
-            <w:tcW w:type="dxa" w:w="2500"/>
-          </w:tcPr>
-          <w:p>
-            <w:r>
-              <w:rPr>
-                <w:sz w:val="19"/>
-                <w:szCs w:val="19"/>
-              </w:rPr>
-              <w:t xml:space="preserve">64,114</w:t>
-            </w:r>
-          </w:p>
-        </w:tc>
-      </w:tr>
-      <w:tr>
-        <w:tc>
-          <w:tcPr>
-            <w:tcW w:type="dxa" w:w="1100"/>
-          </w:tcPr>
-          <w:p>
-            <w:r>
-              <w:rPr>
-                <w:sz w:val="19"/>
-                <w:szCs w:val="19"/>
-              </w:rPr>
-              <w:t xml:space="preserve">1996</w:t>
+                <w:sz w:val="17"/>
+                <w:szCs w:val="17"/>
+              </w:rPr>
+              <w:t xml:space="preserve">no unreg peak</w:t>
+            </w:r>
+          </w:p>
+        </w:tc>
+        <w:tc>
+          <w:tcPr>
+            <w:tcW w:type="dxa" w:w="2100"/>
+          </w:tcPr>
+          <w:p>
+            <w:r>
+              <w:rPr>
+                <w:sz w:val="17"/>
+                <w:szCs w:val="17"/>
+              </w:rPr>
+              <w:t xml:space="preserve">38,925</w:t>
+            </w:r>
+          </w:p>
+        </w:tc>
+      </w:tr>
+      <w:tr>
+        <w:tc>
+          <w:tcPr>
+            <w:tcW w:type="dxa" w:w="1000"/>
+          </w:tcPr>
+          <w:p>
+            <w:r>
+              <w:rPr>
+                <w:sz w:val="17"/>
+                <w:szCs w:val="17"/>
+              </w:rPr>
+              <w:t xml:space="preserve">1999</w:t>
+            </w:r>
+          </w:p>
+        </w:tc>
+        <w:tc>
+          <w:tcPr>
+            <w:tcW w:type="dxa" w:w="1900"/>
+          </w:tcPr>
+          <w:p>
+            <w:r>
+              <w:rPr>
+                <w:sz w:val="17"/>
+                <w:szCs w:val="17"/>
+              </w:rPr>
+              <w:t xml:space="preserve">57,350</w:t>
+            </w:r>
+          </w:p>
+        </w:tc>
+        <w:tc>
+          <w:tcPr>
+            <w:tcW w:type="dxa" w:w="2300"/>
+          </w:tcPr>
+          <w:p>
+            <w:r>
+              <w:rPr>
+                <w:sz w:val="17"/>
+                <w:szCs w:val="17"/>
+              </w:rPr>
+              <w:t xml:space="preserve">hourly 1-hr max</w:t>
             </w:r>
           </w:p>
         </w:tc>
@@ -1138,10 +2738,68 @@
           <w:p>
             <w:r>
               <w:rPr>
-                <w:sz w:val="19"/>
-                <w:szCs w:val="19"/>
-              </w:rPr>
-              <w:t xml:space="preserve">111,250</w:t>
+                <w:sz w:val="17"/>
+                <w:szCs w:val="17"/>
+              </w:rPr>
+              <w:t xml:space="preserve">low coverage</w:t>
+            </w:r>
+          </w:p>
+        </w:tc>
+        <w:tc>
+          <w:tcPr>
+            <w:tcW w:type="dxa" w:w="2100"/>
+          </w:tcPr>
+          <w:p>
+            <w:r>
+              <w:rPr>
+                <w:sz w:val="17"/>
+                <w:szCs w:val="17"/>
+              </w:rPr>
+              <w:t xml:space="preserve">72,091</w:t>
+            </w:r>
+          </w:p>
+        </w:tc>
+      </w:tr>
+      <w:tr>
+        <w:tc>
+          <w:tcPr>
+            <w:tcW w:type="dxa" w:w="1000"/>
+          </w:tcPr>
+          <w:p>
+            <w:r>
+              <w:rPr>
+                <w:sz w:val="17"/>
+                <w:szCs w:val="17"/>
+              </w:rPr>
+              <w:t xml:space="preserve">2000</w:t>
+            </w:r>
+          </w:p>
+        </w:tc>
+        <w:tc>
+          <w:tcPr>
+            <w:tcW w:type="dxa" w:w="1900"/>
+          </w:tcPr>
+          <w:p>
+            <w:r>
+              <w:rPr>
+                <w:sz w:val="17"/>
+                <w:szCs w:val="17"/>
+              </w:rPr>
+              <w:t xml:space="preserve">41,375</w:t>
+            </w:r>
+          </w:p>
+        </w:tc>
+        <w:tc>
+          <w:tcPr>
+            <w:tcW w:type="dxa" w:w="2300"/>
+          </w:tcPr>
+          <w:p>
+            <w:r>
+              <w:rPr>
+                <w:sz w:val="17"/>
+                <w:szCs w:val="17"/>
+              </w:rPr>
+              <w:t xml:space="preserve">hourly 1-hr max</w:t>
             </w:r>
           </w:p>
         </w:tc>
@@ -1152,40 +2810,68 @@
           <w:p>
             <w:r>
               <w:rPr>
-                <w:sz w:val="19"/>
-                <w:szCs w:val="19"/>
-              </w:rPr>
-              <w:t xml:space="preserve">71,119</w:t>
-            </w:r>
-          </w:p>
-        </w:tc>
-        <w:tc>
-          <w:tcPr>
-            <w:tcW w:type="dxa" w:w="2500"/>
-          </w:tcPr>
-          <w:p>
-            <w:r>
-              <w:rPr>
-                <w:sz w:val="19"/>
-                <w:szCs w:val="19"/>
-              </w:rPr>
-              <w:t xml:space="preserve">176,855</w:t>
-            </w:r>
-          </w:p>
-        </w:tc>
-      </w:tr>
-      <w:tr>
-        <w:tc>
-          <w:tcPr>
-            <w:tcW w:type="dxa" w:w="1100"/>
-          </w:tcPr>
-          <w:p>
-            <w:r>
-              <w:rPr>
-                <w:sz w:val="19"/>
-                <w:szCs w:val="19"/>
-              </w:rPr>
-              <w:t xml:space="preserve">1998</w:t>
+                <w:sz w:val="17"/>
+                <w:szCs w:val="17"/>
+              </w:rPr>
+              <w:t xml:space="preserve">no unreg peak</w:t>
+            </w:r>
+          </w:p>
+        </w:tc>
+        <w:tc>
+          <w:tcPr>
+            <w:tcW w:type="dxa" w:w="2100"/>
+          </w:tcPr>
+          <w:p>
+            <w:r>
+              <w:rPr>
+                <w:sz w:val="17"/>
+                <w:szCs w:val="17"/>
+              </w:rPr>
+              <w:t xml:space="preserve">73,070</w:t>
+            </w:r>
+          </w:p>
+        </w:tc>
+      </w:tr>
+      <w:tr>
+        <w:tc>
+          <w:tcPr>
+            <w:tcW w:type="dxa" w:w="1000"/>
+          </w:tcPr>
+          <w:p>
+            <w:r>
+              <w:rPr>
+                <w:sz w:val="17"/>
+                <w:szCs w:val="17"/>
+              </w:rPr>
+              <w:t xml:space="preserve">2001</w:t>
+            </w:r>
+          </w:p>
+        </w:tc>
+        <w:tc>
+          <w:tcPr>
+            <w:tcW w:type="dxa" w:w="1900"/>
+          </w:tcPr>
+          <w:p>
+            <w:r>
+              <w:rPr>
+                <w:sz w:val="17"/>
+                <w:szCs w:val="17"/>
+              </w:rPr>
+              <w:t xml:space="preserve">11,500</w:t>
+            </w:r>
+          </w:p>
+        </w:tc>
+        <w:tc>
+          <w:tcPr>
+            <w:tcW w:type="dxa" w:w="2300"/>
+          </w:tcPr>
+          <w:p>
+            <w:r>
+              <w:rPr>
+                <w:sz w:val="17"/>
+                <w:szCs w:val="17"/>
+              </w:rPr>
+              <w:t xml:space="preserve">hourly 1-hr max</w:t>
             </w:r>
           </w:p>
         </w:tc>
@@ -1196,10 +2882,68 @@
           <w:p>
             <w:r>
               <w:rPr>
-                <w:sz w:val="19"/>
-                <w:szCs w:val="19"/>
-              </w:rPr>
-              <w:t xml:space="preserve">30,550</w:t>
+                <w:sz w:val="17"/>
+                <w:szCs w:val="17"/>
+              </w:rPr>
+              <w:t xml:space="preserve">low coverage</w:t>
+            </w:r>
+          </w:p>
+        </w:tc>
+        <w:tc>
+          <w:tcPr>
+            <w:tcW w:type="dxa" w:w="2100"/>
+          </w:tcPr>
+          <w:p>
+            <w:r>
+              <w:rPr>
+                <w:sz w:val="17"/>
+                <w:szCs w:val="17"/>
+              </w:rPr>
+              <w:t xml:space="preserve">11,955</w:t>
+            </w:r>
+          </w:p>
+        </w:tc>
+      </w:tr>
+      <w:tr>
+        <w:tc>
+          <w:tcPr>
+            <w:tcW w:type="dxa" w:w="1000"/>
+          </w:tcPr>
+          <w:p>
+            <w:r>
+              <w:rPr>
+                <w:sz w:val="17"/>
+                <w:szCs w:val="17"/>
+              </w:rPr>
+              <w:t xml:space="preserve">2002</w:t>
+            </w:r>
+          </w:p>
+        </w:tc>
+        <w:tc>
+          <w:tcPr>
+            <w:tcW w:type="dxa" w:w="1900"/>
+          </w:tcPr>
+          <w:p>
+            <w:r>
+              <w:rPr>
+                <w:sz w:val="17"/>
+                <w:szCs w:val="17"/>
+              </w:rPr>
+              <w:t xml:space="preserve">50,875</w:t>
+            </w:r>
+          </w:p>
+        </w:tc>
+        <w:tc>
+          <w:tcPr>
+            <w:tcW w:type="dxa" w:w="2300"/>
+          </w:tcPr>
+          <w:p>
+            <w:r>
+              <w:rPr>
+                <w:sz w:val="17"/>
+                <w:szCs w:val="17"/>
+              </w:rPr>
+              <w:t xml:space="preserve">hourly 1-hr max</w:t>
             </w:r>
           </w:p>
         </w:tc>
@@ -1210,40 +2954,68 @@
           <w:p>
             <w:r>
               <w:rPr>
-                <w:sz w:val="19"/>
-                <w:szCs w:val="19"/>
-              </w:rPr>
-              <w:t xml:space="preserve">5,226</w:t>
-            </w:r>
-          </w:p>
-        </w:tc>
-        <w:tc>
-          <w:tcPr>
-            <w:tcW w:type="dxa" w:w="2500"/>
-          </w:tcPr>
-          <w:p>
-            <w:r>
-              <w:rPr>
-                <w:sz w:val="19"/>
-                <w:szCs w:val="19"/>
-              </w:rPr>
-              <w:t xml:space="preserve">38,925</w:t>
-            </w:r>
-          </w:p>
-        </w:tc>
-      </w:tr>
-      <w:tr>
-        <w:tc>
-          <w:tcPr>
-            <w:tcW w:type="dxa" w:w="1100"/>
-          </w:tcPr>
-          <w:p>
-            <w:r>
-              <w:rPr>
-                <w:sz w:val="19"/>
-                <w:szCs w:val="19"/>
-              </w:rPr>
-              <w:t xml:space="preserve">2000</w:t>
+                <w:sz w:val="17"/>
+                <w:szCs w:val="17"/>
+              </w:rPr>
+              <w:t xml:space="preserve">no unreg peak</w:t>
+            </w:r>
+          </w:p>
+        </w:tc>
+        <w:tc>
+          <w:tcPr>
+            <w:tcW w:type="dxa" w:w="2100"/>
+          </w:tcPr>
+          <w:p>
+            <w:r>
+              <w:rPr>
+                <w:sz w:val="17"/>
+                <w:szCs w:val="17"/>
+              </w:rPr>
+              <w:t xml:space="preserve">66,027</w:t>
+            </w:r>
+          </w:p>
+        </w:tc>
+      </w:tr>
+      <w:tr>
+        <w:tc>
+          <w:tcPr>
+            <w:tcW w:type="dxa" w:w="1000"/>
+          </w:tcPr>
+          <w:p>
+            <w:r>
+              <w:rPr>
+                <w:sz w:val="17"/>
+                <w:szCs w:val="17"/>
+              </w:rPr>
+              <w:t xml:space="preserve">2003</w:t>
+            </w:r>
+          </w:p>
+        </w:tc>
+        <w:tc>
+          <w:tcPr>
+            <w:tcW w:type="dxa" w:w="1900"/>
+          </w:tcPr>
+          <w:p>
+            <w:r>
+              <w:rPr>
+                <w:sz w:val="17"/>
+                <w:szCs w:val="17"/>
+              </w:rPr>
+              <w:t xml:space="preserve">68,350</w:t>
+            </w:r>
+          </w:p>
+        </w:tc>
+        <w:tc>
+          <w:tcPr>
+            <w:tcW w:type="dxa" w:w="2300"/>
+          </w:tcPr>
+          <w:p>
+            <w:r>
+              <w:rPr>
+                <w:sz w:val="17"/>
+                <w:szCs w:val="17"/>
+              </w:rPr>
+              <w:t xml:space="preserve">hourly 1-hr max</w:t>
             </w:r>
           </w:p>
         </w:tc>
@@ -1254,10 +3026,68 @@
           <w:p>
             <w:r>
               <w:rPr>
-                <w:sz w:val="19"/>
-                <w:szCs w:val="19"/>
-              </w:rPr>
-              <w:t xml:space="preserve">41,375</w:t>
+                <w:sz w:val="17"/>
+                <w:szCs w:val="17"/>
+              </w:rPr>
+              <w:t xml:space="preserve">low coverage</w:t>
+            </w:r>
+          </w:p>
+        </w:tc>
+        <w:tc>
+          <w:tcPr>
+            <w:tcW w:type="dxa" w:w="2100"/>
+          </w:tcPr>
+          <w:p>
+            <w:r>
+              <w:rPr>
+                <w:sz w:val="17"/>
+                <w:szCs w:val="17"/>
+              </w:rPr>
+              <w:t xml:space="preserve">106,554</w:t>
+            </w:r>
+          </w:p>
+        </w:tc>
+      </w:tr>
+      <w:tr>
+        <w:tc>
+          <w:tcPr>
+            <w:tcW w:type="dxa" w:w="1000"/>
+          </w:tcPr>
+          <w:p>
+            <w:r>
+              <w:rPr>
+                <w:sz w:val="17"/>
+                <w:szCs w:val="17"/>
+              </w:rPr>
+              <w:t xml:space="preserve">2004</w:t>
+            </w:r>
+          </w:p>
+        </w:tc>
+        <w:tc>
+          <w:tcPr>
+            <w:tcW w:type="dxa" w:w="1900"/>
+          </w:tcPr>
+          <w:p>
+            <w:r>
+              <w:rPr>
+                <w:sz w:val="17"/>
+                <w:szCs w:val="17"/>
+              </w:rPr>
+              <w:t xml:space="preserve">38,000</w:t>
+            </w:r>
+          </w:p>
+        </w:tc>
+        <w:tc>
+          <w:tcPr>
+            <w:tcW w:type="dxa" w:w="2300"/>
+          </w:tcPr>
+          <w:p>
+            <w:r>
+              <w:rPr>
+                <w:sz w:val="17"/>
+                <w:szCs w:val="17"/>
+              </w:rPr>
+              <w:t xml:space="preserve">hourly 1-hr max</w:t>
             </w:r>
           </w:p>
         </w:tc>
@@ -1268,40 +3098,68 @@
           <w:p>
             <w:r>
               <w:rPr>
-                <w:sz w:val="19"/>
-                <w:szCs w:val="19"/>
-              </w:rPr>
-              <w:t xml:space="preserve">32,077</w:t>
-            </w:r>
-          </w:p>
-        </w:tc>
-        <w:tc>
-          <w:tcPr>
-            <w:tcW w:type="dxa" w:w="2500"/>
-          </w:tcPr>
-          <w:p>
-            <w:r>
-              <w:rPr>
-                <w:sz w:val="19"/>
-                <w:szCs w:val="19"/>
-              </w:rPr>
-              <w:t xml:space="preserve">73,070</w:t>
-            </w:r>
-          </w:p>
-        </w:tc>
-      </w:tr>
-      <w:tr>
-        <w:tc>
-          <w:tcPr>
-            <w:tcW w:type="dxa" w:w="1100"/>
-          </w:tcPr>
-          <w:p>
-            <w:r>
-              <w:rPr>
-                <w:sz w:val="19"/>
-                <w:szCs w:val="19"/>
-              </w:rPr>
-              <w:t xml:space="preserve">2002</w:t>
+                <w:sz w:val="17"/>
+                <w:szCs w:val="17"/>
+              </w:rPr>
+              <w:t xml:space="preserve">low coverage</w:t>
+            </w:r>
+          </w:p>
+        </w:tc>
+        <w:tc>
+          <w:tcPr>
+            <w:tcW w:type="dxa" w:w="2100"/>
+          </w:tcPr>
+          <w:p>
+            <w:r>
+              <w:rPr>
+                <w:sz w:val="17"/>
+                <w:szCs w:val="17"/>
+              </w:rPr>
+              <w:t xml:space="preserve">54,700</w:t>
+            </w:r>
+          </w:p>
+        </w:tc>
+      </w:tr>
+      <w:tr>
+        <w:tc>
+          <w:tcPr>
+            <w:tcW w:type="dxa" w:w="1000"/>
+          </w:tcPr>
+          <w:p>
+            <w:r>
+              <w:rPr>
+                <w:sz w:val="17"/>
+                <w:szCs w:val="17"/>
+              </w:rPr>
+              <w:t xml:space="preserve">2005</w:t>
+            </w:r>
+          </w:p>
+        </w:tc>
+        <w:tc>
+          <w:tcPr>
+            <w:tcW w:type="dxa" w:w="1900"/>
+          </w:tcPr>
+          <w:p>
+            <w:r>
+              <w:rPr>
+                <w:sz w:val="17"/>
+                <w:szCs w:val="17"/>
+              </w:rPr>
+              <w:t xml:space="preserve">29,450</w:t>
+            </w:r>
+          </w:p>
+        </w:tc>
+        <w:tc>
+          <w:tcPr>
+            <w:tcW w:type="dxa" w:w="2300"/>
+          </w:tcPr>
+          <w:p>
+            <w:r>
+              <w:rPr>
+                <w:sz w:val="17"/>
+                <w:szCs w:val="17"/>
+              </w:rPr>
+              <w:t xml:space="preserve">hourly 1-hr max</w:t>
             </w:r>
           </w:p>
         </w:tc>
@@ -1312,10 +3170,68 @@
           <w:p>
             <w:r>
               <w:rPr>
-                <w:sz w:val="19"/>
-                <w:szCs w:val="19"/>
-              </w:rPr>
-              <w:t xml:space="preserve">50,875</w:t>
+                <w:sz w:val="17"/>
+                <w:szCs w:val="17"/>
+              </w:rPr>
+              <w:t xml:space="preserve">no unreg peak</w:t>
+            </w:r>
+          </w:p>
+        </w:tc>
+        <w:tc>
+          <w:tcPr>
+            <w:tcW w:type="dxa" w:w="2100"/>
+          </w:tcPr>
+          <w:p>
+            <w:r>
+              <w:rPr>
+                <w:sz w:val="17"/>
+                <w:szCs w:val="17"/>
+              </w:rPr>
+              <w:t xml:space="preserve">52,859</w:t>
+            </w:r>
+          </w:p>
+        </w:tc>
+      </w:tr>
+      <w:tr>
+        <w:tc>
+          <w:tcPr>
+            <w:tcW w:type="dxa" w:w="1000"/>
+          </w:tcPr>
+          <w:p>
+            <w:r>
+              <w:rPr>
+                <w:sz w:val="17"/>
+                <w:szCs w:val="17"/>
+              </w:rPr>
+              <w:t xml:space="preserve">2006</w:t>
+            </w:r>
+          </w:p>
+        </w:tc>
+        <w:tc>
+          <w:tcPr>
+            <w:tcW w:type="dxa" w:w="1900"/>
+          </w:tcPr>
+          <w:p>
+            <w:r>
+              <w:rPr>
+                <w:sz w:val="17"/>
+                <w:szCs w:val="17"/>
+              </w:rPr>
+              <w:t xml:space="preserve">55,800</w:t>
+            </w:r>
+          </w:p>
+        </w:tc>
+        <w:tc>
+          <w:tcPr>
+            <w:tcW w:type="dxa" w:w="2300"/>
+          </w:tcPr>
+          <w:p>
+            <w:r>
+              <w:rPr>
+                <w:sz w:val="17"/>
+                <w:szCs w:val="17"/>
+              </w:rPr>
+              <w:t xml:space="preserve">hourly 1-hr max</w:t>
             </w:r>
           </w:p>
         </w:tc>
@@ -1326,40 +3242,68 @@
           <w:p>
             <w:r>
               <w:rPr>
-                <w:sz w:val="19"/>
-                <w:szCs w:val="19"/>
-              </w:rPr>
-              <w:t xml:space="preserve">13,029</w:t>
-            </w:r>
-          </w:p>
-        </w:tc>
-        <w:tc>
-          <w:tcPr>
-            <w:tcW w:type="dxa" w:w="2500"/>
-          </w:tcPr>
-          <w:p>
-            <w:r>
-              <w:rPr>
-                <w:sz w:val="19"/>
-                <w:szCs w:val="19"/>
-              </w:rPr>
-              <w:t xml:space="preserve">66,027</w:t>
-            </w:r>
-          </w:p>
-        </w:tc>
-      </w:tr>
-      <w:tr>
-        <w:tc>
-          <w:tcPr>
-            <w:tcW w:type="dxa" w:w="1100"/>
-          </w:tcPr>
-          <w:p>
-            <w:r>
-              <w:rPr>
-                <w:sz w:val="19"/>
-                <w:szCs w:val="19"/>
-              </w:rPr>
-              <w:t xml:space="preserve">2005</w:t>
+                <w:sz w:val="17"/>
+                <w:szCs w:val="17"/>
+              </w:rPr>
+              <w:t xml:space="preserve">low coverage</w:t>
+            </w:r>
+          </w:p>
+        </w:tc>
+        <w:tc>
+          <w:tcPr>
+            <w:tcW w:type="dxa" w:w="2100"/>
+          </w:tcPr>
+          <w:p>
+            <w:r>
+              <w:rPr>
+                <w:sz w:val="17"/>
+                <w:szCs w:val="17"/>
+              </w:rPr>
+              <w:t xml:space="preserve">62,350</w:t>
+            </w:r>
+          </w:p>
+        </w:tc>
+      </w:tr>
+      <w:tr>
+        <w:tc>
+          <w:tcPr>
+            <w:tcW w:type="dxa" w:w="1000"/>
+          </w:tcPr>
+          <w:p>
+            <w:r>
+              <w:rPr>
+                <w:sz w:val="17"/>
+                <w:szCs w:val="17"/>
+              </w:rPr>
+              <w:t xml:space="preserve">2007</w:t>
+            </w:r>
+          </w:p>
+        </w:tc>
+        <w:tc>
+          <w:tcPr>
+            <w:tcW w:type="dxa" w:w="1900"/>
+          </w:tcPr>
+          <w:p>
+            <w:r>
+              <w:rPr>
+                <w:sz w:val="17"/>
+                <w:szCs w:val="17"/>
+              </w:rPr>
+              <w:t xml:space="preserve">76,975</w:t>
+            </w:r>
+          </w:p>
+        </w:tc>
+        <w:tc>
+          <w:tcPr>
+            <w:tcW w:type="dxa" w:w="2300"/>
+          </w:tcPr>
+          <w:p>
+            <w:r>
+              <w:rPr>
+                <w:sz w:val="17"/>
+                <w:szCs w:val="17"/>
+              </w:rPr>
+              <w:t xml:space="preserve">hourly 1-hr max</w:t>
             </w:r>
           </w:p>
         </w:tc>
@@ -1370,10 +3314,68 @@
           <w:p>
             <w:r>
               <w:rPr>
-                <w:sz w:val="19"/>
-                <w:szCs w:val="19"/>
-              </w:rPr>
-              <w:t xml:space="preserve">29,450</w:t>
+                <w:sz w:val="17"/>
+                <w:szCs w:val="17"/>
+              </w:rPr>
+              <w:t xml:space="preserve">no unreg peak</w:t>
+            </w:r>
+          </w:p>
+        </w:tc>
+        <w:tc>
+          <w:tcPr>
+            <w:tcW w:type="dxa" w:w="2100"/>
+          </w:tcPr>
+          <w:p>
+            <w:r>
+              <w:rPr>
+                <w:sz w:val="17"/>
+                <w:szCs w:val="17"/>
+              </w:rPr>
+              <w:t xml:space="preserve">130,999</w:t>
+            </w:r>
+          </w:p>
+        </w:tc>
+      </w:tr>
+      <w:tr>
+        <w:tc>
+          <w:tcPr>
+            <w:tcW w:type="dxa" w:w="1000"/>
+          </w:tcPr>
+          <w:p>
+            <w:r>
+              <w:rPr>
+                <w:sz w:val="17"/>
+                <w:szCs w:val="17"/>
+              </w:rPr>
+              <w:t xml:space="preserve">2011</w:t>
+            </w:r>
+          </w:p>
+        </w:tc>
+        <w:tc>
+          <w:tcPr>
+            <w:tcW w:type="dxa" w:w="1900"/>
+          </w:tcPr>
+          <w:p>
+            <w:r>
+              <w:rPr>
+                <w:sz w:val="17"/>
+                <w:szCs w:val="17"/>
+              </w:rPr>
+              <w:t xml:space="preserve">45,150</w:t>
+            </w:r>
+          </w:p>
+        </w:tc>
+        <w:tc>
+          <w:tcPr>
+            <w:tcW w:type="dxa" w:w="2300"/>
+          </w:tcPr>
+          <w:p>
+            <w:r>
+              <w:rPr>
+                <w:sz w:val="17"/>
+                <w:szCs w:val="17"/>
+              </w:rPr>
+              <w:t xml:space="preserve">hourly 1-hr max</w:t>
             </w:r>
           </w:p>
         </w:tc>
@@ -1384,40 +3386,68 @@
           <w:p>
             <w:r>
               <w:rPr>
-                <w:sz w:val="19"/>
-                <w:szCs w:val="19"/>
-              </w:rPr>
-              <w:t xml:space="preserve">22,536</w:t>
-            </w:r>
-          </w:p>
-        </w:tc>
-        <w:tc>
-          <w:tcPr>
-            <w:tcW w:type="dxa" w:w="2500"/>
-          </w:tcPr>
-          <w:p>
-            <w:r>
-              <w:rPr>
-                <w:sz w:val="19"/>
-                <w:szCs w:val="19"/>
-              </w:rPr>
-              <w:t xml:space="preserve">52,859</w:t>
-            </w:r>
-          </w:p>
-        </w:tc>
-      </w:tr>
-      <w:tr>
-        <w:tc>
-          <w:tcPr>
-            <w:tcW w:type="dxa" w:w="1100"/>
-          </w:tcPr>
-          <w:p>
-            <w:r>
-              <w:rPr>
-                <w:sz w:val="19"/>
-                <w:szCs w:val="19"/>
-              </w:rPr>
-              <w:t xml:space="preserve">2007</w:t>
+                <w:sz w:val="17"/>
+                <w:szCs w:val="17"/>
+              </w:rPr>
+              <w:t xml:space="preserve">low coverage</w:t>
+            </w:r>
+          </w:p>
+        </w:tc>
+        <w:tc>
+          <w:tcPr>
+            <w:tcW w:type="dxa" w:w="2100"/>
+          </w:tcPr>
+          <w:p>
+            <w:r>
+              <w:rPr>
+                <w:sz w:val="17"/>
+                <w:szCs w:val="17"/>
+              </w:rPr>
+              <w:t xml:space="preserve">84,076</w:t>
+            </w:r>
+          </w:p>
+        </w:tc>
+      </w:tr>
+      <w:tr>
+        <w:tc>
+          <w:tcPr>
+            <w:tcW w:type="dxa" w:w="1000"/>
+          </w:tcPr>
+          <w:p>
+            <w:r>
+              <w:rPr>
+                <w:sz w:val="17"/>
+                <w:szCs w:val="17"/>
+              </w:rPr>
+              <w:t xml:space="preserve">2012</w:t>
+            </w:r>
+          </w:p>
+        </w:tc>
+        <w:tc>
+          <w:tcPr>
+            <w:tcW w:type="dxa" w:w="1900"/>
+          </w:tcPr>
+          <w:p>
+            <w:r>
+              <w:rPr>
+                <w:sz w:val="17"/>
+                <w:szCs w:val="17"/>
+              </w:rPr>
+              <w:t xml:space="preserve">36,575</w:t>
+            </w:r>
+          </w:p>
+        </w:tc>
+        <w:tc>
+          <w:tcPr>
+            <w:tcW w:type="dxa" w:w="2300"/>
+          </w:tcPr>
+          <w:p>
+            <w:r>
+              <w:rPr>
+                <w:sz w:val="17"/>
+                <w:szCs w:val="17"/>
+              </w:rPr>
+              <w:t xml:space="preserve">hourly 1-hr max</w:t>
             </w:r>
           </w:p>
         </w:tc>
@@ -1428,10 +3458,68 @@
           <w:p>
             <w:r>
               <w:rPr>
-                <w:sz w:val="19"/>
-                <w:szCs w:val="19"/>
-              </w:rPr>
-              <w:t xml:space="preserve">76,975</w:t>
+                <w:sz w:val="17"/>
+                <w:szCs w:val="17"/>
+              </w:rPr>
+              <w:t xml:space="preserve">low coverage</w:t>
+            </w:r>
+          </w:p>
+        </w:tc>
+        <w:tc>
+          <w:tcPr>
+            <w:tcW w:type="dxa" w:w="2100"/>
+          </w:tcPr>
+          <w:p>
+            <w:r>
+              <w:rPr>
+                <w:sz w:val="17"/>
+                <w:szCs w:val="17"/>
+              </w:rPr>
+              <w:t xml:space="preserve">51,907</w:t>
+            </w:r>
+          </w:p>
+        </w:tc>
+      </w:tr>
+      <w:tr>
+        <w:tc>
+          <w:tcPr>
+            <w:tcW w:type="dxa" w:w="1000"/>
+          </w:tcPr>
+          <w:p>
+            <w:r>
+              <w:rPr>
+                <w:sz w:val="17"/>
+                <w:szCs w:val="17"/>
+              </w:rPr>
+              <w:t xml:space="preserve">2013</w:t>
+            </w:r>
+          </w:p>
+        </w:tc>
+        <w:tc>
+          <w:tcPr>
+            <w:tcW w:type="dxa" w:w="1900"/>
+          </w:tcPr>
+          <w:p>
+            <w:r>
+              <w:rPr>
+                <w:sz w:val="17"/>
+                <w:szCs w:val="17"/>
+              </w:rPr>
+              <w:t xml:space="preserve">46,825</w:t>
+            </w:r>
+          </w:p>
+        </w:tc>
+        <w:tc>
+          <w:tcPr>
+            <w:tcW w:type="dxa" w:w="2300"/>
+          </w:tcPr>
+          <w:p>
+            <w:r>
+              <w:rPr>
+                <w:sz w:val="17"/>
+                <w:szCs w:val="17"/>
+              </w:rPr>
+              <w:t xml:space="preserve">hourly 1-hr max</w:t>
             </w:r>
           </w:p>
         </w:tc>
@@ -1442,24 +3530,96 @@
           <w:p>
             <w:r>
               <w:rPr>
-                <w:sz w:val="19"/>
-                <w:szCs w:val="19"/>
-              </w:rPr>
-              <w:t xml:space="preserve">57,785</w:t>
-            </w:r>
-          </w:p>
-        </w:tc>
-        <w:tc>
-          <w:tcPr>
-            <w:tcW w:type="dxa" w:w="2500"/>
-          </w:tcPr>
-          <w:p>
-            <w:r>
-              <w:rPr>
-                <w:sz w:val="19"/>
-                <w:szCs w:val="19"/>
-              </w:rPr>
-              <w:t xml:space="preserve">130,999</w:t>
+                <w:sz w:val="17"/>
+                <w:szCs w:val="17"/>
+              </w:rPr>
+              <w:t xml:space="preserve">low coverage</w:t>
+            </w:r>
+          </w:p>
+        </w:tc>
+        <w:tc>
+          <w:tcPr>
+            <w:tcW w:type="dxa" w:w="2100"/>
+          </w:tcPr>
+          <w:p>
+            <w:r>
+              <w:rPr>
+                <w:sz w:val="17"/>
+                <w:szCs w:val="17"/>
+              </w:rPr>
+              <w:t xml:space="preserve">58,409</w:t>
+            </w:r>
+          </w:p>
+        </w:tc>
+      </w:tr>
+      <w:tr>
+        <w:tc>
+          <w:tcPr>
+            <w:tcW w:type="dxa" w:w="1000"/>
+          </w:tcPr>
+          <w:p>
+            <w:r>
+              <w:rPr>
+                <w:sz w:val="17"/>
+                <w:szCs w:val="17"/>
+              </w:rPr>
+              <w:t xml:space="preserve">2016</w:t>
+            </w:r>
+          </w:p>
+        </w:tc>
+        <w:tc>
+          <w:tcPr>
+            <w:tcW w:type="dxa" w:w="1900"/>
+          </w:tcPr>
+          <w:p>
+            <w:r>
+              <w:rPr>
+                <w:sz w:val="17"/>
+                <w:szCs w:val="17"/>
+              </w:rPr>
+              <w:t xml:space="preserve">83,175</w:t>
+            </w:r>
+          </w:p>
+        </w:tc>
+        <w:tc>
+          <w:tcPr>
+            <w:tcW w:type="dxa" w:w="2300"/>
+          </w:tcPr>
+          <w:p>
+            <w:r>
+              <w:rPr>
+                <w:sz w:val="17"/>
+                <w:szCs w:val="17"/>
+              </w:rPr>
+              <w:t xml:space="preserve">hourly 1-hr max</w:t>
+            </w:r>
+          </w:p>
+        </w:tc>
+        <w:tc>
+          <w:tcPr>
+            <w:tcW w:type="dxa" w:w="2200"/>
+          </w:tcPr>
+          <w:p>
+            <w:r>
+              <w:rPr>
+                <w:sz w:val="17"/>
+                <w:szCs w:val="17"/>
+              </w:rPr>
+              <w:t xml:space="preserve">low coverage</w:t>
+            </w:r>
+          </w:p>
+        </w:tc>
+        <w:tc>
+          <w:tcPr>
+            <w:tcW w:type="dxa" w:w="2100"/>
+          </w:tcPr>
+          <w:p>
+            <w:r>
+              <w:rPr>
+                <w:sz w:val="17"/>
+                <w:szCs w:val="17"/>
+              </w:rPr>
+              <w:t xml:space="preserve">133,940</w:t>
             </w:r>
           </w:p>
         </w:tc>
@@ -1483,7 +3643,7 @@
           <w:sz w:val="22"/>
           <w:szCs w:val="22"/>
         </w:rPr>
-        <w:t xml:space="preserve">Daily unregulated flow = observed Castle Rock daily flow + daily change in MOS storage (from the daily elevation record and 2014 rating). Because Mayfield-to-Castle-Rock travel time is under one day, no routing is applied at daily resolution; Mayfield re-regulation storage is neglected (small relative to Mossyrock and largely netting out over 1-day-and-longer windows). Rolling 1/3/5-day maxima are computed on a full daily grid so an N-day value always represents N consecutive recorded days. A water year's durations enter the record if its October–March season is complete (Season_Complete screen), OR by explicit override: the Castle Rock daily record is winter-only through the 1990s (seasonal operation missing October, ~32 flood-season days per year), and WY1992–2000 and WY2026 are admitted under the stated assumption that the recorded season captured the annual maxima — the holdout is added to the recorded flows as usual. The one-day mass-balance values also serve as the One_day source for years without hourly data. Where available (WY1976–1979), results were cross-validated against Table B-I of the 2009 Hydrology Restudy report.</w:t>
+        <w:t xml:space="preserve">Daily unregulated flow = observed Castle Rock daily flow + daily change in MOS storage (daily elevation record, 2014 rating). Travel time Mayfield-to-Castle-Rock is under one day, so no routing is applied at daily resolution; Mayfield re-regulation storage is neglected (small relative to Mossyrock, largely netting out over 1-day-and-longer windows). Rolling 1/3/5-day maxima are computed on a full daily grid, so an N-day value always represents N consecutive recorded days. The Castle Rock daily record is winter-only or otherwise season-incomplete through much of the regulated era (seasonal operation missing October, ~32 flood-season days per year in the late 1980s–1990s). Adopted decision: the entire regulated era WY1974–2025 is admitted by override under the stated assumption that the recorded season captured the annual maxima — the daily holdout is added to the recorded flows as usual. WY2026 is not overridden: the water year is in progress, and its 3/5-day values await year completion. The one-day mass-balance values also serve as the One_day source for years without hourly data (37 water years). Where available (WY1976–1979), results were cross-validated against Table B-I of the 2009 Hydrology Restudy report.</w:t>
       </w:r>
     </w:p>
     <w:p>
@@ -1504,7 +3664,7 @@
           <w:sz w:val="22"/>
           <w:szCs w:val="22"/>
         </w:rPr>
-        <w:t xml:space="preserve">Before Mossyrock closure (December 1968) the record is unregulated by definition. Peaks are the USGS observed instantaneous annual peaks (42 water years). The 1/3/5-day values are rolling maxima computed directly from the USGS daily record, subject to the same season-completeness screen. WY1927 carries a peak only (the daily record begins later).</w:t>
+        <w:t xml:space="preserve">Before Mossyrock closure (December 1968) the record is unregulated by definition. Peaks are the USGS observed instantaneous annual peaks (42 water years). The 1/3/5-day values are rolling maxima computed directly from the USGS daily record under the same season screen. WY1927 carries a peak only (the daily record begins later).</w:t>
       </w:r>
     </w:p>
     <w:p>
@@ -1623,7 +3783,7 @@
                 <w:sz w:val="19"/>
                 <w:szCs w:val="19"/>
               </w:rPr>
-              <w:t xml:space="preserve">67</w:t>
+              <w:t xml:space="preserve">95</w:t>
             </w:r>
           </w:p>
         </w:tc>
@@ -1637,7 +3797,7 @@
                 <w:sz w:val="19"/>
                 <w:szCs w:val="19"/>
               </w:rPr>
-              <w:t xml:space="preserve">42 USGS pre-reg peaks; 16 hourly holdout; 9 dS_2day regression</w:t>
+              <w:t xml:space="preserve">42 USGS pre-reg peaks; 37 dS_2day regression; 16 hourly holdout</w:t>
             </w:r>
           </w:p>
         </w:tc>
@@ -1667,7 +3827,7 @@
                 <w:sz w:val="19"/>
                 <w:szCs w:val="19"/>
               </w:rPr>
-              <w:t xml:space="preserve">86</w:t>
+              <w:t xml:space="preserve">94</w:t>
             </w:r>
           </w:p>
         </w:tc>
@@ -1681,7 +3841,7 @@
                 <w:sz w:val="19"/>
                 <w:szCs w:val="19"/>
               </w:rPr>
-              <w:t xml:space="preserve">41 USGS daily pre-reg; 29 daily mass balance; 16 hourly holdout</w:t>
+              <w:t xml:space="preserve">41 USGS daily pre-reg; 37 daily mass balance; 16 hourly holdout</w:t>
             </w:r>
           </w:p>
         </w:tc>
@@ -1711,7 +3871,7 @@
                 <w:sz w:val="19"/>
                 <w:szCs w:val="19"/>
               </w:rPr>
-              <w:t xml:space="preserve">85</w:t>
+              <w:t xml:space="preserve">93</w:t>
             </w:r>
           </w:p>
         </w:tc>
@@ -1725,7 +3885,7 @@
                 <w:sz w:val="19"/>
                 <w:szCs w:val="19"/>
               </w:rPr>
-              <w:t xml:space="preserve">41 USGS daily pre-reg; 44 daily mass balance</w:t>
+              <w:t xml:space="preserve">41 USGS daily pre-reg; 52 daily mass balance</w:t>
             </w:r>
           </w:p>
         </w:tc>
@@ -1755,7 +3915,7 @@
                 <w:sz w:val="19"/>
                 <w:szCs w:val="19"/>
               </w:rPr>
-              <w:t xml:space="preserve">85</w:t>
+              <w:t xml:space="preserve">93</w:t>
             </w:r>
           </w:p>
         </w:tc>
@@ -1769,7 +3929,7 @@
                 <w:sz w:val="19"/>
                 <w:szCs w:val="19"/>
               </w:rPr>
-              <w:t xml:space="preserve">41 USGS daily pre-reg; 44 daily mass balance</w:t>
+              <w:t xml:space="preserve">41 USGS daily pre-reg; 52 daily mass balance</w:t>
             </w:r>
           </w:p>
         </w:tc>
@@ -1796,7 +3956,7 @@
           <w:sz w:val="22"/>
           <w:szCs w:val="22"/>
         </w:rPr>
-        <w:t xml:space="preserve">Coverage notes: WY1969–1974, 1985, 1987–1991, and 2001 are absent entirely (regulated era, season-incomplete daily records, no holdout); WY1969–1973 additionally lack daily MOS elevation and are candidates for a perception threshold entered directly in HEC-SSP, as in the prior study. Peaks are currently blank for WY1975–1984, 1986 and for a subset of years with low-coverage hourly data (1997, 1999, 2003, 2004, 2006, 2011–2013, 2016) — see open items. WY2023 lacks 3/5-day values (season screen).</w:t>
+        <w:t xml:space="preserve">Coverage: WY1927–2026 with only WY1969–1973 absent (no daily MOS elevation before October 1973, no hourly record, and no basis for a holdout or regression predictor). Every included water year has a peak. WY1927 lacks durations (daily record starts later); WY2026 lacks 3/5-day pending year completion.</w:t>
       </w:r>
     </w:p>
     <w:p>
@@ -1822,7 +3982,7 @@
           <w:sz w:val="22"/>
           <w:szCs w:val="22"/>
         </w:rPr>
-        <w:t xml:space="preserve">Winter-only Castle Rock daily records (WY1992–2000, 2026) captured the annual maxima; durations from the recorded season are representative.</w:t>
+        <w:t xml:space="preserve">The winter-only / season-incomplete Castle Rock daily records of the regulated era (WY1974–2025 override) captured the annual maxima; durations from the recorded season are representative.</w:t>
       </w:r>
     </w:p>
     <w:p>
@@ -1839,7 +3999,7 @@
           <w:sz w:val="22"/>
           <w:szCs w:val="22"/>
         </w:rPr>
-        <w:t xml:space="preserve">Mayfield storage change is neglected in the daily mass balance and the Toutle reach is excluded from routing.</w:t>
+        <w:t xml:space="preserve">Mayfield storage change is neglected in the daily mass balance, and the Toutle reach is excluded from routing.</w:t>
       </w:r>
     </w:p>
     <w:p>
@@ -1856,7 +4016,7 @@
           <w:sz w:val="22"/>
           <w:szCs w:val="22"/>
         </w:rPr>
-        <w:t xml:space="preserve">Regulated and unregulated peaks are the same storm when their timestamps fall within 72 hours (all 17 fit pairs complied).</w:t>
+        <w:t xml:space="preserve">Regulated and unregulated peaks within 72 hours are the same storm (all 17 fit pairs complied).</w:t>
       </w:r>
     </w:p>
     <w:p>
@@ -1890,7 +4050,7 @@
           <w:sz w:val="22"/>
           <w:szCs w:val="22"/>
         </w:rPr>
-        <w:t xml:space="preserve">The regulated peak is defined as the 1-hr max of the USGS hourly record rather than the USGS instantaneous peak, for like-for-like comparison with the unregulated estimate.</w:t>
+        <w:t xml:space="preserve">The regulated peak is the 1-hr max of the USGS hourly record (not the USGS instantaneous peak) wherever the hourly record exists, for like-for-like comparison; for WY1974–1991 the USGS instantaneous peak stands in as the regulated peak in the regression fill.</w:t>
       </w:r>
     </w:p>
     <w:p>
@@ -1916,7 +4076,7 @@
           <w:sz w:val="22"/>
           <w:szCs w:val="22"/>
         </w:rPr>
-        <w:t xml:space="preserve">Fillable peak gaps: WY1975–1984 and 1986 have USGS regulated peaks and computable dS_2day predictors; the low-coverage years listed in Sec. 8 have regulated hourly peaks and dS. Extending the regression fill to both groups would close up to ~20 blank peaks. Requires a small change to the gap-detection logic and a re-run.</w:t>
+        <w:t xml:space="preserve">WY1969–1973: enter a perception threshold directly in HEC-SSP (as in the prior study) or exclude; no holdout, regression predictor, or daily elevation exists for these years.</w:t>
       </w:r>
     </w:p>
     <w:p>
@@ -1933,7 +4093,7 @@
           <w:sz w:val="22"/>
           <w:szCs w:val="22"/>
         </w:rPr>
-        <w:t xml:space="preserve">Decide the WY1969–1973 treatment for HEC-SSP (perception threshold vs. exclusion).</w:t>
+        <w:t xml:space="preserve">Review whether low-coverage unregulated peaks (e.g., WY1997 at 47% Oct–Mar coverage) should remain in the regression fit set; their record values already come from the regression.</w:t>
       </w:r>
     </w:p>
     <w:p>
@@ -1950,7 +4110,7 @@
           <w:sz w:val="22"/>
           <w:szCs w:val="22"/>
         </w:rPr>
-        <w:t xml:space="preserve">Review whether low-coverage unregulated peaks (e.g., WY1997 at 47% Oct–Mar coverage) should remain in the regression fit set.</w:t>
+        <w:t xml:space="preserve">Re-run the durations and assembly after WY2026 closes to fill its 3/5-day values.</w:t>
       </w:r>
     </w:p>
     <w:p>

</xml_diff>

<commit_message>
Memo Section 10 (Flow Frequency) and frequency appendices
Frequency_Curves_And_Table.py now reads everything 2026 from the SSP
reports in CAS_Unreg_FF/ssp -- moments, skews, event counts, curve
ordinates, confidence limits and Hirsch-Stedinger plotting positions.
Only the 2009 statistics remain hard coded. Adopted peak analysis is
CAS_2026_p_Sensor_1969_1973 (WY1969-1973 censored, no low-outlier test).
Full-precision fitted moments reproduce SSP's computed curve exactly.

New outputs: 2026 summary figure, 2009 comparison figure, four
SSP-layout per-duration figures (computed, expected, 5%/95% confidence,
observed events), and a distribution-parameter/event-count table.

Memo: Section 10 written up -- EMA setup, the censoring rationale, why
no low-outlier test, skew weighting, both figures, the 2009 comparison
discussion, and Table 10-1. Appendix B labels the ordinates table;
Appendix C adds the four per-duration figures.
</commit_message>
<xml_diff>
--- a/CAS_Unreg_FF/docs/MEMO_CAS_Unreg_FF.docx
+++ b/CAS_Unreg_FF/docs/MEMO_CAS_Unreg_FF.docx
@@ -1664,87 +1664,1822 @@
     </w:p>
     <w:p>
       <w:pPr>
+        <w:spacing w:after="120"/>
         <w:rPr>
           <w:sz w:val="22"/>
         </w:rPr>
       </w:pPr>
+      <w:r>
+        <w:rPr>
+          <w:i w:val="0"/>
+          <w:sz w:val="22"/>
+        </w:rPr>
+        <w:t>The assembled record was analyzed in HEC-SSP using the Bulletin 17C expected moments algorithm (EMA), one analysis per duration: CAS_2026_p_Sensor_1969_1973 for the instantaneous peak and CAS_2026_1, CAS_2026_3 and CAS_2026_5 for the 1-, 3- and 5-day durations. All four fit a log-Pearson Type III distribution to the unregulated record described in Sections 3 through 9, with the station skew weighted against a regional value.</w:t>
+      </w:r>
     </w:p>
     <w:p>
       <w:pPr>
+        <w:spacing w:after="120"/>
         <w:rPr>
           <w:sz w:val="22"/>
         </w:rPr>
       </w:pPr>
+      <w:r>
+        <w:rPr>
+          <w:i w:val="0"/>
+          <w:sz w:val="22"/>
+        </w:rPr>
+        <w:t>WY1969–1973 are censored in the peak analysis. Those five water years have observed regulated peaks but no basis for an unregulated estimate: the daily Mossyrock elevation record begins in October 1973, so no storage-change predictor exists, and there is no hourly record from which to compute a holdout. Rather than omit them, which would discard the knowledge that no extreme unregulated flood occurred in those years, or assign point estimates the data do not support, they are entered as censored intervals. EMA then uses that constraint without asserting a value. The peak analysis accordingly reports 95 systematic events within a 100-year historic period, with five events flagged as missing.</w:t>
+      </w:r>
     </w:p>
     <w:p>
       <w:pPr>
+        <w:spacing w:after="120"/>
         <w:rPr>
           <w:sz w:val="22"/>
         </w:rPr>
       </w:pPr>
+      <w:r>
+        <w:rPr>
+          <w:i w:val="0"/>
+          <w:sz w:val="22"/>
+        </w:rPr>
+        <w:t>No low-outlier test was applied. The multiple Grubbs-Beck procedure was turned off in all four analyses, so the Grubbs-Beck critical value is zero and no potentially influential low floods were censored. The record contains no zero or near-zero annual maxima, and because the unregulated series is constructed rather than gaged, its small years carry the same provenance as its large ones; there is no physical basis for treating the lower tail as unrepresentative.</w:t>
+      </w:r>
     </w:p>
     <w:p>
       <w:pPr>
+        <w:spacing w:after="120"/>
         <w:rPr>
           <w:sz w:val="22"/>
         </w:rPr>
       </w:pPr>
+      <w:r>
+        <w:rPr>
+          <w:i w:val="0"/>
+          <w:sz w:val="22"/>
+        </w:rPr>
+        <w:t>Station skews are slightly negative for every duration, from −0.158 for the peak to −0.051 for the 5-day. Weighting against the regional skew moves the peak to −0.135 and the longer durations toward zero, giving adopted skews of −0.135, −0.052, −0.007 and −0.029. Equivalent record lengths after censoring range from 100 to 111 years.</w:t>
+      </w:r>
     </w:p>
     <w:p>
       <w:pPr>
+        <w:spacing w:after="40"/>
+        <w:jc w:val="center"/>
         <w:rPr>
           <w:sz w:val="22"/>
         </w:rPr>
       </w:pPr>
+      <w:r>
+        <w:rPr>
+          <w:i w:val="0"/>
+          <w:sz w:val="22"/>
+        </w:rPr>
+        <w:drawing>
+          <wp:inline xmlns:a="http://schemas.openxmlformats.org/drawingml/2006/main" xmlns:pic="http://schemas.openxmlformats.org/drawingml/2006/picture">
+            <wp:extent cx="5852160" cy="4551680"/>
+            <wp:docPr id="1" name="Picture 1"/>
+            <wp:cNvGraphicFramePr>
+              <a:graphicFrameLocks noChangeAspect="1"/>
+            </wp:cNvGraphicFramePr>
+            <a:graphic>
+              <a:graphicData uri="http://schemas.openxmlformats.org/drawingml/2006/picture">
+                <pic:pic>
+                  <pic:nvPicPr>
+                    <pic:cNvPr id="0" name="CAS_Unreg_2026_frequency.png"/>
+                    <pic:cNvPicPr/>
+                  </pic:nvPicPr>
+                  <pic:blipFill>
+                    <a:blip r:embed="rId7"/>
+                    <a:stretch>
+                      <a:fillRect/>
+                    </a:stretch>
+                  </pic:blipFill>
+                  <pic:spPr>
+                    <a:xfrm>
+                      <a:off x="0" y="0"/>
+                      <a:ext cx="5852160" cy="4551680"/>
+                    </a:xfrm>
+                    <a:prstGeom prst="rect"/>
+                  </pic:spPr>
+                </pic:pic>
+              </a:graphicData>
+            </a:graphic>
+          </wp:inline>
+        </w:drawing>
+      </w:r>
     </w:p>
     <w:p>
       <w:pPr>
+        <w:spacing w:after="200"/>
+        <w:jc w:val="center"/>
         <w:rPr>
           <w:sz w:val="22"/>
         </w:rPr>
       </w:pPr>
+      <w:r>
+        <w:rPr>
+          <w:i/>
+          <w:sz w:val="18"/>
+        </w:rPr>
+        <w:t>Figure 10-1. Adopted unregulated frequency curves at Castle Rock, WY1927–2026, all four durations.</w:t>
+      </w:r>
     </w:p>
     <w:p>
       <w:pPr>
+        <w:spacing w:after="120"/>
         <w:rPr>
           <w:sz w:val="22"/>
         </w:rPr>
       </w:pPr>
+      <w:r>
+        <w:rPr>
+          <w:i w:val="0"/>
+          <w:sz w:val="22"/>
+        </w:rPr>
+        <w:t>Figure 10-2 places the same curves against the 2009 Hydrology Restudy. Both sets are computed curves rather than expected probability curves: the expected probability adjustment scales with record length, and the 2009 study had shorter records, so comparing adjusted curves would fold a data-quantity difference into what is meant to be a comparison of flood estimates. The 2009 study's shortest duration is 0.20 day rather than an instantaneous peak, so that pairing is approximate, though the two means agree to within 0.001 log units.</w:t>
+      </w:r>
     </w:p>
     <w:p>
       <w:pPr>
+        <w:spacing w:after="120"/>
         <w:rPr>
           <w:sz w:val="22"/>
         </w:rPr>
       </w:pPr>
+      <w:r>
+        <w:rPr>
+          <w:i w:val="0"/>
+          <w:sz w:val="22"/>
+        </w:rPr>
+        <w:t>The two studies agree closely through the range supported by data and diverge in the tail. At the 10% chance exceedance all four durations fall within about 2% of the 2009 values, and at the median within 3%. Beyond the 2% chance event the 2026 curves fall progressively below: at the 1% chance the peak is 7.8% lower and the durations 1.8% to 3.3% lower, and at the 0.2% chance the peak is 13.7% lower. The cause is skew. The 2009 study adopted positive skews for every duration, from +0.140 to +0.193, which bend those curves upward in the tail, while the skews adopted here are near zero or negative and flatten it. The divergence is a difference in fitted tail behavior rather than in the record through the observed range.</w:t>
+      </w:r>
     </w:p>
     <w:p>
       <w:pPr>
+        <w:spacing w:after="40"/>
+        <w:jc w:val="center"/>
         <w:rPr>
           <w:sz w:val="22"/>
         </w:rPr>
       </w:pPr>
+      <w:r>
+        <w:rPr>
+          <w:i w:val="0"/>
+          <w:sz w:val="22"/>
+        </w:rPr>
+        <w:drawing>
+          <wp:inline xmlns:a="http://schemas.openxmlformats.org/drawingml/2006/main" xmlns:pic="http://schemas.openxmlformats.org/drawingml/2006/picture">
+            <wp:extent cx="5852160" cy="4551680"/>
+            <wp:docPr id="2" name="Picture 2"/>
+            <wp:cNvGraphicFramePr>
+              <a:graphicFrameLocks noChangeAspect="1"/>
+            </wp:cNvGraphicFramePr>
+            <a:graphic>
+              <a:graphicData uri="http://schemas.openxmlformats.org/drawingml/2006/picture">
+                <pic:pic>
+                  <pic:nvPicPr>
+                    <pic:cNvPr id="0" name="CAS_Unreg_2009_vs_2026.png"/>
+                    <pic:cNvPicPr/>
+                  </pic:nvPicPr>
+                  <pic:blipFill>
+                    <a:blip r:embed="rId8"/>
+                    <a:stretch>
+                      <a:fillRect/>
+                    </a:stretch>
+                  </pic:blipFill>
+                  <pic:spPr>
+                    <a:xfrm>
+                      <a:off x="0" y="0"/>
+                      <a:ext cx="5852160" cy="4551680"/>
+                    </a:xfrm>
+                    <a:prstGeom prst="rect"/>
+                  </pic:spPr>
+                </pic:pic>
+              </a:graphicData>
+            </a:graphic>
+          </wp:inline>
+        </w:drawing>
+      </w:r>
     </w:p>
     <w:p>
       <w:pPr>
+        <w:spacing w:after="200"/>
+        <w:jc w:val="center"/>
         <w:rPr>
           <w:sz w:val="22"/>
         </w:rPr>
       </w:pPr>
+      <w:r>
+        <w:rPr>
+          <w:i/>
+          <w:sz w:val="18"/>
+        </w:rPr>
+        <w:t>Figure 10-2. Adopted 2026 curves (solid) against the 2009 Hydrology Restudy (dashed).</w:t>
+      </w:r>
     </w:p>
     <w:p>
       <w:pPr>
+        <w:spacing w:after="120"/>
         <w:rPr>
           <w:sz w:val="22"/>
         </w:rPr>
       </w:pPr>
+      <w:r>
+        <w:rPr>
+          <w:i w:val="0"/>
+          <w:sz w:val="22"/>
+        </w:rPr>
+        <w:t>Table 10-1 gives the fitted distribution parameters and event counts reported by SSP for each adopted analysis.</w:t>
+      </w:r>
     </w:p>
+    <w:tbl>
+      <w:tblPr>
+        <w:tblW w:w="9200" w:type="dxa"/>
+        <w:tblBorders>
+          <w:top w:val="single" w:sz="4" w:space="0" w:color="auto"/>
+          <w:left w:val="single" w:sz="4" w:space="0" w:color="auto"/>
+          <w:bottom w:val="single" w:sz="4" w:space="0" w:color="auto"/>
+          <w:right w:val="single" w:sz="4" w:space="0" w:color="auto"/>
+          <w:insideH w:val="single" w:sz="4" w:space="0" w:color="auto"/>
+          <w:insideV w:val="single" w:sz="4" w:space="0" w:color="auto"/>
+        </w:tblBorders>
+        <w:tblCellMar>
+          <w:left w:w="10" w:type="dxa"/>
+          <w:right w:w="10" w:type="dxa"/>
+        </w:tblCellMar>
+        <w:tblLook w:val="04A0" w:firstRow="1" w:lastRow="0" w:firstColumn="1" w:lastColumn="0" w:noHBand="0" w:noVBand="1"/>
+      </w:tblPr>
+      <w:tblGrid>
+        <w:gridCol w:w="2200"/>
+        <w:gridCol w:w="1900"/>
+        <w:gridCol w:w="2100"/>
+        <w:gridCol w:w="1500"/>
+        <w:gridCol w:w="1500"/>
+      </w:tblGrid>
+      <w:tr>
+        <w:tc>
+          <w:tcPr>
+            <w:tcW w:w="2200" w:type="dxa"/>
+            <w:shd w:val="clear" w:color="auto" w:fill="E8E8E8"/>
+          </w:tcPr>
+          <w:p>
+            <w:r>
+              <w:rPr>
+                <w:b/>
+                <w:bCs/>
+                <w:sz w:val="18"/>
+                <w:szCs w:val="19"/>
+              </w:rPr>
+              <w:t>Parameter</w:t>
+            </w:r>
+          </w:p>
+        </w:tc>
+        <w:tc>
+          <w:tcPr>
+            <w:tcW w:w="1900" w:type="dxa"/>
+            <w:shd w:val="clear" w:color="auto" w:fill="E8E8E8"/>
+          </w:tcPr>
+          <w:p>
+            <w:r>
+              <w:rPr>
+                <w:b/>
+                <w:bCs/>
+                <w:sz w:val="18"/>
+                <w:szCs w:val="19"/>
+              </w:rPr>
+              <w:t>Peak</w:t>
+            </w:r>
+          </w:p>
+        </w:tc>
+        <w:tc>
+          <w:tcPr>
+            <w:tcW w:w="2100" w:type="dxa"/>
+            <w:shd w:val="clear" w:color="auto" w:fill="E8E8E8"/>
+          </w:tcPr>
+          <w:p>
+            <w:r>
+              <w:rPr>
+                <w:b/>
+                <w:bCs/>
+                <w:sz w:val="18"/>
+                <w:szCs w:val="19"/>
+              </w:rPr>
+              <w:t>1-Day</w:t>
+            </w:r>
+            <w:proofErr w:type="spellStart"/>
+            <w:proofErr w:type="spellEnd"/>
+          </w:p>
+        </w:tc>
+        <w:tc>
+          <w:tcPr>
+            <w:tcW w:w="1500" w:type="dxa"/>
+            <w:shd w:val="clear" w:color="auto" w:fill="E8E8E8"/>
+          </w:tcPr>
+          <w:p>
+            <w:r>
+              <w:rPr>
+                <w:b/>
+                <w:bCs/>
+                <w:sz w:val="18"/>
+                <w:szCs w:val="19"/>
+              </w:rPr>
+              <w:t>3-Day</w:t>
+            </w:r>
+          </w:p>
+        </w:tc>
+        <w:tc>
+          <w:tcPr>
+            <w:tcW w:w="1500" w:type="dxa"/>
+            <w:shd w:val="clear" w:color="auto" w:fill="E8E8E8"/>
+          </w:tcPr>
+          <w:p>
+            <w:r>
+              <w:rPr>
+                <w:b/>
+                <w:bCs/>
+                <w:sz w:val="18"/>
+                <w:szCs w:val="19"/>
+              </w:rPr>
+              <w:t>5-Day</w:t>
+            </w:r>
+            <w:proofErr w:type="spellStart"/>
+            <w:proofErr w:type="spellEnd"/>
+          </w:p>
+        </w:tc>
+      </w:tr>
+      <w:tr>
+        <w:tc>
+          <w:tcPr>
+            <w:tcW w:w="2200" w:type="dxa"/>
+            <w:shd w:val="clear" w:color="auto" w:fill="E8E8E8"/>
+          </w:tcPr>
+          <w:p>
+            <w:r>
+              <w:rPr>
+                <w:b w:val="0"/>
+                <w:bCs/>
+                <w:sz w:val="18"/>
+                <w:szCs w:val="19"/>
+              </w:rPr>
+              <w:t>Mean</w:t>
+            </w:r>
+          </w:p>
+        </w:tc>
+        <w:tc>
+          <w:tcPr>
+            <w:tcW w:w="1900" w:type="dxa"/>
+            <w:shd w:val="clear" w:color="auto" w:fill="E8E8E8"/>
+          </w:tcPr>
+          <w:p>
+            <w:r>
+              <w:rPr>
+                <w:b w:val="0"/>
+                <w:bCs/>
+                <w:sz w:val="18"/>
+                <w:szCs w:val="19"/>
+              </w:rPr>
+              <w:t>4.778</w:t>
+            </w:r>
+          </w:p>
+        </w:tc>
+        <w:tc>
+          <w:tcPr>
+            <w:tcW w:w="2100" w:type="dxa"/>
+            <w:shd w:val="clear" w:color="auto" w:fill="E8E8E8"/>
+          </w:tcPr>
+          <w:p>
+            <w:r>
+              <w:rPr>
+                <w:b w:val="0"/>
+                <w:bCs/>
+                <w:sz w:val="18"/>
+                <w:szCs w:val="19"/>
+              </w:rPr>
+              <w:t>4.743</w:t>
+            </w:r>
+            <w:proofErr w:type="spellStart"/>
+            <w:proofErr w:type="spellEnd"/>
+          </w:p>
+        </w:tc>
+        <w:tc>
+          <w:tcPr>
+            <w:tcW w:w="1500" w:type="dxa"/>
+            <w:shd w:val="clear" w:color="auto" w:fill="E8E8E8"/>
+          </w:tcPr>
+          <w:p>
+            <w:r>
+              <w:rPr>
+                <w:b w:val="0"/>
+                <w:bCs/>
+                <w:sz w:val="18"/>
+                <w:szCs w:val="19"/>
+              </w:rPr>
+              <w:t>4.66</w:t>
+            </w:r>
+          </w:p>
+        </w:tc>
+        <w:tc>
+          <w:tcPr>
+            <w:tcW w:w="1500" w:type="dxa"/>
+            <w:shd w:val="clear" w:color="auto" w:fill="E8E8E8"/>
+          </w:tcPr>
+          <w:p>
+            <w:r>
+              <w:rPr>
+                <w:b w:val="0"/>
+                <w:bCs/>
+                <w:sz w:val="18"/>
+                <w:szCs w:val="19"/>
+              </w:rPr>
+              <w:t>4.593</w:t>
+            </w:r>
+            <w:proofErr w:type="spellStart"/>
+            <w:proofErr w:type="spellEnd"/>
+          </w:p>
+        </w:tc>
+      </w:tr>
+      <w:tr>
+        <w:tc>
+          <w:tcPr>
+            <w:tcW w:w="2200" w:type="dxa"/>
+            <w:shd w:val="clear" w:color="auto" w:fill="E8E8E8"/>
+          </w:tcPr>
+          <w:p>
+            <w:r>
+              <w:rPr>
+                <w:b w:val="0"/>
+                <w:bCs/>
+                <w:sz w:val="18"/>
+                <w:szCs w:val="19"/>
+              </w:rPr>
+              <w:t>Standard Dev</w:t>
+            </w:r>
+          </w:p>
+        </w:tc>
+        <w:tc>
+          <w:tcPr>
+            <w:tcW w:w="1900" w:type="dxa"/>
+            <w:shd w:val="clear" w:color="auto" w:fill="E8E8E8"/>
+          </w:tcPr>
+          <w:p>
+            <w:r>
+              <w:rPr>
+                <w:b w:val="0"/>
+                <w:bCs/>
+                <w:sz w:val="18"/>
+                <w:szCs w:val="19"/>
+              </w:rPr>
+              <w:t>0.202</w:t>
+            </w:r>
+          </w:p>
+        </w:tc>
+        <w:tc>
+          <w:tcPr>
+            <w:tcW w:w="2100" w:type="dxa"/>
+            <w:shd w:val="clear" w:color="auto" w:fill="E8E8E8"/>
+          </w:tcPr>
+          <w:p>
+            <w:r>
+              <w:rPr>
+                <w:b w:val="0"/>
+                <w:bCs/>
+                <w:sz w:val="18"/>
+                <w:szCs w:val="19"/>
+              </w:rPr>
+              <w:t>0.203</w:t>
+            </w:r>
+            <w:proofErr w:type="spellStart"/>
+            <w:proofErr w:type="spellEnd"/>
+          </w:p>
+        </w:tc>
+        <w:tc>
+          <w:tcPr>
+            <w:tcW w:w="1500" w:type="dxa"/>
+            <w:shd w:val="clear" w:color="auto" w:fill="E8E8E8"/>
+          </w:tcPr>
+          <w:p>
+            <w:r>
+              <w:rPr>
+                <w:b w:val="0"/>
+                <w:bCs/>
+                <w:sz w:val="18"/>
+                <w:szCs w:val="19"/>
+              </w:rPr>
+              <w:t>0.192</w:t>
+            </w:r>
+          </w:p>
+        </w:tc>
+        <w:tc>
+          <w:tcPr>
+            <w:tcW w:w="1500" w:type="dxa"/>
+            <w:shd w:val="clear" w:color="auto" w:fill="E8E8E8"/>
+          </w:tcPr>
+          <w:p>
+            <w:r>
+              <w:rPr>
+                <w:b w:val="0"/>
+                <w:bCs/>
+                <w:sz w:val="18"/>
+                <w:szCs w:val="19"/>
+              </w:rPr>
+              <w:t>0.179</w:t>
+            </w:r>
+            <w:proofErr w:type="spellStart"/>
+            <w:proofErr w:type="spellEnd"/>
+          </w:p>
+        </w:tc>
+      </w:tr>
+      <w:tr>
+        <w:tc>
+          <w:tcPr>
+            <w:tcW w:w="2200" w:type="dxa"/>
+            <w:shd w:val="clear" w:color="auto" w:fill="E8E8E8"/>
+          </w:tcPr>
+          <w:p>
+            <w:r>
+              <w:rPr>
+                <w:b w:val="0"/>
+                <w:bCs/>
+                <w:sz w:val="18"/>
+                <w:szCs w:val="19"/>
+              </w:rPr>
+              <w:t>Station Skew</w:t>
+            </w:r>
+          </w:p>
+        </w:tc>
+        <w:tc>
+          <w:tcPr>
+            <w:tcW w:w="1900" w:type="dxa"/>
+            <w:shd w:val="clear" w:color="auto" w:fill="E8E8E8"/>
+          </w:tcPr>
+          <w:p>
+            <w:r>
+              <w:rPr>
+                <w:b w:val="0"/>
+                <w:bCs/>
+                <w:sz w:val="18"/>
+                <w:szCs w:val="19"/>
+              </w:rPr>
+              <w:t>-0.158</w:t>
+            </w:r>
+          </w:p>
+        </w:tc>
+        <w:tc>
+          <w:tcPr>
+            <w:tcW w:w="2100" w:type="dxa"/>
+            <w:shd w:val="clear" w:color="auto" w:fill="E8E8E8"/>
+          </w:tcPr>
+          <w:p>
+            <w:r>
+              <w:rPr>
+                <w:b w:val="0"/>
+                <w:bCs/>
+                <w:sz w:val="18"/>
+                <w:szCs w:val="19"/>
+              </w:rPr>
+              <w:t>-0.152</w:t>
+            </w:r>
+            <w:proofErr w:type="spellStart"/>
+            <w:proofErr w:type="spellEnd"/>
+          </w:p>
+        </w:tc>
+        <w:tc>
+          <w:tcPr>
+            <w:tcW w:w="1500" w:type="dxa"/>
+            <w:shd w:val="clear" w:color="auto" w:fill="E8E8E8"/>
+          </w:tcPr>
+          <w:p>
+            <w:r>
+              <w:rPr>
+                <w:b w:val="0"/>
+                <w:bCs/>
+                <w:sz w:val="18"/>
+                <w:szCs w:val="19"/>
+              </w:rPr>
+              <w:t>-0.076</w:t>
+            </w:r>
+          </w:p>
+        </w:tc>
+        <w:tc>
+          <w:tcPr>
+            <w:tcW w:w="1500" w:type="dxa"/>
+            <w:shd w:val="clear" w:color="auto" w:fill="E8E8E8"/>
+          </w:tcPr>
+          <w:p>
+            <w:r>
+              <w:rPr>
+                <w:b w:val="0"/>
+                <w:bCs/>
+                <w:sz w:val="18"/>
+                <w:szCs w:val="19"/>
+              </w:rPr>
+              <w:t>-0.051</w:t>
+            </w:r>
+            <w:proofErr w:type="spellStart"/>
+            <w:proofErr w:type="spellEnd"/>
+          </w:p>
+        </w:tc>
+      </w:tr>
+      <w:tr>
+        <w:tc>
+          <w:tcPr>
+            <w:tcW w:w="2200" w:type="dxa"/>
+            <w:shd w:val="clear" w:color="auto" w:fill="E8E8E8"/>
+          </w:tcPr>
+          <w:p>
+            <w:r>
+              <w:rPr>
+                <w:b w:val="0"/>
+                <w:bCs/>
+                <w:sz w:val="18"/>
+                <w:szCs w:val="19"/>
+              </w:rPr>
+              <w:t>Regional Skew</w:t>
+            </w:r>
+          </w:p>
+        </w:tc>
+        <w:tc>
+          <w:tcPr>
+            <w:tcW w:w="1900" w:type="dxa"/>
+            <w:shd w:val="clear" w:color="auto" w:fill="E8E8E8"/>
+          </w:tcPr>
+          <w:p>
+            <w:r>
+              <w:rPr>
+                <w:b w:val="0"/>
+                <w:bCs/>
+                <w:sz w:val="18"/>
+                <w:szCs w:val="19"/>
+              </w:rPr>
+              <w:t>-0.07</w:t>
+            </w:r>
+          </w:p>
+        </w:tc>
+        <w:tc>
+          <w:tcPr>
+            <w:tcW w:w="2100" w:type="dxa"/>
+            <w:shd w:val="clear" w:color="auto" w:fill="E8E8E8"/>
+          </w:tcPr>
+          <w:p>
+            <w:r>
+              <w:rPr>
+                <w:b w:val="0"/>
+                <w:bCs/>
+                <w:sz w:val="18"/>
+                <w:szCs w:val="19"/>
+              </w:rPr>
+              <w:t>0.09</w:t>
+            </w:r>
+            <w:proofErr w:type="spellStart"/>
+            <w:proofErr w:type="spellEnd"/>
+          </w:p>
+        </w:tc>
+        <w:tc>
+          <w:tcPr>
+            <w:tcW w:w="1500" w:type="dxa"/>
+            <w:shd w:val="clear" w:color="auto" w:fill="E8E8E8"/>
+          </w:tcPr>
+          <w:p>
+            <w:r>
+              <w:rPr>
+                <w:b w:val="0"/>
+                <w:bCs/>
+                <w:sz w:val="18"/>
+                <w:szCs w:val="19"/>
+              </w:rPr>
+              <w:t>0.07</w:t>
+            </w:r>
+          </w:p>
+        </w:tc>
+        <w:tc>
+          <w:tcPr>
+            <w:tcW w:w="1500" w:type="dxa"/>
+            <w:shd w:val="clear" w:color="auto" w:fill="E8E8E8"/>
+          </w:tcPr>
+          <w:p>
+            <w:r>
+              <w:rPr>
+                <w:b w:val="0"/>
+                <w:bCs/>
+                <w:sz w:val="18"/>
+                <w:szCs w:val="19"/>
+              </w:rPr>
+              <w:t>0.0</w:t>
+            </w:r>
+            <w:proofErr w:type="spellStart"/>
+            <w:proofErr w:type="spellEnd"/>
+          </w:p>
+        </w:tc>
+      </w:tr>
+      <w:tr>
+        <w:tc>
+          <w:tcPr>
+            <w:tcW w:w="2200" w:type="dxa"/>
+            <w:shd w:val="clear" w:color="auto" w:fill="E8E8E8"/>
+          </w:tcPr>
+          <w:p>
+            <w:r>
+              <w:rPr>
+                <w:b w:val="0"/>
+                <w:bCs/>
+                <w:sz w:val="18"/>
+                <w:szCs w:val="19"/>
+              </w:rPr>
+              <w:t>Weighted Skew</w:t>
+            </w:r>
+          </w:p>
+        </w:tc>
+        <w:tc>
+          <w:tcPr>
+            <w:tcW w:w="1900" w:type="dxa"/>
+            <w:shd w:val="clear" w:color="auto" w:fill="E8E8E8"/>
+          </w:tcPr>
+          <w:p>
+            <w:r>
+              <w:rPr>
+                <w:b w:val="0"/>
+                <w:bCs/>
+                <w:sz w:val="18"/>
+                <w:szCs w:val="19"/>
+              </w:rPr>
+              <w:t>-0.135</w:t>
+            </w:r>
+          </w:p>
+        </w:tc>
+        <w:tc>
+          <w:tcPr>
+            <w:tcW w:w="2100" w:type="dxa"/>
+            <w:shd w:val="clear" w:color="auto" w:fill="E8E8E8"/>
+          </w:tcPr>
+          <w:p>
+            <w:r>
+              <w:rPr>
+                <w:b w:val="0"/>
+                <w:bCs/>
+                <w:sz w:val="18"/>
+                <w:szCs w:val="19"/>
+              </w:rPr>
+              <w:t>-0.052</w:t>
+            </w:r>
+            <w:proofErr w:type="spellStart"/>
+            <w:proofErr w:type="spellEnd"/>
+          </w:p>
+        </w:tc>
+        <w:tc>
+          <w:tcPr>
+            <w:tcW w:w="1500" w:type="dxa"/>
+            <w:shd w:val="clear" w:color="auto" w:fill="E8E8E8"/>
+          </w:tcPr>
+          <w:p>
+            <w:r>
+              <w:rPr>
+                <w:b w:val="0"/>
+                <w:bCs/>
+                <w:sz w:val="18"/>
+                <w:szCs w:val="19"/>
+              </w:rPr>
+              <w:t>-0.007</w:t>
+            </w:r>
+          </w:p>
+        </w:tc>
+        <w:tc>
+          <w:tcPr>
+            <w:tcW w:w="1500" w:type="dxa"/>
+            <w:shd w:val="clear" w:color="auto" w:fill="E8E8E8"/>
+          </w:tcPr>
+          <w:p>
+            <w:r>
+              <w:rPr>
+                <w:b w:val="0"/>
+                <w:bCs/>
+                <w:sz w:val="18"/>
+                <w:szCs w:val="19"/>
+              </w:rPr>
+              <w:t>-0.029</w:t>
+            </w:r>
+            <w:proofErr w:type="spellStart"/>
+            <w:proofErr w:type="spellEnd"/>
+          </w:p>
+        </w:tc>
+      </w:tr>
+      <w:tr>
+        <w:tc>
+          <w:tcPr>
+            <w:tcW w:w="2200" w:type="dxa"/>
+            <w:shd w:val="clear" w:color="auto" w:fill="E8E8E8"/>
+          </w:tcPr>
+          <w:p>
+            <w:r>
+              <w:rPr>
+                <w:b w:val="0"/>
+                <w:bCs/>
+                <w:sz w:val="18"/>
+                <w:szCs w:val="19"/>
+              </w:rPr>
+              <w:t>Adopted Skew</w:t>
+            </w:r>
+          </w:p>
+        </w:tc>
+        <w:tc>
+          <w:tcPr>
+            <w:tcW w:w="1900" w:type="dxa"/>
+            <w:shd w:val="clear" w:color="auto" w:fill="E8E8E8"/>
+          </w:tcPr>
+          <w:p>
+            <w:r>
+              <w:rPr>
+                <w:b w:val="0"/>
+                <w:bCs/>
+                <w:sz w:val="18"/>
+                <w:szCs w:val="19"/>
+              </w:rPr>
+              <w:t>-0.135</w:t>
+            </w:r>
+          </w:p>
+        </w:tc>
+        <w:tc>
+          <w:tcPr>
+            <w:tcW w:w="2100" w:type="dxa"/>
+            <w:shd w:val="clear" w:color="auto" w:fill="E8E8E8"/>
+          </w:tcPr>
+          <w:p>
+            <w:r>
+              <w:rPr>
+                <w:b w:val="0"/>
+                <w:bCs/>
+                <w:sz w:val="18"/>
+                <w:szCs w:val="19"/>
+              </w:rPr>
+              <w:t>-0.052</w:t>
+            </w:r>
+            <w:proofErr w:type="spellStart"/>
+            <w:proofErr w:type="spellEnd"/>
+          </w:p>
+        </w:tc>
+        <w:tc>
+          <w:tcPr>
+            <w:tcW w:w="1500" w:type="dxa"/>
+            <w:shd w:val="clear" w:color="auto" w:fill="E8E8E8"/>
+          </w:tcPr>
+          <w:p>
+            <w:r>
+              <w:rPr>
+                <w:b w:val="0"/>
+                <w:bCs/>
+                <w:sz w:val="18"/>
+                <w:szCs w:val="19"/>
+              </w:rPr>
+              <w:t>-0.007</w:t>
+            </w:r>
+          </w:p>
+        </w:tc>
+        <w:tc>
+          <w:tcPr>
+            <w:tcW w:w="1500" w:type="dxa"/>
+            <w:shd w:val="clear" w:color="auto" w:fill="E8E8E8"/>
+          </w:tcPr>
+          <w:p>
+            <w:r>
+              <w:rPr>
+                <w:b w:val="0"/>
+                <w:bCs/>
+                <w:sz w:val="18"/>
+                <w:szCs w:val="19"/>
+              </w:rPr>
+              <w:t>-0.029</w:t>
+            </w:r>
+            <w:proofErr w:type="spellStart"/>
+            <w:proofErr w:type="spellEnd"/>
+          </w:p>
+        </w:tc>
+      </w:tr>
+      <w:tr>
+        <w:tc>
+          <w:tcPr>
+            <w:tcW w:w="2200" w:type="dxa"/>
+            <w:shd w:val="clear" w:color="auto" w:fill="E8E8E8"/>
+          </w:tcPr>
+          <w:p>
+            <w:r>
+              <w:rPr>
+                <w:b w:val="0"/>
+                <w:bCs/>
+                <w:sz w:val="18"/>
+                <w:szCs w:val="19"/>
+              </w:rPr>
+              <w:t>EMA MSE [G at-site]</w:t>
+            </w:r>
+          </w:p>
+        </w:tc>
+        <w:tc>
+          <w:tcPr>
+            <w:tcW w:w="1900" w:type="dxa"/>
+            <w:shd w:val="clear" w:color="auto" w:fill="E8E8E8"/>
+          </w:tcPr>
+          <w:p>
+            <w:r>
+              <w:rPr>
+                <w:b w:val="0"/>
+                <w:bCs/>
+                <w:sz w:val="18"/>
+                <w:szCs w:val="19"/>
+              </w:rPr>
+              <w:t>0.064</w:t>
+            </w:r>
+          </w:p>
+        </w:tc>
+        <w:tc>
+          <w:tcPr>
+            <w:tcW w:w="2100" w:type="dxa"/>
+            <w:shd w:val="clear" w:color="auto" w:fill="E8E8E8"/>
+          </w:tcPr>
+          <w:p>
+            <w:r>
+              <w:rPr>
+                <w:b w:val="0"/>
+                <w:bCs/>
+                <w:sz w:val="18"/>
+                <w:szCs w:val="19"/>
+              </w:rPr>
+              <w:t>0.064</w:t>
+            </w:r>
+            <w:proofErr w:type="spellStart"/>
+            <w:proofErr w:type="spellEnd"/>
+          </w:p>
+        </w:tc>
+        <w:tc>
+          <w:tcPr>
+            <w:tcW w:w="1500" w:type="dxa"/>
+            <w:shd w:val="clear" w:color="auto" w:fill="E8E8E8"/>
+          </w:tcPr>
+          <w:p>
+            <w:r>
+              <w:rPr>
+                <w:b w:val="0"/>
+                <w:bCs/>
+                <w:sz w:val="18"/>
+                <w:szCs w:val="19"/>
+              </w:rPr>
+              <w:t>0.061</w:t>
+            </w:r>
+          </w:p>
+        </w:tc>
+        <w:tc>
+          <w:tcPr>
+            <w:tcW w:w="1500" w:type="dxa"/>
+            <w:shd w:val="clear" w:color="auto" w:fill="E8E8E8"/>
+          </w:tcPr>
+          <w:p>
+            <w:r>
+              <w:rPr>
+                <w:b w:val="0"/>
+                <w:bCs/>
+                <w:sz w:val="18"/>
+                <w:szCs w:val="19"/>
+              </w:rPr>
+              <w:t>0.06</w:t>
+            </w:r>
+            <w:proofErr w:type="spellStart"/>
+            <w:proofErr w:type="spellEnd"/>
+          </w:p>
+        </w:tc>
+      </w:tr>
+      <w:tr>
+        <w:tc>
+          <w:tcPr>
+            <w:tcW w:w="2200" w:type="dxa"/>
+            <w:shd w:val="clear" w:color="auto" w:fill="E8E8E8"/>
+          </w:tcPr>
+          <w:p>
+            <w:r>
+              <w:rPr>
+                <w:b w:val="0"/>
+                <w:bCs/>
+                <w:sz w:val="18"/>
+                <w:szCs w:val="19"/>
+              </w:rPr>
+              <w:t>Grubbs-Beck Critical Value</w:t>
+            </w:r>
+          </w:p>
+        </w:tc>
+        <w:tc>
+          <w:tcPr>
+            <w:tcW w:w="1900" w:type="dxa"/>
+            <w:shd w:val="clear" w:color="auto" w:fill="E8E8E8"/>
+          </w:tcPr>
+          <w:p>
+            <w:r>
+              <w:rPr>
+                <w:b w:val="0"/>
+                <w:bCs/>
+                <w:sz w:val="18"/>
+                <w:szCs w:val="19"/>
+              </w:rPr>
+              <w:t>0.0</w:t>
+            </w:r>
+          </w:p>
+        </w:tc>
+        <w:tc>
+          <w:tcPr>
+            <w:tcW w:w="2100" w:type="dxa"/>
+            <w:shd w:val="clear" w:color="auto" w:fill="E8E8E8"/>
+          </w:tcPr>
+          <w:p>
+            <w:r>
+              <w:rPr>
+                <w:b w:val="0"/>
+                <w:bCs/>
+                <w:sz w:val="18"/>
+                <w:szCs w:val="19"/>
+              </w:rPr>
+              <w:t>0.0</w:t>
+            </w:r>
+            <w:proofErr w:type="spellStart"/>
+            <w:proofErr w:type="spellEnd"/>
+          </w:p>
+        </w:tc>
+        <w:tc>
+          <w:tcPr>
+            <w:tcW w:w="1500" w:type="dxa"/>
+            <w:shd w:val="clear" w:color="auto" w:fill="E8E8E8"/>
+          </w:tcPr>
+          <w:p>
+            <w:r>
+              <w:rPr>
+                <w:b w:val="0"/>
+                <w:bCs/>
+                <w:sz w:val="18"/>
+                <w:szCs w:val="19"/>
+              </w:rPr>
+              <w:t>0.0</w:t>
+            </w:r>
+          </w:p>
+        </w:tc>
+        <w:tc>
+          <w:tcPr>
+            <w:tcW w:w="1500" w:type="dxa"/>
+            <w:shd w:val="clear" w:color="auto" w:fill="E8E8E8"/>
+          </w:tcPr>
+          <w:p>
+            <w:r>
+              <w:rPr>
+                <w:b w:val="0"/>
+                <w:bCs/>
+                <w:sz w:val="18"/>
+                <w:szCs w:val="19"/>
+              </w:rPr>
+              <w:t>0.0</w:t>
+            </w:r>
+            <w:proofErr w:type="spellStart"/>
+            <w:proofErr w:type="spellEnd"/>
+          </w:p>
+        </w:tc>
+      </w:tr>
+      <w:tr>
+        <w:tc>
+          <w:tcPr>
+            <w:tcW w:w="2200" w:type="dxa"/>
+            <w:shd w:val="clear" w:color="auto" w:fill="E8E8E8"/>
+          </w:tcPr>
+          <w:p>
+            <w:r>
+              <w:rPr>
+                <w:b w:val="0"/>
+                <w:bCs/>
+                <w:sz w:val="18"/>
+                <w:szCs w:val="19"/>
+              </w:rPr>
+              <w:t>Equivalent Record Length</w:t>
+            </w:r>
+          </w:p>
+        </w:tc>
+        <w:tc>
+          <w:tcPr>
+            <w:tcW w:w="1900" w:type="dxa"/>
+            <w:shd w:val="clear" w:color="auto" w:fill="E8E8E8"/>
+          </w:tcPr>
+          <w:p>
+            <w:r>
+              <w:rPr>
+                <w:b w:val="0"/>
+                <w:bCs/>
+                <w:sz w:val="18"/>
+                <w:szCs w:val="19"/>
+              </w:rPr>
+              <w:t>100.657</w:t>
+            </w:r>
+          </w:p>
+        </w:tc>
+        <w:tc>
+          <w:tcPr>
+            <w:tcW w:w="2100" w:type="dxa"/>
+            <w:shd w:val="clear" w:color="auto" w:fill="E8E8E8"/>
+          </w:tcPr>
+          <w:p>
+            <w:r>
+              <w:rPr>
+                <w:b w:val="0"/>
+                <w:bCs/>
+                <w:sz w:val="18"/>
+                <w:szCs w:val="19"/>
+              </w:rPr>
+              <w:t>100.369</w:t>
+            </w:r>
+            <w:proofErr w:type="spellStart"/>
+            <w:proofErr w:type="spellEnd"/>
+          </w:p>
+        </w:tc>
+        <w:tc>
+          <w:tcPr>
+            <w:tcW w:w="1500" w:type="dxa"/>
+            <w:shd w:val="clear" w:color="auto" w:fill="E8E8E8"/>
+          </w:tcPr>
+          <w:p>
+            <w:r>
+              <w:rPr>
+                <w:b w:val="0"/>
+                <w:bCs/>
+                <w:sz w:val="18"/>
+                <w:szCs w:val="19"/>
+              </w:rPr>
+              <w:t>105.405</w:t>
+            </w:r>
+          </w:p>
+        </w:tc>
+        <w:tc>
+          <w:tcPr>
+            <w:tcW w:w="1500" w:type="dxa"/>
+            <w:shd w:val="clear" w:color="auto" w:fill="E8E8E8"/>
+          </w:tcPr>
+          <w:p>
+            <w:r>
+              <w:rPr>
+                <w:b w:val="0"/>
+                <w:bCs/>
+                <w:sz w:val="18"/>
+                <w:szCs w:val="19"/>
+              </w:rPr>
+              <w:t>110.932</w:t>
+            </w:r>
+            <w:proofErr w:type="spellStart"/>
+            <w:proofErr w:type="spellEnd"/>
+          </w:p>
+        </w:tc>
+      </w:tr>
+      <w:tr>
+        <w:tc>
+          <w:tcPr>
+            <w:tcW w:w="2200" w:type="dxa"/>
+            <w:shd w:val="clear" w:color="auto" w:fill="E8E8E8"/>
+          </w:tcPr>
+          <w:p>
+            <w:r>
+              <w:rPr>
+                <w:b w:val="0"/>
+                <w:bCs/>
+                <w:sz w:val="18"/>
+                <w:szCs w:val="19"/>
+              </w:rPr>
+              <w:t>Systematic Events</w:t>
+            </w:r>
+          </w:p>
+        </w:tc>
+        <w:tc>
+          <w:tcPr>
+            <w:tcW w:w="1900" w:type="dxa"/>
+            <w:shd w:val="clear" w:color="auto" w:fill="E8E8E8"/>
+          </w:tcPr>
+          <w:p>
+            <w:r>
+              <w:rPr>
+                <w:b w:val="0"/>
+                <w:bCs/>
+                <w:sz w:val="18"/>
+                <w:szCs w:val="19"/>
+              </w:rPr>
+              <w:t>95.0</w:t>
+            </w:r>
+          </w:p>
+        </w:tc>
+        <w:tc>
+          <w:tcPr>
+            <w:tcW w:w="2100" w:type="dxa"/>
+            <w:shd w:val="clear" w:color="auto" w:fill="E8E8E8"/>
+          </w:tcPr>
+          <w:p>
+            <w:r>
+              <w:rPr>
+                <w:b w:val="0"/>
+                <w:bCs/>
+                <w:sz w:val="18"/>
+                <w:szCs w:val="19"/>
+              </w:rPr>
+              <w:t>94.0</w:t>
+            </w:r>
+            <w:proofErr w:type="spellStart"/>
+            <w:proofErr w:type="spellEnd"/>
+          </w:p>
+        </w:tc>
+        <w:tc>
+          <w:tcPr>
+            <w:tcW w:w="1500" w:type="dxa"/>
+            <w:shd w:val="clear" w:color="auto" w:fill="E8E8E8"/>
+          </w:tcPr>
+          <w:p>
+            <w:r>
+              <w:rPr>
+                <w:b w:val="0"/>
+                <w:bCs/>
+                <w:sz w:val="18"/>
+                <w:szCs w:val="19"/>
+              </w:rPr>
+              <w:t>93.0</w:t>
+            </w:r>
+          </w:p>
+        </w:tc>
+        <w:tc>
+          <w:tcPr>
+            <w:tcW w:w="1500" w:type="dxa"/>
+            <w:shd w:val="clear" w:color="auto" w:fill="E8E8E8"/>
+          </w:tcPr>
+          <w:p>
+            <w:r>
+              <w:rPr>
+                <w:b w:val="0"/>
+                <w:bCs/>
+                <w:sz w:val="18"/>
+                <w:szCs w:val="19"/>
+              </w:rPr>
+              <w:t>93.0</w:t>
+            </w:r>
+            <w:proofErr w:type="spellStart"/>
+            <w:proofErr w:type="spellEnd"/>
+          </w:p>
+        </w:tc>
+      </w:tr>
+      <w:tr>
+        <w:tc>
+          <w:tcPr>
+            <w:tcW w:w="2200" w:type="dxa"/>
+            <w:shd w:val="clear" w:color="auto" w:fill="E8E8E8"/>
+          </w:tcPr>
+          <w:p>
+            <w:r>
+              <w:rPr>
+                <w:b w:val="0"/>
+                <w:bCs/>
+                <w:sz w:val="18"/>
+                <w:szCs w:val="19"/>
+              </w:rPr>
+              <w:t>Historic Events</w:t>
+            </w:r>
+          </w:p>
+        </w:tc>
+        <w:tc>
+          <w:tcPr>
+            <w:tcW w:w="1900" w:type="dxa"/>
+            <w:shd w:val="clear" w:color="auto" w:fill="E8E8E8"/>
+          </w:tcPr>
+          <w:p>
+            <w:r>
+              <w:rPr>
+                <w:b w:val="0"/>
+                <w:bCs/>
+                <w:sz w:val="18"/>
+                <w:szCs w:val="19"/>
+              </w:rPr>
+              <w:t>0.0</w:t>
+            </w:r>
+          </w:p>
+        </w:tc>
+        <w:tc>
+          <w:tcPr>
+            <w:tcW w:w="2100" w:type="dxa"/>
+            <w:shd w:val="clear" w:color="auto" w:fill="E8E8E8"/>
+          </w:tcPr>
+          <w:p>
+            <w:r>
+              <w:rPr>
+                <w:b w:val="0"/>
+                <w:bCs/>
+                <w:sz w:val="18"/>
+                <w:szCs w:val="19"/>
+              </w:rPr>
+              <w:t>0.0</w:t>
+            </w:r>
+            <w:proofErr w:type="spellStart"/>
+            <w:proofErr w:type="spellEnd"/>
+          </w:p>
+        </w:tc>
+        <w:tc>
+          <w:tcPr>
+            <w:tcW w:w="1500" w:type="dxa"/>
+            <w:shd w:val="clear" w:color="auto" w:fill="E8E8E8"/>
+          </w:tcPr>
+          <w:p>
+            <w:r>
+              <w:rPr>
+                <w:b w:val="0"/>
+                <w:bCs/>
+                <w:sz w:val="18"/>
+                <w:szCs w:val="19"/>
+              </w:rPr>
+              <w:t>0.0</w:t>
+            </w:r>
+          </w:p>
+        </w:tc>
+        <w:tc>
+          <w:tcPr>
+            <w:tcW w:w="1500" w:type="dxa"/>
+            <w:shd w:val="clear" w:color="auto" w:fill="E8E8E8"/>
+          </w:tcPr>
+          <w:p>
+            <w:r>
+              <w:rPr>
+                <w:b w:val="0"/>
+                <w:bCs/>
+                <w:sz w:val="18"/>
+                <w:szCs w:val="19"/>
+              </w:rPr>
+              <w:t>0.0</w:t>
+            </w:r>
+            <w:proofErr w:type="spellStart"/>
+            <w:proofErr w:type="spellEnd"/>
+          </w:p>
+        </w:tc>
+      </w:tr>
+      <w:tr>
+        <w:tc>
+          <w:tcPr>
+            <w:tcW w:w="2200" w:type="dxa"/>
+            <w:shd w:val="clear" w:color="auto" w:fill="E8E8E8"/>
+          </w:tcPr>
+          <w:p>
+            <w:r>
+              <w:rPr>
+                <w:b w:val="0"/>
+                <w:bCs/>
+                <w:sz w:val="18"/>
+                <w:szCs w:val="19"/>
+              </w:rPr>
+              <w:t>High Outliers</w:t>
+            </w:r>
+          </w:p>
+        </w:tc>
+        <w:tc>
+          <w:tcPr>
+            <w:tcW w:w="1900" w:type="dxa"/>
+            <w:shd w:val="clear" w:color="auto" w:fill="E8E8E8"/>
+          </w:tcPr>
+          <w:p>
+            <w:r>
+              <w:rPr>
+                <w:b w:val="0"/>
+                <w:bCs/>
+                <w:sz w:val="18"/>
+                <w:szCs w:val="19"/>
+              </w:rPr>
+              <w:t>0.0</w:t>
+            </w:r>
+          </w:p>
+        </w:tc>
+        <w:tc>
+          <w:tcPr>
+            <w:tcW w:w="2100" w:type="dxa"/>
+            <w:shd w:val="clear" w:color="auto" w:fill="E8E8E8"/>
+          </w:tcPr>
+          <w:p>
+            <w:r>
+              <w:rPr>
+                <w:b w:val="0"/>
+                <w:bCs/>
+                <w:sz w:val="18"/>
+                <w:szCs w:val="19"/>
+              </w:rPr>
+              <w:t>0.0</w:t>
+            </w:r>
+            <w:proofErr w:type="spellStart"/>
+            <w:proofErr w:type="spellEnd"/>
+          </w:p>
+        </w:tc>
+        <w:tc>
+          <w:tcPr>
+            <w:tcW w:w="1500" w:type="dxa"/>
+            <w:shd w:val="clear" w:color="auto" w:fill="E8E8E8"/>
+          </w:tcPr>
+          <w:p>
+            <w:r>
+              <w:rPr>
+                <w:b w:val="0"/>
+                <w:bCs/>
+                <w:sz w:val="18"/>
+                <w:szCs w:val="19"/>
+              </w:rPr>
+              <w:t>0.0</w:t>
+            </w:r>
+          </w:p>
+        </w:tc>
+        <w:tc>
+          <w:tcPr>
+            <w:tcW w:w="1500" w:type="dxa"/>
+            <w:shd w:val="clear" w:color="auto" w:fill="E8E8E8"/>
+          </w:tcPr>
+          <w:p>
+            <w:r>
+              <w:rPr>
+                <w:b w:val="0"/>
+                <w:bCs/>
+                <w:sz w:val="18"/>
+                <w:szCs w:val="19"/>
+              </w:rPr>
+              <w:t>0.0</w:t>
+            </w:r>
+            <w:proofErr w:type="spellStart"/>
+            <w:proofErr w:type="spellEnd"/>
+          </w:p>
+        </w:tc>
+      </w:tr>
+      <w:tr>
+        <w:tc>
+          <w:tcPr>
+            <w:tcW w:w="2200" w:type="dxa"/>
+            <w:shd w:val="clear" w:color="auto" w:fill="E8E8E8"/>
+          </w:tcPr>
+          <w:p>
+            <w:r>
+              <w:rPr>
+                <w:b w:val="0"/>
+                <w:bCs/>
+                <w:sz w:val="18"/>
+                <w:szCs w:val="19"/>
+              </w:rPr>
+              <w:t>Low Outliers</w:t>
+            </w:r>
+          </w:p>
+        </w:tc>
+        <w:tc>
+          <w:tcPr>
+            <w:tcW w:w="1900" w:type="dxa"/>
+            <w:shd w:val="clear" w:color="auto" w:fill="E8E8E8"/>
+          </w:tcPr>
+          <w:p>
+            <w:r>
+              <w:rPr>
+                <w:b w:val="0"/>
+                <w:bCs/>
+                <w:sz w:val="18"/>
+                <w:szCs w:val="19"/>
+              </w:rPr>
+              <w:t>0.0</w:t>
+            </w:r>
+          </w:p>
+        </w:tc>
+        <w:tc>
+          <w:tcPr>
+            <w:tcW w:w="2100" w:type="dxa"/>
+            <w:shd w:val="clear" w:color="auto" w:fill="E8E8E8"/>
+          </w:tcPr>
+          <w:p>
+            <w:r>
+              <w:rPr>
+                <w:b w:val="0"/>
+                <w:bCs/>
+                <w:sz w:val="18"/>
+                <w:szCs w:val="19"/>
+              </w:rPr>
+              <w:t>0.0</w:t>
+            </w:r>
+            <w:proofErr w:type="spellStart"/>
+            <w:proofErr w:type="spellEnd"/>
+          </w:p>
+        </w:tc>
+        <w:tc>
+          <w:tcPr>
+            <w:tcW w:w="1500" w:type="dxa"/>
+            <w:shd w:val="clear" w:color="auto" w:fill="E8E8E8"/>
+          </w:tcPr>
+          <w:p>
+            <w:r>
+              <w:rPr>
+                <w:b w:val="0"/>
+                <w:bCs/>
+                <w:sz w:val="18"/>
+                <w:szCs w:val="19"/>
+              </w:rPr>
+              <w:t>0.0</w:t>
+            </w:r>
+          </w:p>
+        </w:tc>
+        <w:tc>
+          <w:tcPr>
+            <w:tcW w:w="1500" w:type="dxa"/>
+            <w:shd w:val="clear" w:color="auto" w:fill="E8E8E8"/>
+          </w:tcPr>
+          <w:p>
+            <w:r>
+              <w:rPr>
+                <w:b w:val="0"/>
+                <w:bCs/>
+                <w:sz w:val="18"/>
+                <w:szCs w:val="19"/>
+              </w:rPr>
+              <w:t>0.0</w:t>
+            </w:r>
+            <w:proofErr w:type="spellStart"/>
+            <w:proofErr w:type="spellEnd"/>
+          </w:p>
+        </w:tc>
+      </w:tr>
+      <w:tr>
+        <w:tc>
+          <w:tcPr>
+            <w:tcW w:w="2200" w:type="dxa"/>
+            <w:shd w:val="clear" w:color="auto" w:fill="E8E8E8"/>
+          </w:tcPr>
+          <w:p>
+            <w:r>
+              <w:rPr>
+                <w:b w:val="0"/>
+                <w:bCs/>
+                <w:sz w:val="18"/>
+                <w:szCs w:val="19"/>
+              </w:rPr>
+              <w:t>Zero Events</w:t>
+            </w:r>
+          </w:p>
+        </w:tc>
+        <w:tc>
+          <w:tcPr>
+            <w:tcW w:w="1900" w:type="dxa"/>
+            <w:shd w:val="clear" w:color="auto" w:fill="E8E8E8"/>
+          </w:tcPr>
+          <w:p>
+            <w:r>
+              <w:rPr>
+                <w:b w:val="0"/>
+                <w:bCs/>
+                <w:sz w:val="18"/>
+                <w:szCs w:val="19"/>
+              </w:rPr>
+              <w:t>0.0</w:t>
+            </w:r>
+          </w:p>
+        </w:tc>
+        <w:tc>
+          <w:tcPr>
+            <w:tcW w:w="2100" w:type="dxa"/>
+            <w:shd w:val="clear" w:color="auto" w:fill="E8E8E8"/>
+          </w:tcPr>
+          <w:p>
+            <w:r>
+              <w:rPr>
+                <w:b w:val="0"/>
+                <w:bCs/>
+                <w:sz w:val="18"/>
+                <w:szCs w:val="19"/>
+              </w:rPr>
+              <w:t>0.0</w:t>
+            </w:r>
+            <w:proofErr w:type="spellStart"/>
+            <w:proofErr w:type="spellEnd"/>
+          </w:p>
+        </w:tc>
+        <w:tc>
+          <w:tcPr>
+            <w:tcW w:w="1500" w:type="dxa"/>
+            <w:shd w:val="clear" w:color="auto" w:fill="E8E8E8"/>
+          </w:tcPr>
+          <w:p>
+            <w:r>
+              <w:rPr>
+                <w:b w:val="0"/>
+                <w:bCs/>
+                <w:sz w:val="18"/>
+                <w:szCs w:val="19"/>
+              </w:rPr>
+              <w:t>0.0</w:t>
+            </w:r>
+          </w:p>
+        </w:tc>
+        <w:tc>
+          <w:tcPr>
+            <w:tcW w:w="1500" w:type="dxa"/>
+            <w:shd w:val="clear" w:color="auto" w:fill="E8E8E8"/>
+          </w:tcPr>
+          <w:p>
+            <w:r>
+              <w:rPr>
+                <w:b w:val="0"/>
+                <w:bCs/>
+                <w:sz w:val="18"/>
+                <w:szCs w:val="19"/>
+              </w:rPr>
+              <w:t>0.0</w:t>
+            </w:r>
+            <w:proofErr w:type="spellStart"/>
+            <w:proofErr w:type="spellEnd"/>
+          </w:p>
+        </w:tc>
+      </w:tr>
+      <w:tr>
+        <w:tc>
+          <w:tcPr>
+            <w:tcW w:w="2200" w:type="dxa"/>
+            <w:shd w:val="clear" w:color="auto" w:fill="E8E8E8"/>
+          </w:tcPr>
+          <w:p>
+            <w:r>
+              <w:rPr>
+                <w:b w:val="0"/>
+                <w:bCs/>
+                <w:sz w:val="18"/>
+                <w:szCs w:val="19"/>
+              </w:rPr>
+              <w:t>Missing Events</w:t>
+            </w:r>
+          </w:p>
+        </w:tc>
+        <w:tc>
+          <w:tcPr>
+            <w:tcW w:w="1900" w:type="dxa"/>
+            <w:shd w:val="clear" w:color="auto" w:fill="E8E8E8"/>
+          </w:tcPr>
+          <w:p>
+            <w:r>
+              <w:rPr>
+                <w:b w:val="0"/>
+                <w:bCs/>
+                <w:sz w:val="18"/>
+                <w:szCs w:val="19"/>
+              </w:rPr>
+              <w:t>5.0</w:t>
+            </w:r>
+          </w:p>
+        </w:tc>
+        <w:tc>
+          <w:tcPr>
+            <w:tcW w:w="2100" w:type="dxa"/>
+            <w:shd w:val="clear" w:color="auto" w:fill="E8E8E8"/>
+          </w:tcPr>
+          <w:p>
+            <w:r>
+              <w:rPr>
+                <w:b w:val="0"/>
+                <w:bCs/>
+                <w:sz w:val="18"/>
+                <w:szCs w:val="19"/>
+              </w:rPr>
+              <w:t>5.0</w:t>
+            </w:r>
+            <w:proofErr w:type="spellStart"/>
+            <w:proofErr w:type="spellEnd"/>
+          </w:p>
+        </w:tc>
+        <w:tc>
+          <w:tcPr>
+            <w:tcW w:w="1500" w:type="dxa"/>
+            <w:shd w:val="clear" w:color="auto" w:fill="E8E8E8"/>
+          </w:tcPr>
+          <w:p>
+            <w:r>
+              <w:rPr>
+                <w:b w:val="0"/>
+                <w:bCs/>
+                <w:sz w:val="18"/>
+                <w:szCs w:val="19"/>
+              </w:rPr>
+              <w:t>5.0</w:t>
+            </w:r>
+          </w:p>
+        </w:tc>
+        <w:tc>
+          <w:tcPr>
+            <w:tcW w:w="1500" w:type="dxa"/>
+            <w:shd w:val="clear" w:color="auto" w:fill="E8E8E8"/>
+          </w:tcPr>
+          <w:p>
+            <w:r>
+              <w:rPr>
+                <w:b w:val="0"/>
+                <w:bCs/>
+                <w:sz w:val="18"/>
+                <w:szCs w:val="19"/>
+              </w:rPr>
+              <w:t>5.0</w:t>
+            </w:r>
+            <w:proofErr w:type="spellStart"/>
+            <w:proofErr w:type="spellEnd"/>
+          </w:p>
+        </w:tc>
+      </w:tr>
+      <w:tr>
+        <w:tc>
+          <w:tcPr>
+            <w:tcW w:w="2200" w:type="dxa"/>
+            <w:shd w:val="clear" w:color="auto" w:fill="E8E8E8"/>
+          </w:tcPr>
+          <w:p>
+            <w:r>
+              <w:rPr>
+                <w:b w:val="0"/>
+                <w:bCs/>
+                <w:sz w:val="18"/>
+                <w:szCs w:val="19"/>
+              </w:rPr>
+              <w:t>Historic Period</w:t>
+            </w:r>
+          </w:p>
+        </w:tc>
+        <w:tc>
+          <w:tcPr>
+            <w:tcW w:w="1900" w:type="dxa"/>
+            <w:shd w:val="clear" w:color="auto" w:fill="E8E8E8"/>
+          </w:tcPr>
+          <w:p>
+            <w:r>
+              <w:rPr>
+                <w:b w:val="0"/>
+                <w:bCs/>
+                <w:sz w:val="18"/>
+                <w:szCs w:val="19"/>
+              </w:rPr>
+              <w:t>100.0</w:t>
+            </w:r>
+          </w:p>
+        </w:tc>
+        <w:tc>
+          <w:tcPr>
+            <w:tcW w:w="2100" w:type="dxa"/>
+            <w:shd w:val="clear" w:color="auto" w:fill="E8E8E8"/>
+          </w:tcPr>
+          <w:p>
+            <w:r>
+              <w:rPr>
+                <w:b w:val="0"/>
+                <w:bCs/>
+                <w:sz w:val="18"/>
+                <w:szCs w:val="19"/>
+              </w:rPr>
+              <w:t>99.0</w:t>
+            </w:r>
+            <w:proofErr w:type="spellStart"/>
+            <w:proofErr w:type="spellEnd"/>
+          </w:p>
+        </w:tc>
+        <w:tc>
+          <w:tcPr>
+            <w:tcW w:w="1500" w:type="dxa"/>
+            <w:shd w:val="clear" w:color="auto" w:fill="E8E8E8"/>
+          </w:tcPr>
+          <w:p>
+            <w:r>
+              <w:rPr>
+                <w:b w:val="0"/>
+                <w:bCs/>
+                <w:sz w:val="18"/>
+                <w:szCs w:val="19"/>
+              </w:rPr>
+              <w:t>98.0</w:t>
+            </w:r>
+          </w:p>
+        </w:tc>
+        <w:tc>
+          <w:tcPr>
+            <w:tcW w:w="1500" w:type="dxa"/>
+            <w:shd w:val="clear" w:color="auto" w:fill="E8E8E8"/>
+          </w:tcPr>
+          <w:p>
+            <w:r>
+              <w:rPr>
+                <w:b w:val="0"/>
+                <w:bCs/>
+                <w:sz w:val="18"/>
+                <w:szCs w:val="19"/>
+              </w:rPr>
+              <w:t>98.0</w:t>
+            </w:r>
+            <w:proofErr w:type="spellStart"/>
+            <w:proofErr w:type="spellEnd"/>
+          </w:p>
+        </w:tc>
+      </w:tr>
+    </w:tbl>
     <w:p>
       <w:pPr>
+        <w:spacing w:after="200"/>
+        <w:jc w:val="center"/>
         <w:rPr>
           <w:sz w:val="22"/>
         </w:rPr>
       </w:pPr>
+      <w:r>
+        <w:rPr>
+          <w:i/>
+          <w:sz w:val="18"/>
+        </w:rPr>
+        <w:t>Table 10-1. Distribution parameters and event counts, adopted SSP analyses.</w:t>
+      </w:r>
     </w:p>
     <w:p>
       <w:pPr>
@@ -27886,6 +29621,29 @@
         <w:spacing w:after="120" w:line="276" w:lineRule="auto"/>
       </w:pPr>
     </w:p>
+    <w:p>
+      <w:pPr>
+        <w:pStyle w:val="Heading1"/>
+      </w:pPr>
+      <w:r>
+        <w:t>Appendix B. Frequency Curve Ordinates</w:t>
+      </w:r>
+    </w:p>
+    <w:p>
+      <w:pPr>
+        <w:spacing w:after="160"/>
+        <w:rPr>
+          <w:sz w:val="22"/>
+        </w:rPr>
+      </w:pPr>
+      <w:r>
+        <w:rPr>
+          <w:i w:val="0"/>
+          <w:sz w:val="20"/>
+        </w:rPr>
+        <w:t>Computed curve, expected probability curve, EMA variance of the log and 5%/95% confidence limits for every ordinate reported by SSP, all four durations. UpperConf is SSP's 0.05 limit and LowerConf its 0.95 limit.</w:t>
+      </w:r>
+    </w:p>
     <w:tbl>
       <w:tblPr>
         <w:tblW w:w="7888" w:type="dxa"/>
@@ -45850,6 +47608,281 @@
       <w:pPr>
         <w:spacing w:after="120" w:line="276" w:lineRule="auto"/>
       </w:pPr>
+    </w:p>
+    <w:p>
+      <w:pPr>
+        <w:pStyle w:val="Heading1"/>
+      </w:pPr>
+      <w:r>
+        <w:t>Appendix C. Frequency Curves by Duration</w:t>
+      </w:r>
+    </w:p>
+    <w:p>
+      <w:pPr>
+        <w:spacing w:after="200"/>
+        <w:rPr>
+          <w:sz w:val="22"/>
+        </w:rPr>
+      </w:pPr>
+      <w:r>
+        <w:rPr>
+          <w:i w:val="0"/>
+          <w:sz w:val="20"/>
+        </w:rPr>
+        <w:t>Individual frequency curves as produced by HEC-SSP: computed curve, expected probability curve, 5% and 95% confidence limits, and observed events at Hirsch-Stedinger plotting positions. The peak figure reflects the censored analysis described in Section 10.</w:t>
+      </w:r>
+    </w:p>
+    <w:p>
+      <w:pPr>
+        <w:spacing w:after="40"/>
+        <w:jc w:val="center"/>
+        <w:rPr>
+          <w:sz w:val="22"/>
+        </w:rPr>
+      </w:pPr>
+      <w:r>
+        <w:rPr>
+          <w:i w:val="0"/>
+          <w:sz w:val="22"/>
+        </w:rPr>
+        <w:drawing>
+          <wp:inline xmlns:a="http://schemas.openxmlformats.org/drawingml/2006/main" xmlns:pic="http://schemas.openxmlformats.org/drawingml/2006/picture">
+            <wp:extent cx="5852160" cy="4551680"/>
+            <wp:docPr id="3" name="Picture 3"/>
+            <wp:cNvGraphicFramePr>
+              <a:graphicFrameLocks noChangeAspect="1"/>
+            </wp:cNvGraphicFramePr>
+            <a:graphic>
+              <a:graphicData uri="http://schemas.openxmlformats.org/drawingml/2006/picture">
+                <pic:pic>
+                  <pic:nvPicPr>
+                    <pic:cNvPr id="0" name="CAS_Unreg_freq_Peak.png"/>
+                    <pic:cNvPicPr/>
+                  </pic:nvPicPr>
+                  <pic:blipFill>
+                    <a:blip r:embed="rId9"/>
+                    <a:stretch>
+                      <a:fillRect/>
+                    </a:stretch>
+                  </pic:blipFill>
+                  <pic:spPr>
+                    <a:xfrm>
+                      <a:off x="0" y="0"/>
+                      <a:ext cx="5852160" cy="4551680"/>
+                    </a:xfrm>
+                    <a:prstGeom prst="rect"/>
+                  </pic:spPr>
+                </pic:pic>
+              </a:graphicData>
+            </a:graphic>
+          </wp:inline>
+        </w:drawing>
+      </w:r>
+    </w:p>
+    <w:p>
+      <w:pPr>
+        <w:spacing w:after="280"/>
+        <w:jc w:val="center"/>
+        <w:rPr>
+          <w:sz w:val="22"/>
+        </w:rPr>
+      </w:pPr>
+      <w:r>
+        <w:rPr>
+          <w:i/>
+          <w:sz w:val="18"/>
+        </w:rPr>
+        <w:t>Figure C-1. Unregulated Peak frequency curve.</w:t>
+      </w:r>
+    </w:p>
+    <w:p>
+      <w:pPr>
+        <w:spacing w:after="40"/>
+        <w:jc w:val="center"/>
+        <w:rPr>
+          <w:sz w:val="22"/>
+        </w:rPr>
+      </w:pPr>
+      <w:r>
+        <w:rPr>
+          <w:i w:val="0"/>
+          <w:sz w:val="22"/>
+        </w:rPr>
+        <w:drawing>
+          <wp:inline xmlns:a="http://schemas.openxmlformats.org/drawingml/2006/main" xmlns:pic="http://schemas.openxmlformats.org/drawingml/2006/picture">
+            <wp:extent cx="5852160" cy="4551680"/>
+            <wp:docPr id="4" name="Picture 4"/>
+            <wp:cNvGraphicFramePr>
+              <a:graphicFrameLocks noChangeAspect="1"/>
+            </wp:cNvGraphicFramePr>
+            <a:graphic>
+              <a:graphicData uri="http://schemas.openxmlformats.org/drawingml/2006/picture">
+                <pic:pic>
+                  <pic:nvPicPr>
+                    <pic:cNvPr id="0" name="CAS_Unreg_freq_1-Day.png"/>
+                    <pic:cNvPicPr/>
+                  </pic:nvPicPr>
+                  <pic:blipFill>
+                    <a:blip r:embed="rId10"/>
+                    <a:stretch>
+                      <a:fillRect/>
+                    </a:stretch>
+                  </pic:blipFill>
+                  <pic:spPr>
+                    <a:xfrm>
+                      <a:off x="0" y="0"/>
+                      <a:ext cx="5852160" cy="4551680"/>
+                    </a:xfrm>
+                    <a:prstGeom prst="rect"/>
+                  </pic:spPr>
+                </pic:pic>
+              </a:graphicData>
+            </a:graphic>
+          </wp:inline>
+        </w:drawing>
+      </w:r>
+    </w:p>
+    <w:p>
+      <w:pPr>
+        <w:spacing w:after="280"/>
+        <w:jc w:val="center"/>
+        <w:rPr>
+          <w:sz w:val="22"/>
+        </w:rPr>
+      </w:pPr>
+      <w:r>
+        <w:rPr>
+          <w:i/>
+          <w:sz w:val="18"/>
+        </w:rPr>
+        <w:t>Figure C-2. Unregulated 1-Day frequency curve.</w:t>
+      </w:r>
+    </w:p>
+    <w:p>
+      <w:pPr>
+        <w:spacing w:after="40"/>
+        <w:jc w:val="center"/>
+        <w:rPr>
+          <w:sz w:val="22"/>
+        </w:rPr>
+      </w:pPr>
+      <w:r>
+        <w:rPr>
+          <w:i w:val="0"/>
+          <w:sz w:val="22"/>
+        </w:rPr>
+        <w:drawing>
+          <wp:inline xmlns:a="http://schemas.openxmlformats.org/drawingml/2006/main" xmlns:pic="http://schemas.openxmlformats.org/drawingml/2006/picture">
+            <wp:extent cx="5852160" cy="4551680"/>
+            <wp:docPr id="5" name="Picture 5"/>
+            <wp:cNvGraphicFramePr>
+              <a:graphicFrameLocks noChangeAspect="1"/>
+            </wp:cNvGraphicFramePr>
+            <a:graphic>
+              <a:graphicData uri="http://schemas.openxmlformats.org/drawingml/2006/picture">
+                <pic:pic>
+                  <pic:nvPicPr>
+                    <pic:cNvPr id="0" name="CAS_Unreg_freq_3-Day.png"/>
+                    <pic:cNvPicPr/>
+                  </pic:nvPicPr>
+                  <pic:blipFill>
+                    <a:blip r:embed="rId11"/>
+                    <a:stretch>
+                      <a:fillRect/>
+                    </a:stretch>
+                  </pic:blipFill>
+                  <pic:spPr>
+                    <a:xfrm>
+                      <a:off x="0" y="0"/>
+                      <a:ext cx="5852160" cy="4551680"/>
+                    </a:xfrm>
+                    <a:prstGeom prst="rect"/>
+                  </pic:spPr>
+                </pic:pic>
+              </a:graphicData>
+            </a:graphic>
+          </wp:inline>
+        </w:drawing>
+      </w:r>
+    </w:p>
+    <w:p>
+      <w:pPr>
+        <w:spacing w:after="280"/>
+        <w:jc w:val="center"/>
+        <w:rPr>
+          <w:sz w:val="22"/>
+        </w:rPr>
+      </w:pPr>
+      <w:r>
+        <w:rPr>
+          <w:i/>
+          <w:sz w:val="18"/>
+        </w:rPr>
+        <w:t>Figure C-3. Unregulated 3-Day frequency curve.</w:t>
+      </w:r>
+    </w:p>
+    <w:p>
+      <w:pPr>
+        <w:spacing w:after="40"/>
+        <w:jc w:val="center"/>
+        <w:rPr>
+          <w:sz w:val="22"/>
+        </w:rPr>
+      </w:pPr>
+      <w:r>
+        <w:rPr>
+          <w:i w:val="0"/>
+          <w:sz w:val="22"/>
+        </w:rPr>
+        <w:drawing>
+          <wp:inline xmlns:a="http://schemas.openxmlformats.org/drawingml/2006/main" xmlns:pic="http://schemas.openxmlformats.org/drawingml/2006/picture">
+            <wp:extent cx="5852160" cy="4551680"/>
+            <wp:docPr id="6" name="Picture 6"/>
+            <wp:cNvGraphicFramePr>
+              <a:graphicFrameLocks noChangeAspect="1"/>
+            </wp:cNvGraphicFramePr>
+            <a:graphic>
+              <a:graphicData uri="http://schemas.openxmlformats.org/drawingml/2006/picture">
+                <pic:pic>
+                  <pic:nvPicPr>
+                    <pic:cNvPr id="0" name="CAS_Unreg_freq_5-Day.png"/>
+                    <pic:cNvPicPr/>
+                  </pic:nvPicPr>
+                  <pic:blipFill>
+                    <a:blip r:embed="rId12"/>
+                    <a:stretch>
+                      <a:fillRect/>
+                    </a:stretch>
+                  </pic:blipFill>
+                  <pic:spPr>
+                    <a:xfrm>
+                      <a:off x="0" y="0"/>
+                      <a:ext cx="5852160" cy="4551680"/>
+                    </a:xfrm>
+                    <a:prstGeom prst="rect"/>
+                  </pic:spPr>
+                </pic:pic>
+              </a:graphicData>
+            </a:graphic>
+          </wp:inline>
+        </w:drawing>
+      </w:r>
+    </w:p>
+    <w:p>
+      <w:pPr>
+        <w:spacing w:after="280"/>
+        <w:jc w:val="center"/>
+        <w:rPr>
+          <w:sz w:val="22"/>
+        </w:rPr>
+      </w:pPr>
+      <w:r>
+        <w:rPr>
+          <w:i/>
+          <w:sz w:val="18"/>
+        </w:rPr>
+        <w:t>Figure C-4. Unregulated 5-Day frequency curve.</w:t>
+      </w:r>
     </w:p>
     <w:sectPr>
       <w:pgSz w:w="12240" w:h="15840"/>

</xml_diff>

<commit_message>
Minor CAS_UNREG Memo Edits
</commit_message>
<xml_diff>
--- a/CAS_Unreg_FF/docs/MEMO_CAS_Unreg_FF.docx
+++ b/CAS_Unreg_FF/docs/MEMO_CAS_Unreg_FF.docx
@@ -1152,7 +1152,7 @@
           <w:sz w:val="22"/>
           <w:szCs w:val="22"/>
         </w:rPr>
-        <w:t>Daily unregulated flow = observed Castle Rock daily flow + daily change in MOS storage (daily elevation record, 2014 rating). Travel time Mayfield-to-Castle-Rock is under one day, so no routing is applied at daily resolution; Mayfield re-regulation storage is neglected (small relative to Mossyrock, largely canceling out over 1-day-and-longer windows). Rolling 1/3/5-day maxima are computed on a full daily grid, so an N-day value always represents N consecutive recorded days. The Castle Rock daily record is winter-only through much of the 1980s and 1990s but is presumed to have covered the peak. The one-day mass-balance values also serve as the One_day source for years without hourly data (30 water years). Where available (WY1976–1979), results were cross-validated against Table B-I of the 2009 Hydrology Restudy report.</w:t>
+        <w:t>Daily unregulated flow = observed Castle Rock daily flow + daily change in MOS storage (daily elevation record, 2014 rating). Travel time Mayfield-to-Castle-Rock is under one day, so no routing is applied at daily resolution; Mayfield re-regulation storage is neglected (small relative to Mossyrock, largely canceling out over 1-day-and-longer windows). Rolling 1/3/5-day maxima are computed on a full daily grid, so an N-day value always represents N consecutive recorded days. The Castle Rock daily record is winter-only through much of the 1980s and 1990s but is presumed to have covered the peak. The one-day mass-balance values also serve as the One_day source for years without hourly data (30 water years).</w:t>
       </w:r>
     </w:p>
     <w:p>
@@ -1594,7 +1594,7 @@
           <w:sz w:val="22"/>
           <w:szCs w:val="22"/>
         </w:rPr>
-        <w:t xml:space="preserve"> (the daily record begins later), and WY2026 lacks 3- and 5-day values because the water year is still in progress.</w:t>
+        <w:t xml:space="preserve"> (the daily record begins later)</w:t>
       </w:r>
     </w:p>
     <w:p>
@@ -1620,7 +1620,7 @@
         <w:rPr>
           <w:sz w:val="22"/>
         </w:rPr>
-        <w:t>Because each duration is the annual maximum of its own averaging window, searched independently over the water year, the four series can be drawn from different events and are not guaranteed to decrease with duration. Every ordering violation is logged before adjustment (diagnostics/record_qa_flags.csv; 15 in this record). Fourteen involve two different sources — most often a regression-estimated peak sitting below the daily-average 1-day value — and one, WY2014, is internal to the daily series: a double-peaked March event whose 5-day window spans both peaks while no 3-day window can. The record is then made monotonic working backwards from the 5-day value: the 5-day is the anchor, and each shorter duration is raised to the longer one where the longer is higher, cascading upward. Ten values across nine water years were raised (diagnostics/record_monotonic_adjustments.csv); pre-adjustment values are retained in the record's *_Raw columns. Eight of the ten are regression-estimated peaks lifted to their 1-day value — a physical floor, since a 1-day average cannot exceed the instantaneous peak — with WY2001 (+64%), WY1985 (+19%) and WY2006 (+19%) the largest. Those years' peaks should be read as lower bounds rather than estimates.</w:t>
+        <w:t xml:space="preserve">Because each duration is the annual maximum of its own averaging window, searched independently over the water year, the four series can be drawn from different events and are not guaranteed to decrease with duration. Every ordering violation is logged before adjustment (diagnostics/record_qa_flags.csv; 15 in this record). Fourteen involve two different sources — most often a regression-estimated peak sitting below the daily-average 1-day value — and one, WY2014, is internal to the daily series: a double-peaked March event whose 5-day window spans both peaks while no 3-day window can. The record is then made monotonic working backwards from the 5-day value: the 5-day is the anchor, and each shorter duration is raised to the longer one where the longer is higher, cascading upward. Ten values across nine water years were raised (diagnostics/record_monotonic_adjustments.csv); pre-adjustment values are retained in the record's *_Raw columns. Eight of the ten are regression-estimated peaks lifted to their 1-day value — a physical floor, since a 1-day average cannot exceed the instantaneous peak — with WY2001 (+64%), WY1985 (+19%) and WY2006 (+19%) the largest. </w:t>
       </w:r>
     </w:p>
     <w:p>
@@ -1671,10 +1671,21 @@
       </w:pPr>
       <w:r>
         <w:rPr>
-          <w:i w:val="0"/>
           <w:sz w:val="22"/>
         </w:rPr>
-        <w:t>The assembled record was analyzed in HEC-SSP using the Bulletin 17C expected moments algorithm (EMA), one analysis per duration: CAS_2026_p_Sensor_1969_1973 for the instantaneous peak and CAS_2026_1, CAS_2026_3 and CAS_2026_5 for the 1-, 3- and 5-day durations. All four fit a log-Pearson Type III distribution to the unregulated record described in Sections 3 through 9, with the station skew weighted against a regional value.</w:t>
+        <w:t>The assembled record was analyzed in HEC-SSP using the Bulletin 17C expected moments algorithm (EMA), one analysis per duration: CAS_2026_pfor the instantaneous peak and CAS_2026_1, CAS_2026_3</w:t>
+      </w:r>
+      <w:r>
+        <w:rPr>
+          <w:sz w:val="22"/>
+        </w:rPr>
+        <w:t>,</w:t>
+      </w:r>
+      <w:r>
+        <w:rPr>
+          <w:sz w:val="22"/>
+        </w:rPr>
+        <w:t xml:space="preserve"> and CAS_2026_5 for the 1-, 3- and 5-day durations. All four fit a log-Pearson Type III distribution to the unregulated record described in Sections 3 through 9, with the station skew weighted against a regional value.</w:t>
       </w:r>
     </w:p>
     <w:p>
@@ -1686,9 +1697,9 @@
       </w:pPr>
       <w:r>
         <w:rPr>
-          <w:i w:val="0"/>
           <w:sz w:val="22"/>
         </w:rPr>
+        <w:lastRenderedPageBreak/>
         <w:t>WY1969–1973 are censored in the peak analysis. Those five water years have observed regulated peaks but no basis for an unregulated estimate: the daily Mossyrock elevation record begins in October 1973, so no storage-change predictor exists, and there is no hourly record from which to compute a holdout. Rather than omit them, which would discard the knowledge that no extreme unregulated flood occurred in those years, or assign point estimates the data do not support, they are entered as censored intervals. EMA then uses that constraint without asserting a value. The peak analysis accordingly reports 95 systematic events within a 100-year historic period, with five events flagged as missing.</w:t>
       </w:r>
     </w:p>
@@ -1701,10 +1712,45 @@
       </w:pPr>
       <w:r>
         <w:rPr>
-          <w:i w:val="0"/>
           <w:sz w:val="22"/>
         </w:rPr>
-        <w:t>No low-outlier test was applied. The multiple Grubbs-Beck procedure was turned off in all four analyses, so the Grubbs-Beck critical value is zero and no potentially influential low floods were censored. The record contains no zero or near-zero annual maxima, and because the unregulated series is constructed rather than gaged, its small years carry the same provenance as its large ones; there is no physical basis for treating the lower tail as unrepresentative.</w:t>
+        <w:t>No low</w:t>
+      </w:r>
+      <w:r>
+        <w:rPr>
+          <w:sz w:val="22"/>
+        </w:rPr>
+        <w:t>-flow outliers</w:t>
+      </w:r>
+      <w:r>
+        <w:rPr>
+          <w:sz w:val="22"/>
+        </w:rPr>
+        <w:t xml:space="preserve"> </w:t>
+      </w:r>
+      <w:r>
+        <w:rPr>
+          <w:sz w:val="22"/>
+        </w:rPr>
+        <w:t>were identified by the</w:t>
+      </w:r>
+      <w:r>
+        <w:rPr>
+          <w:sz w:val="22"/>
+        </w:rPr>
+        <w:t xml:space="preserve"> multiple Grubbs-Beck procedure</w:t>
+      </w:r>
+      <w:r>
+        <w:rPr>
+          <w:sz w:val="22"/>
+        </w:rPr>
+        <w:t xml:space="preserve">. </w:t>
+      </w:r>
+      <w:r>
+        <w:rPr>
+          <w:sz w:val="22"/>
+        </w:rPr>
+        <w:t>The record contains no zero or near-zero annual maxima, and because the unregulated series is constructed rather than gaged, its small years carry the same provenance as its large ones; there is no physical basis for treating the lower tail as unrepresentative.</w:t>
       </w:r>
     </w:p>
     <w:p>
@@ -1716,7 +1762,6 @@
       </w:pPr>
       <w:r>
         <w:rPr>
-          <w:i w:val="0"/>
           <w:sz w:val="22"/>
         </w:rPr>
         <w:t>Station skews are slightly negative for every duration, from −0.158 for the peak to −0.051 for the 5-day. Weighting against the regional skew moves the peak to −0.135 and the longer durations toward zero, giving adopted skews of −0.135, −0.052, −0.007 and −0.029. Equivalent record lengths after censoring range from 100 to 111 years.</w:t>
@@ -1732,25 +1777,26 @@
       </w:pPr>
       <w:r>
         <w:rPr>
-          <w:i w:val="0"/>
+          <w:noProof/>
           <w:sz w:val="22"/>
         </w:rPr>
         <w:drawing>
-          <wp:inline xmlns:a="http://schemas.openxmlformats.org/drawingml/2006/main" xmlns:pic="http://schemas.openxmlformats.org/drawingml/2006/picture">
+          <wp:inline distT="0" distB="0" distL="0" distR="0" wp14:anchorId="2EB4C644" wp14:editId="6826E249">
             <wp:extent cx="5852160" cy="4551680"/>
+            <wp:effectExtent l="0" t="0" r="0" b="0"/>
             <wp:docPr id="1" name="Picture 1"/>
             <wp:cNvGraphicFramePr>
-              <a:graphicFrameLocks noChangeAspect="1"/>
+              <a:graphicFrameLocks xmlns:a="http://schemas.openxmlformats.org/drawingml/2006/main" noChangeAspect="1"/>
             </wp:cNvGraphicFramePr>
-            <a:graphic>
+            <a:graphic xmlns:a="http://schemas.openxmlformats.org/drawingml/2006/main">
               <a:graphicData uri="http://schemas.openxmlformats.org/drawingml/2006/picture">
-                <pic:pic>
+                <pic:pic xmlns:pic="http://schemas.openxmlformats.org/drawingml/2006/picture">
                   <pic:nvPicPr>
                     <pic:cNvPr id="0" name="CAS_Unreg_2026_frequency.png"/>
                     <pic:cNvPicPr/>
                   </pic:nvPicPr>
                   <pic:blipFill>
-                    <a:blip r:embed="rId7"/>
+                    <a:blip r:embed="rId5"/>
                     <a:stretch>
                       <a:fillRect/>
                     </a:stretch>
@@ -1760,7 +1806,9 @@
                       <a:off x="0" y="0"/>
                       <a:ext cx="5852160" cy="4551680"/>
                     </a:xfrm>
-                    <a:prstGeom prst="rect"/>
+                    <a:prstGeom prst="rect">
+                      <a:avLst/>
+                    </a:prstGeom>
                   </pic:spPr>
                 </pic:pic>
               </a:graphicData>
@@ -1794,10 +1842,16 @@
       </w:pPr>
       <w:r>
         <w:rPr>
-          <w:i w:val="0"/>
           <w:sz w:val="22"/>
         </w:rPr>
-        <w:t>Figure 10-2 places the same curves against the 2009 Hydrology Restudy. Both sets are computed curves rather than expected probability curves: the expected probability adjustment scales with record length, and the 2009 study had shorter records, so comparing adjusted curves would fold a data-quantity difference into what is meant to be a comparison of flood estimates. The 2009 study's shortest duration is 0.20 day rather than an instantaneous peak, so that pairing is approximate, though the two means agree to within 0.001 log units.</w:t>
+        <w:t xml:space="preserve">Figure 10-2 places the same curves against the 2009 Hydrology Restudy. Both sets are computed curves rather than expected probability curves: the expected probability adjustment scales with record length, and the 2009 study had shorter records, so comparing adjusted curves would fold a data-quantity difference into what is meant to be a comparison of flood estimates. The 2009 study's shortest duration is </w:t>
+      </w:r>
+      <w:r>
+        <w:rPr>
+          <w:sz w:val="22"/>
+        </w:rPr>
+        <w:lastRenderedPageBreak/>
+        <w:t>0.20 day rather than an instantaneous peak, so that pairing is approximate, though the two means agree to within 0.001 log units.</w:t>
       </w:r>
     </w:p>
     <w:p>
@@ -1809,7 +1863,6 @@
       </w:pPr>
       <w:r>
         <w:rPr>
-          <w:i w:val="0"/>
           <w:sz w:val="22"/>
         </w:rPr>
         <w:t>The two studies agree closely through the range supported by data and diverge in the tail. At the 10% chance exceedance all four durations fall within about 2% of the 2009 values, and at the median within 3%. Beyond the 2% chance event the 2026 curves fall progressively below: at the 1% chance the peak is 7.8% lower and the durations 1.8% to 3.3% lower, and at the 0.2% chance the peak is 13.7% lower. The cause is skew. The 2009 study adopted positive skews for every duration, from +0.140 to +0.193, which bend those curves upward in the tail, while the skews adopted here are near zero or negative and flatten it. The divergence is a difference in fitted tail behavior rather than in the record through the observed range.</w:t>
@@ -1825,25 +1878,26 @@
       </w:pPr>
       <w:r>
         <w:rPr>
-          <w:i w:val="0"/>
+          <w:noProof/>
           <w:sz w:val="22"/>
         </w:rPr>
         <w:drawing>
-          <wp:inline xmlns:a="http://schemas.openxmlformats.org/drawingml/2006/main" xmlns:pic="http://schemas.openxmlformats.org/drawingml/2006/picture">
+          <wp:inline distT="0" distB="0" distL="0" distR="0" wp14:anchorId="36C40494" wp14:editId="18F0777C">
             <wp:extent cx="5852160" cy="4551680"/>
+            <wp:effectExtent l="0" t="0" r="0" b="0"/>
             <wp:docPr id="2" name="Picture 2"/>
             <wp:cNvGraphicFramePr>
-              <a:graphicFrameLocks noChangeAspect="1"/>
+              <a:graphicFrameLocks xmlns:a="http://schemas.openxmlformats.org/drawingml/2006/main" noChangeAspect="1"/>
             </wp:cNvGraphicFramePr>
-            <a:graphic>
+            <a:graphic xmlns:a="http://schemas.openxmlformats.org/drawingml/2006/main">
               <a:graphicData uri="http://schemas.openxmlformats.org/drawingml/2006/picture">
-                <pic:pic>
+                <pic:pic xmlns:pic="http://schemas.openxmlformats.org/drawingml/2006/picture">
                   <pic:nvPicPr>
                     <pic:cNvPr id="0" name="CAS_Unreg_2009_vs_2026.png"/>
                     <pic:cNvPicPr/>
                   </pic:nvPicPr>
                   <pic:blipFill>
-                    <a:blip r:embed="rId8"/>
+                    <a:blip r:embed="rId6"/>
                     <a:stretch>
                       <a:fillRect/>
                     </a:stretch>
@@ -1853,7 +1907,9 @@
                       <a:off x="0" y="0"/>
                       <a:ext cx="5852160" cy="4551680"/>
                     </a:xfrm>
-                    <a:prstGeom prst="rect"/>
+                    <a:prstGeom prst="rect">
+                      <a:avLst/>
+                    </a:prstGeom>
                   </pic:spPr>
                 </pic:pic>
               </a:graphicData>
@@ -1887,7 +1943,6 @@
       </w:pPr>
       <w:r>
         <w:rPr>
-          <w:i w:val="0"/>
           <w:sz w:val="22"/>
         </w:rPr>
         <w:t>Table 10-1 gives the fitted distribution parameters and event counts reported by SSP for each adopted analysis.</w:t>
@@ -1967,8 +2022,6 @@
               </w:rPr>
               <w:t>1-Day</w:t>
             </w:r>
-            <w:proofErr w:type="spellStart"/>
-            <w:proofErr w:type="spellEnd"/>
           </w:p>
         </w:tc>
         <w:tc>
@@ -2003,8 +2056,6 @@
               </w:rPr>
               <w:t>5-Day</w:t>
             </w:r>
-            <w:proofErr w:type="spellStart"/>
-            <w:proofErr w:type="spellEnd"/>
           </w:p>
         </w:tc>
       </w:tr>
@@ -2017,7 +2068,6 @@
           <w:p>
             <w:r>
               <w:rPr>
-                <w:b w:val="0"/>
                 <w:bCs/>
                 <w:sz w:val="18"/>
                 <w:szCs w:val="19"/>
@@ -2034,7 +2084,6 @@
           <w:p>
             <w:r>
               <w:rPr>
-                <w:b w:val="0"/>
                 <w:bCs/>
                 <w:sz w:val="18"/>
                 <w:szCs w:val="19"/>
@@ -2051,15 +2100,12 @@
           <w:p>
             <w:r>
               <w:rPr>
-                <w:b w:val="0"/>
                 <w:bCs/>
                 <w:sz w:val="18"/>
                 <w:szCs w:val="19"/>
               </w:rPr>
               <w:t>4.743</w:t>
             </w:r>
-            <w:proofErr w:type="spellStart"/>
-            <w:proofErr w:type="spellEnd"/>
           </w:p>
         </w:tc>
         <w:tc>
@@ -2070,7 +2116,6 @@
           <w:p>
             <w:r>
               <w:rPr>
-                <w:b w:val="0"/>
                 <w:bCs/>
                 <w:sz w:val="18"/>
                 <w:szCs w:val="19"/>
@@ -2087,15 +2132,12 @@
           <w:p>
             <w:r>
               <w:rPr>
-                <w:b w:val="0"/>
                 <w:bCs/>
                 <w:sz w:val="18"/>
                 <w:szCs w:val="19"/>
               </w:rPr>
               <w:t>4.593</w:t>
             </w:r>
-            <w:proofErr w:type="spellStart"/>
-            <w:proofErr w:type="spellEnd"/>
           </w:p>
         </w:tc>
       </w:tr>
@@ -2108,7 +2150,6 @@
           <w:p>
             <w:r>
               <w:rPr>
-                <w:b w:val="0"/>
                 <w:bCs/>
                 <w:sz w:val="18"/>
                 <w:szCs w:val="19"/>
@@ -2125,7 +2166,6 @@
           <w:p>
             <w:r>
               <w:rPr>
-                <w:b w:val="0"/>
                 <w:bCs/>
                 <w:sz w:val="18"/>
                 <w:szCs w:val="19"/>
@@ -2142,15 +2182,12 @@
           <w:p>
             <w:r>
               <w:rPr>
-                <w:b w:val="0"/>
                 <w:bCs/>
                 <w:sz w:val="18"/>
                 <w:szCs w:val="19"/>
               </w:rPr>
               <w:t>0.203</w:t>
             </w:r>
-            <w:proofErr w:type="spellStart"/>
-            <w:proofErr w:type="spellEnd"/>
           </w:p>
         </w:tc>
         <w:tc>
@@ -2161,7 +2198,6 @@
           <w:p>
             <w:r>
               <w:rPr>
-                <w:b w:val="0"/>
                 <w:bCs/>
                 <w:sz w:val="18"/>
                 <w:szCs w:val="19"/>
@@ -2178,15 +2214,12 @@
           <w:p>
             <w:r>
               <w:rPr>
-                <w:b w:val="0"/>
                 <w:bCs/>
                 <w:sz w:val="18"/>
                 <w:szCs w:val="19"/>
               </w:rPr>
               <w:t>0.179</w:t>
             </w:r>
-            <w:proofErr w:type="spellStart"/>
-            <w:proofErr w:type="spellEnd"/>
           </w:p>
         </w:tc>
       </w:tr>
@@ -2199,7 +2232,6 @@
           <w:p>
             <w:r>
               <w:rPr>
-                <w:b w:val="0"/>
                 <w:bCs/>
                 <w:sz w:val="18"/>
                 <w:szCs w:val="19"/>
@@ -2216,7 +2248,6 @@
           <w:p>
             <w:r>
               <w:rPr>
-                <w:b w:val="0"/>
                 <w:bCs/>
                 <w:sz w:val="18"/>
                 <w:szCs w:val="19"/>
@@ -2233,15 +2264,12 @@
           <w:p>
             <w:r>
               <w:rPr>
-                <w:b w:val="0"/>
                 <w:bCs/>
                 <w:sz w:val="18"/>
                 <w:szCs w:val="19"/>
               </w:rPr>
               <w:t>-0.152</w:t>
             </w:r>
-            <w:proofErr w:type="spellStart"/>
-            <w:proofErr w:type="spellEnd"/>
           </w:p>
         </w:tc>
         <w:tc>
@@ -2252,7 +2280,6 @@
           <w:p>
             <w:r>
               <w:rPr>
-                <w:b w:val="0"/>
                 <w:bCs/>
                 <w:sz w:val="18"/>
                 <w:szCs w:val="19"/>
@@ -2269,15 +2296,12 @@
           <w:p>
             <w:r>
               <w:rPr>
-                <w:b w:val="0"/>
                 <w:bCs/>
                 <w:sz w:val="18"/>
                 <w:szCs w:val="19"/>
               </w:rPr>
               <w:t>-0.051</w:t>
             </w:r>
-            <w:proofErr w:type="spellStart"/>
-            <w:proofErr w:type="spellEnd"/>
           </w:p>
         </w:tc>
       </w:tr>
@@ -2290,7 +2314,6 @@
           <w:p>
             <w:r>
               <w:rPr>
-                <w:b w:val="0"/>
                 <w:bCs/>
                 <w:sz w:val="18"/>
                 <w:szCs w:val="19"/>
@@ -2307,7 +2330,6 @@
           <w:p>
             <w:r>
               <w:rPr>
-                <w:b w:val="0"/>
                 <w:bCs/>
                 <w:sz w:val="18"/>
                 <w:szCs w:val="19"/>
@@ -2324,15 +2346,12 @@
           <w:p>
             <w:r>
               <w:rPr>
-                <w:b w:val="0"/>
                 <w:bCs/>
                 <w:sz w:val="18"/>
                 <w:szCs w:val="19"/>
               </w:rPr>
               <w:t>0.09</w:t>
             </w:r>
-            <w:proofErr w:type="spellStart"/>
-            <w:proofErr w:type="spellEnd"/>
           </w:p>
         </w:tc>
         <w:tc>
@@ -2343,7 +2362,6 @@
           <w:p>
             <w:r>
               <w:rPr>
-                <w:b w:val="0"/>
                 <w:bCs/>
                 <w:sz w:val="18"/>
                 <w:szCs w:val="19"/>
@@ -2360,15 +2378,12 @@
           <w:p>
             <w:r>
               <w:rPr>
-                <w:b w:val="0"/>
                 <w:bCs/>
                 <w:sz w:val="18"/>
                 <w:szCs w:val="19"/>
               </w:rPr>
               <w:t>0.0</w:t>
             </w:r>
-            <w:proofErr w:type="spellStart"/>
-            <w:proofErr w:type="spellEnd"/>
           </w:p>
         </w:tc>
       </w:tr>
@@ -2381,7 +2396,6 @@
           <w:p>
             <w:r>
               <w:rPr>
-                <w:b w:val="0"/>
                 <w:bCs/>
                 <w:sz w:val="18"/>
                 <w:szCs w:val="19"/>
@@ -2398,7 +2412,6 @@
           <w:p>
             <w:r>
               <w:rPr>
-                <w:b w:val="0"/>
                 <w:bCs/>
                 <w:sz w:val="18"/>
                 <w:szCs w:val="19"/>
@@ -2415,15 +2428,12 @@
           <w:p>
             <w:r>
               <w:rPr>
-                <w:b w:val="0"/>
                 <w:bCs/>
                 <w:sz w:val="18"/>
                 <w:szCs w:val="19"/>
               </w:rPr>
               <w:t>-0.052</w:t>
             </w:r>
-            <w:proofErr w:type="spellStart"/>
-            <w:proofErr w:type="spellEnd"/>
           </w:p>
         </w:tc>
         <w:tc>
@@ -2434,7 +2444,6 @@
           <w:p>
             <w:r>
               <w:rPr>
-                <w:b w:val="0"/>
                 <w:bCs/>
                 <w:sz w:val="18"/>
                 <w:szCs w:val="19"/>
@@ -2451,15 +2460,12 @@
           <w:p>
             <w:r>
               <w:rPr>
-                <w:b w:val="0"/>
                 <w:bCs/>
                 <w:sz w:val="18"/>
                 <w:szCs w:val="19"/>
               </w:rPr>
               <w:t>-0.029</w:t>
             </w:r>
-            <w:proofErr w:type="spellStart"/>
-            <w:proofErr w:type="spellEnd"/>
           </w:p>
         </w:tc>
       </w:tr>
@@ -2472,7 +2478,6 @@
           <w:p>
             <w:r>
               <w:rPr>
-                <w:b w:val="0"/>
                 <w:bCs/>
                 <w:sz w:val="18"/>
                 <w:szCs w:val="19"/>
@@ -2489,7 +2494,6 @@
           <w:p>
             <w:r>
               <w:rPr>
-                <w:b w:val="0"/>
                 <w:bCs/>
                 <w:sz w:val="18"/>
                 <w:szCs w:val="19"/>
@@ -2506,15 +2510,12 @@
           <w:p>
             <w:r>
               <w:rPr>
-                <w:b w:val="0"/>
                 <w:bCs/>
                 <w:sz w:val="18"/>
                 <w:szCs w:val="19"/>
               </w:rPr>
               <w:t>-0.052</w:t>
             </w:r>
-            <w:proofErr w:type="spellStart"/>
-            <w:proofErr w:type="spellEnd"/>
           </w:p>
         </w:tc>
         <w:tc>
@@ -2525,7 +2526,6 @@
           <w:p>
             <w:r>
               <w:rPr>
-                <w:b w:val="0"/>
                 <w:bCs/>
                 <w:sz w:val="18"/>
                 <w:szCs w:val="19"/>
@@ -2542,15 +2542,12 @@
           <w:p>
             <w:r>
               <w:rPr>
-                <w:b w:val="0"/>
                 <w:bCs/>
                 <w:sz w:val="18"/>
                 <w:szCs w:val="19"/>
               </w:rPr>
               <w:t>-0.029</w:t>
             </w:r>
-            <w:proofErr w:type="spellStart"/>
-            <w:proofErr w:type="spellEnd"/>
           </w:p>
         </w:tc>
       </w:tr>
@@ -2563,7 +2560,6 @@
           <w:p>
             <w:r>
               <w:rPr>
-                <w:b w:val="0"/>
                 <w:bCs/>
                 <w:sz w:val="18"/>
                 <w:szCs w:val="19"/>
@@ -2580,7 +2576,6 @@
           <w:p>
             <w:r>
               <w:rPr>
-                <w:b w:val="0"/>
                 <w:bCs/>
                 <w:sz w:val="18"/>
                 <w:szCs w:val="19"/>
@@ -2597,15 +2592,12 @@
           <w:p>
             <w:r>
               <w:rPr>
-                <w:b w:val="0"/>
                 <w:bCs/>
                 <w:sz w:val="18"/>
                 <w:szCs w:val="19"/>
               </w:rPr>
               <w:t>0.064</w:t>
             </w:r>
-            <w:proofErr w:type="spellStart"/>
-            <w:proofErr w:type="spellEnd"/>
           </w:p>
         </w:tc>
         <w:tc>
@@ -2616,7 +2608,6 @@
           <w:p>
             <w:r>
               <w:rPr>
-                <w:b w:val="0"/>
                 <w:bCs/>
                 <w:sz w:val="18"/>
                 <w:szCs w:val="19"/>
@@ -2633,15 +2624,12 @@
           <w:p>
             <w:r>
               <w:rPr>
-                <w:b w:val="0"/>
                 <w:bCs/>
                 <w:sz w:val="18"/>
                 <w:szCs w:val="19"/>
               </w:rPr>
               <w:t>0.06</w:t>
             </w:r>
-            <w:proofErr w:type="spellStart"/>
-            <w:proofErr w:type="spellEnd"/>
           </w:p>
         </w:tc>
       </w:tr>
@@ -2654,7 +2642,6 @@
           <w:p>
             <w:r>
               <w:rPr>
-                <w:b w:val="0"/>
                 <w:bCs/>
                 <w:sz w:val="18"/>
                 <w:szCs w:val="19"/>
@@ -2671,7 +2658,6 @@
           <w:p>
             <w:r>
               <w:rPr>
-                <w:b w:val="0"/>
                 <w:bCs/>
                 <w:sz w:val="18"/>
                 <w:szCs w:val="19"/>
@@ -2688,15 +2674,12 @@
           <w:p>
             <w:r>
               <w:rPr>
-                <w:b w:val="0"/>
                 <w:bCs/>
                 <w:sz w:val="18"/>
                 <w:szCs w:val="19"/>
               </w:rPr>
               <w:t>0.0</w:t>
             </w:r>
-            <w:proofErr w:type="spellStart"/>
-            <w:proofErr w:type="spellEnd"/>
           </w:p>
         </w:tc>
         <w:tc>
@@ -2707,7 +2690,6 @@
           <w:p>
             <w:r>
               <w:rPr>
-                <w:b w:val="0"/>
                 <w:bCs/>
                 <w:sz w:val="18"/>
                 <w:szCs w:val="19"/>
@@ -2724,15 +2706,12 @@
           <w:p>
             <w:r>
               <w:rPr>
-                <w:b w:val="0"/>
                 <w:bCs/>
                 <w:sz w:val="18"/>
                 <w:szCs w:val="19"/>
               </w:rPr>
               <w:t>0.0</w:t>
             </w:r>
-            <w:proofErr w:type="spellStart"/>
-            <w:proofErr w:type="spellEnd"/>
           </w:p>
         </w:tc>
       </w:tr>
@@ -2745,7 +2724,6 @@
           <w:p>
             <w:r>
               <w:rPr>
-                <w:b w:val="0"/>
                 <w:bCs/>
                 <w:sz w:val="18"/>
                 <w:szCs w:val="19"/>
@@ -2762,7 +2740,6 @@
           <w:p>
             <w:r>
               <w:rPr>
-                <w:b w:val="0"/>
                 <w:bCs/>
                 <w:sz w:val="18"/>
                 <w:szCs w:val="19"/>
@@ -2779,15 +2756,12 @@
           <w:p>
             <w:r>
               <w:rPr>
-                <w:b w:val="0"/>
                 <w:bCs/>
                 <w:sz w:val="18"/>
                 <w:szCs w:val="19"/>
               </w:rPr>
               <w:t>100.369</w:t>
             </w:r>
-            <w:proofErr w:type="spellStart"/>
-            <w:proofErr w:type="spellEnd"/>
           </w:p>
         </w:tc>
         <w:tc>
@@ -2798,7 +2772,6 @@
           <w:p>
             <w:r>
               <w:rPr>
-                <w:b w:val="0"/>
                 <w:bCs/>
                 <w:sz w:val="18"/>
                 <w:szCs w:val="19"/>
@@ -2815,15 +2788,12 @@
           <w:p>
             <w:r>
               <w:rPr>
-                <w:b w:val="0"/>
                 <w:bCs/>
                 <w:sz w:val="18"/>
                 <w:szCs w:val="19"/>
               </w:rPr>
               <w:t>110.932</w:t>
             </w:r>
-            <w:proofErr w:type="spellStart"/>
-            <w:proofErr w:type="spellEnd"/>
           </w:p>
         </w:tc>
       </w:tr>
@@ -2836,11 +2806,11 @@
           <w:p>
             <w:r>
               <w:rPr>
-                <w:b w:val="0"/>
                 <w:bCs/>
                 <w:sz w:val="18"/>
                 <w:szCs w:val="19"/>
               </w:rPr>
+              <w:lastRenderedPageBreak/>
               <w:t>Systematic Events</w:t>
             </w:r>
           </w:p>
@@ -2853,7 +2823,6 @@
           <w:p>
             <w:r>
               <w:rPr>
-                <w:b w:val="0"/>
                 <w:bCs/>
                 <w:sz w:val="18"/>
                 <w:szCs w:val="19"/>
@@ -2870,15 +2839,12 @@
           <w:p>
             <w:r>
               <w:rPr>
-                <w:b w:val="0"/>
                 <w:bCs/>
                 <w:sz w:val="18"/>
                 <w:szCs w:val="19"/>
               </w:rPr>
               <w:t>94.0</w:t>
             </w:r>
-            <w:proofErr w:type="spellStart"/>
-            <w:proofErr w:type="spellEnd"/>
           </w:p>
         </w:tc>
         <w:tc>
@@ -2889,7 +2855,6 @@
           <w:p>
             <w:r>
               <w:rPr>
-                <w:b w:val="0"/>
                 <w:bCs/>
                 <w:sz w:val="18"/>
                 <w:szCs w:val="19"/>
@@ -2906,15 +2871,12 @@
           <w:p>
             <w:r>
               <w:rPr>
-                <w:b w:val="0"/>
                 <w:bCs/>
                 <w:sz w:val="18"/>
                 <w:szCs w:val="19"/>
               </w:rPr>
               <w:t>93.0</w:t>
             </w:r>
-            <w:proofErr w:type="spellStart"/>
-            <w:proofErr w:type="spellEnd"/>
           </w:p>
         </w:tc>
       </w:tr>
@@ -2927,7 +2889,6 @@
           <w:p>
             <w:r>
               <w:rPr>
-                <w:b w:val="0"/>
                 <w:bCs/>
                 <w:sz w:val="18"/>
                 <w:szCs w:val="19"/>
@@ -2944,7 +2905,6 @@
           <w:p>
             <w:r>
               <w:rPr>
-                <w:b w:val="0"/>
                 <w:bCs/>
                 <w:sz w:val="18"/>
                 <w:szCs w:val="19"/>
@@ -2961,15 +2921,12 @@
           <w:p>
             <w:r>
               <w:rPr>
-                <w:b w:val="0"/>
                 <w:bCs/>
                 <w:sz w:val="18"/>
                 <w:szCs w:val="19"/>
               </w:rPr>
               <w:t>0.0</w:t>
             </w:r>
-            <w:proofErr w:type="spellStart"/>
-            <w:proofErr w:type="spellEnd"/>
           </w:p>
         </w:tc>
         <w:tc>
@@ -2980,7 +2937,6 @@
           <w:p>
             <w:r>
               <w:rPr>
-                <w:b w:val="0"/>
                 <w:bCs/>
                 <w:sz w:val="18"/>
                 <w:szCs w:val="19"/>
@@ -2997,15 +2953,12 @@
           <w:p>
             <w:r>
               <w:rPr>
-                <w:b w:val="0"/>
                 <w:bCs/>
                 <w:sz w:val="18"/>
                 <w:szCs w:val="19"/>
               </w:rPr>
               <w:t>0.0</w:t>
             </w:r>
-            <w:proofErr w:type="spellStart"/>
-            <w:proofErr w:type="spellEnd"/>
           </w:p>
         </w:tc>
       </w:tr>
@@ -3018,7 +2971,6 @@
           <w:p>
             <w:r>
               <w:rPr>
-                <w:b w:val="0"/>
                 <w:bCs/>
                 <w:sz w:val="18"/>
                 <w:szCs w:val="19"/>
@@ -3035,7 +2987,6 @@
           <w:p>
             <w:r>
               <w:rPr>
-                <w:b w:val="0"/>
                 <w:bCs/>
                 <w:sz w:val="18"/>
                 <w:szCs w:val="19"/>
@@ -3052,15 +3003,12 @@
           <w:p>
             <w:r>
               <w:rPr>
-                <w:b w:val="0"/>
                 <w:bCs/>
                 <w:sz w:val="18"/>
                 <w:szCs w:val="19"/>
               </w:rPr>
               <w:t>0.0</w:t>
             </w:r>
-            <w:proofErr w:type="spellStart"/>
-            <w:proofErr w:type="spellEnd"/>
           </w:p>
         </w:tc>
         <w:tc>
@@ -3071,7 +3019,6 @@
           <w:p>
             <w:r>
               <w:rPr>
-                <w:b w:val="0"/>
                 <w:bCs/>
                 <w:sz w:val="18"/>
                 <w:szCs w:val="19"/>
@@ -3088,15 +3035,12 @@
           <w:p>
             <w:r>
               <w:rPr>
-                <w:b w:val="0"/>
                 <w:bCs/>
                 <w:sz w:val="18"/>
                 <w:szCs w:val="19"/>
               </w:rPr>
               <w:t>0.0</w:t>
             </w:r>
-            <w:proofErr w:type="spellStart"/>
-            <w:proofErr w:type="spellEnd"/>
           </w:p>
         </w:tc>
       </w:tr>
@@ -3109,7 +3053,6 @@
           <w:p>
             <w:r>
               <w:rPr>
-                <w:b w:val="0"/>
                 <w:bCs/>
                 <w:sz w:val="18"/>
                 <w:szCs w:val="19"/>
@@ -3126,7 +3069,6 @@
           <w:p>
             <w:r>
               <w:rPr>
-                <w:b w:val="0"/>
                 <w:bCs/>
                 <w:sz w:val="18"/>
                 <w:szCs w:val="19"/>
@@ -3143,15 +3085,12 @@
           <w:p>
             <w:r>
               <w:rPr>
-                <w:b w:val="0"/>
                 <w:bCs/>
                 <w:sz w:val="18"/>
                 <w:szCs w:val="19"/>
               </w:rPr>
               <w:t>0.0</w:t>
             </w:r>
-            <w:proofErr w:type="spellStart"/>
-            <w:proofErr w:type="spellEnd"/>
           </w:p>
         </w:tc>
         <w:tc>
@@ -3162,7 +3101,6 @@
           <w:p>
             <w:r>
               <w:rPr>
-                <w:b w:val="0"/>
                 <w:bCs/>
                 <w:sz w:val="18"/>
                 <w:szCs w:val="19"/>
@@ -3179,15 +3117,12 @@
           <w:p>
             <w:r>
               <w:rPr>
-                <w:b w:val="0"/>
                 <w:bCs/>
                 <w:sz w:val="18"/>
                 <w:szCs w:val="19"/>
               </w:rPr>
               <w:t>0.0</w:t>
             </w:r>
-            <w:proofErr w:type="spellStart"/>
-            <w:proofErr w:type="spellEnd"/>
           </w:p>
         </w:tc>
       </w:tr>
@@ -3200,7 +3135,6 @@
           <w:p>
             <w:r>
               <w:rPr>
-                <w:b w:val="0"/>
                 <w:bCs/>
                 <w:sz w:val="18"/>
                 <w:szCs w:val="19"/>
@@ -3217,7 +3151,6 @@
           <w:p>
             <w:r>
               <w:rPr>
-                <w:b w:val="0"/>
                 <w:bCs/>
                 <w:sz w:val="18"/>
                 <w:szCs w:val="19"/>
@@ -3234,15 +3167,12 @@
           <w:p>
             <w:r>
               <w:rPr>
-                <w:b w:val="0"/>
                 <w:bCs/>
                 <w:sz w:val="18"/>
                 <w:szCs w:val="19"/>
               </w:rPr>
               <w:t>0.0</w:t>
             </w:r>
-            <w:proofErr w:type="spellStart"/>
-            <w:proofErr w:type="spellEnd"/>
           </w:p>
         </w:tc>
         <w:tc>
@@ -3253,7 +3183,6 @@
           <w:p>
             <w:r>
               <w:rPr>
-                <w:b w:val="0"/>
                 <w:bCs/>
                 <w:sz w:val="18"/>
                 <w:szCs w:val="19"/>
@@ -3270,15 +3199,12 @@
           <w:p>
             <w:r>
               <w:rPr>
-                <w:b w:val="0"/>
                 <w:bCs/>
                 <w:sz w:val="18"/>
                 <w:szCs w:val="19"/>
               </w:rPr>
               <w:t>0.0</w:t>
             </w:r>
-            <w:proofErr w:type="spellStart"/>
-            <w:proofErr w:type="spellEnd"/>
           </w:p>
         </w:tc>
       </w:tr>
@@ -3291,7 +3217,6 @@
           <w:p>
             <w:r>
               <w:rPr>
-                <w:b w:val="0"/>
                 <w:bCs/>
                 <w:sz w:val="18"/>
                 <w:szCs w:val="19"/>
@@ -3308,7 +3233,6 @@
           <w:p>
             <w:r>
               <w:rPr>
-                <w:b w:val="0"/>
                 <w:bCs/>
                 <w:sz w:val="18"/>
                 <w:szCs w:val="19"/>
@@ -3325,15 +3249,12 @@
           <w:p>
             <w:r>
               <w:rPr>
-                <w:b w:val="0"/>
                 <w:bCs/>
                 <w:sz w:val="18"/>
                 <w:szCs w:val="19"/>
               </w:rPr>
               <w:t>5.0</w:t>
             </w:r>
-            <w:proofErr w:type="spellStart"/>
-            <w:proofErr w:type="spellEnd"/>
           </w:p>
         </w:tc>
         <w:tc>
@@ -3344,7 +3265,6 @@
           <w:p>
             <w:r>
               <w:rPr>
-                <w:b w:val="0"/>
                 <w:bCs/>
                 <w:sz w:val="18"/>
                 <w:szCs w:val="19"/>
@@ -3361,15 +3281,12 @@
           <w:p>
             <w:r>
               <w:rPr>
-                <w:b w:val="0"/>
                 <w:bCs/>
                 <w:sz w:val="18"/>
                 <w:szCs w:val="19"/>
               </w:rPr>
               <w:t>5.0</w:t>
             </w:r>
-            <w:proofErr w:type="spellStart"/>
-            <w:proofErr w:type="spellEnd"/>
           </w:p>
         </w:tc>
       </w:tr>
@@ -3382,7 +3299,6 @@
           <w:p>
             <w:r>
               <w:rPr>
-                <w:b w:val="0"/>
                 <w:bCs/>
                 <w:sz w:val="18"/>
                 <w:szCs w:val="19"/>
@@ -3399,7 +3315,6 @@
           <w:p>
             <w:r>
               <w:rPr>
-                <w:b w:val="0"/>
                 <w:bCs/>
                 <w:sz w:val="18"/>
                 <w:szCs w:val="19"/>
@@ -3416,15 +3331,12 @@
           <w:p>
             <w:r>
               <w:rPr>
-                <w:b w:val="0"/>
                 <w:bCs/>
                 <w:sz w:val="18"/>
                 <w:szCs w:val="19"/>
               </w:rPr>
               <w:t>99.0</w:t>
             </w:r>
-            <w:proofErr w:type="spellStart"/>
-            <w:proofErr w:type="spellEnd"/>
           </w:p>
         </w:tc>
         <w:tc>
@@ -3435,7 +3347,6 @@
           <w:p>
             <w:r>
               <w:rPr>
-                <w:b w:val="0"/>
                 <w:bCs/>
                 <w:sz w:val="18"/>
                 <w:szCs w:val="19"/>
@@ -3452,15 +3363,12 @@
           <w:p>
             <w:r>
               <w:rPr>
-                <w:b w:val="0"/>
                 <w:bCs/>
                 <w:sz w:val="18"/>
                 <w:szCs w:val="19"/>
               </w:rPr>
               <w:t>98.0</w:t>
             </w:r>
-            <w:proofErr w:type="spellStart"/>
-            <w:proofErr w:type="spellEnd"/>
           </w:p>
         </w:tc>
       </w:tr>
@@ -29637,10 +29545,6 @@
         </w:rPr>
       </w:pPr>
       <w:r>
-        <w:rPr>
-          <w:i w:val="0"/>
-          <w:sz w:val="20"/>
-        </w:rPr>
         <w:t>Computed curve, expected probability curve, EMA variance of the log and 5%/95% confidence limits for every ordinate reported by SSP, all four durations. UpperConf is SSP's 0.05 limit and LowerConf its 0.95 limit.</w:t>
       </w:r>
     </w:p>
@@ -32178,6 +32082,7 @@
                 <w:sz w:val="22"/>
                 <w:szCs w:val="22"/>
               </w:rPr>
+              <w:lastRenderedPageBreak/>
               <w:t>Peak</w:t>
             </w:r>
           </w:p>
@@ -33282,7 +33187,6 @@
                 <w:sz w:val="22"/>
                 <w:szCs w:val="22"/>
               </w:rPr>
-              <w:lastRenderedPageBreak/>
               <w:t>Peak</w:t>
             </w:r>
           </w:p>
@@ -43219,6 +43123,7 @@
                 <w:sz w:val="22"/>
                 <w:szCs w:val="22"/>
               </w:rPr>
+              <w:lastRenderedPageBreak/>
               <w:t>5-Day</w:t>
             </w:r>
           </w:p>
@@ -44323,7 +44228,6 @@
                 <w:sz w:val="22"/>
                 <w:szCs w:val="22"/>
               </w:rPr>
-              <w:lastRenderedPageBreak/>
               <w:t>5-Day</w:t>
             </w:r>
           </w:p>
@@ -47625,10 +47529,6 @@
         </w:rPr>
       </w:pPr>
       <w:r>
-        <w:rPr>
-          <w:i w:val="0"/>
-          <w:sz w:val="20"/>
-        </w:rPr>
         <w:t>Individual frequency curves as produced by HEC-SSP: computed curve, expected probability curve, 5% and 95% confidence limits, and observed events at Hirsch-Stedinger plotting positions. The peak figure reflects the censored analysis described in Section 10.</w:t>
       </w:r>
     </w:p>
@@ -47642,25 +47542,27 @@
       </w:pPr>
       <w:r>
         <w:rPr>
-          <w:i w:val="0"/>
+          <w:noProof/>
           <w:sz w:val="22"/>
         </w:rPr>
+        <w:lastRenderedPageBreak/>
         <w:drawing>
-          <wp:inline xmlns:a="http://schemas.openxmlformats.org/drawingml/2006/main" xmlns:pic="http://schemas.openxmlformats.org/drawingml/2006/picture">
+          <wp:inline distT="0" distB="0" distL="0" distR="0" wp14:anchorId="5C24A218" wp14:editId="046B4897">
             <wp:extent cx="5852160" cy="4551680"/>
+            <wp:effectExtent l="0" t="0" r="0" b="0"/>
             <wp:docPr id="3" name="Picture 3"/>
             <wp:cNvGraphicFramePr>
-              <a:graphicFrameLocks noChangeAspect="1"/>
+              <a:graphicFrameLocks xmlns:a="http://schemas.openxmlformats.org/drawingml/2006/main" noChangeAspect="1"/>
             </wp:cNvGraphicFramePr>
-            <a:graphic>
+            <a:graphic xmlns:a="http://schemas.openxmlformats.org/drawingml/2006/main">
               <a:graphicData uri="http://schemas.openxmlformats.org/drawingml/2006/picture">
-                <pic:pic>
+                <pic:pic xmlns:pic="http://schemas.openxmlformats.org/drawingml/2006/picture">
                   <pic:nvPicPr>
                     <pic:cNvPr id="0" name="CAS_Unreg_freq_Peak.png"/>
                     <pic:cNvPicPr/>
                   </pic:nvPicPr>
                   <pic:blipFill>
-                    <a:blip r:embed="rId9"/>
+                    <a:blip r:embed="rId7"/>
                     <a:stretch>
                       <a:fillRect/>
                     </a:stretch>
@@ -47670,7 +47572,9 @@
                       <a:off x="0" y="0"/>
                       <a:ext cx="5852160" cy="4551680"/>
                     </a:xfrm>
-                    <a:prstGeom prst="rect"/>
+                    <a:prstGeom prst="rect">
+                      <a:avLst/>
+                    </a:prstGeom>
                   </pic:spPr>
                 </pic:pic>
               </a:graphicData>
@@ -47705,25 +47609,27 @@
       </w:pPr>
       <w:r>
         <w:rPr>
-          <w:i w:val="0"/>
+          <w:noProof/>
           <w:sz w:val="22"/>
         </w:rPr>
+        <w:lastRenderedPageBreak/>
         <w:drawing>
-          <wp:inline xmlns:a="http://schemas.openxmlformats.org/drawingml/2006/main" xmlns:pic="http://schemas.openxmlformats.org/drawingml/2006/picture">
+          <wp:inline distT="0" distB="0" distL="0" distR="0" wp14:anchorId="22CC827A" wp14:editId="1AB64FF3">
             <wp:extent cx="5852160" cy="4551680"/>
+            <wp:effectExtent l="0" t="0" r="0" b="0"/>
             <wp:docPr id="4" name="Picture 4"/>
             <wp:cNvGraphicFramePr>
-              <a:graphicFrameLocks noChangeAspect="1"/>
+              <a:graphicFrameLocks xmlns:a="http://schemas.openxmlformats.org/drawingml/2006/main" noChangeAspect="1"/>
             </wp:cNvGraphicFramePr>
-            <a:graphic>
+            <a:graphic xmlns:a="http://schemas.openxmlformats.org/drawingml/2006/main">
               <a:graphicData uri="http://schemas.openxmlformats.org/drawingml/2006/picture">
-                <pic:pic>
+                <pic:pic xmlns:pic="http://schemas.openxmlformats.org/drawingml/2006/picture">
                   <pic:nvPicPr>
                     <pic:cNvPr id="0" name="CAS_Unreg_freq_1-Day.png"/>
                     <pic:cNvPicPr/>
                   </pic:nvPicPr>
                   <pic:blipFill>
-                    <a:blip r:embed="rId10"/>
+                    <a:blip r:embed="rId8"/>
                     <a:stretch>
                       <a:fillRect/>
                     </a:stretch>
@@ -47733,7 +47639,9 @@
                       <a:off x="0" y="0"/>
                       <a:ext cx="5852160" cy="4551680"/>
                     </a:xfrm>
-                    <a:prstGeom prst="rect"/>
+                    <a:prstGeom prst="rect">
+                      <a:avLst/>
+                    </a:prstGeom>
                   </pic:spPr>
                 </pic:pic>
               </a:graphicData>
@@ -47768,25 +47676,27 @@
       </w:pPr>
       <w:r>
         <w:rPr>
-          <w:i w:val="0"/>
+          <w:noProof/>
           <w:sz w:val="22"/>
         </w:rPr>
+        <w:lastRenderedPageBreak/>
         <w:drawing>
-          <wp:inline xmlns:a="http://schemas.openxmlformats.org/drawingml/2006/main" xmlns:pic="http://schemas.openxmlformats.org/drawingml/2006/picture">
+          <wp:inline distT="0" distB="0" distL="0" distR="0" wp14:anchorId="5F25D7A5" wp14:editId="49CEC1E3">
             <wp:extent cx="5852160" cy="4551680"/>
+            <wp:effectExtent l="0" t="0" r="0" b="0"/>
             <wp:docPr id="5" name="Picture 5"/>
             <wp:cNvGraphicFramePr>
-              <a:graphicFrameLocks noChangeAspect="1"/>
+              <a:graphicFrameLocks xmlns:a="http://schemas.openxmlformats.org/drawingml/2006/main" noChangeAspect="1"/>
             </wp:cNvGraphicFramePr>
-            <a:graphic>
+            <a:graphic xmlns:a="http://schemas.openxmlformats.org/drawingml/2006/main">
               <a:graphicData uri="http://schemas.openxmlformats.org/drawingml/2006/picture">
-                <pic:pic>
+                <pic:pic xmlns:pic="http://schemas.openxmlformats.org/drawingml/2006/picture">
                   <pic:nvPicPr>
                     <pic:cNvPr id="0" name="CAS_Unreg_freq_3-Day.png"/>
                     <pic:cNvPicPr/>
                   </pic:nvPicPr>
                   <pic:blipFill>
-                    <a:blip r:embed="rId11"/>
+                    <a:blip r:embed="rId9"/>
                     <a:stretch>
                       <a:fillRect/>
                     </a:stretch>
@@ -47796,7 +47706,9 @@
                       <a:off x="0" y="0"/>
                       <a:ext cx="5852160" cy="4551680"/>
                     </a:xfrm>
-                    <a:prstGeom prst="rect"/>
+                    <a:prstGeom prst="rect">
+                      <a:avLst/>
+                    </a:prstGeom>
                   </pic:spPr>
                 </pic:pic>
               </a:graphicData>
@@ -47831,25 +47743,27 @@
       </w:pPr>
       <w:r>
         <w:rPr>
-          <w:i w:val="0"/>
+          <w:noProof/>
           <w:sz w:val="22"/>
         </w:rPr>
+        <w:lastRenderedPageBreak/>
         <w:drawing>
-          <wp:inline xmlns:a="http://schemas.openxmlformats.org/drawingml/2006/main" xmlns:pic="http://schemas.openxmlformats.org/drawingml/2006/picture">
+          <wp:inline distT="0" distB="0" distL="0" distR="0" wp14:anchorId="1BF0FF5A" wp14:editId="0780EA07">
             <wp:extent cx="5852160" cy="4551680"/>
+            <wp:effectExtent l="0" t="0" r="0" b="0"/>
             <wp:docPr id="6" name="Picture 6"/>
             <wp:cNvGraphicFramePr>
-              <a:graphicFrameLocks noChangeAspect="1"/>
+              <a:graphicFrameLocks xmlns:a="http://schemas.openxmlformats.org/drawingml/2006/main" noChangeAspect="1"/>
             </wp:cNvGraphicFramePr>
-            <a:graphic>
+            <a:graphic xmlns:a="http://schemas.openxmlformats.org/drawingml/2006/main">
               <a:graphicData uri="http://schemas.openxmlformats.org/drawingml/2006/picture">
-                <pic:pic>
+                <pic:pic xmlns:pic="http://schemas.openxmlformats.org/drawingml/2006/picture">
                   <pic:nvPicPr>
                     <pic:cNvPr id="0" name="CAS_Unreg_freq_5-Day.png"/>
                     <pic:cNvPicPr/>
                   </pic:nvPicPr>
                   <pic:blipFill>
-                    <a:blip r:embed="rId12"/>
+                    <a:blip r:embed="rId10"/>
                     <a:stretch>
                       <a:fillRect/>
                     </a:stretch>
@@ -47859,7 +47773,9 @@
                       <a:off x="0" y="0"/>
                       <a:ext cx="5852160" cy="4551680"/>
                     </a:xfrm>
-                    <a:prstGeom prst="rect"/>
+                    <a:prstGeom prst="rect">
+                      <a:avLst/>
+                    </a:prstGeom>
                   </pic:spPr>
                 </pic:pic>
               </a:graphicData>

</xml_diff>